<commit_message>
chore(deps): update Angular and related dependencies to version 21.2.0 and update devDependencies
</commit_message>
<xml_diff>
--- a/Barta_rocnikova_prace.docx
+++ b/Barta_rocnikova_prace.docx
@@ -301,6 +301,7 @@
     </w:p>
     <w:p>
       <w:pPr>
+        <w:ind w:left="1416" w:firstLine="708"/>
         <w:jc w:val="center"/>
         <w:rPr>
           <w:b/>
@@ -3747,21 +3748,13 @@
       <w:ptab w:relativeTo="margin" w:alignment="right" w:leader="none"/>
     </w:r>
     <w:r>
-      <w:t>3.</w:t>
-    </w:r>
-    <w:proofErr w:type="gramStart"/>
-    <w:r>
-      <w:t>E</w:t>
+      <w:t>3.E</w:t>
     </w:r>
     <w:r>
       <w:t xml:space="preserve"> – </w:t>
     </w:r>
     <w:r>
-      <w:t>2025</w:t>
-    </w:r>
-    <w:proofErr w:type="gramEnd"/>
-    <w:r>
-      <w:t>/2026</w:t>
+      <w:t>2025/2026</w:t>
     </w:r>
   </w:p>
 </w:hdr>
@@ -7236,30 +7229,6 @@
 </file>
 
 <file path=customXml/item1.xml><?xml version="1.0" encoding="utf-8"?>
-<?mso-contentType ?>
-<FormTemplates xmlns="http://schemas.microsoft.com/sharepoint/v3/contenttype/forms">
-  <Display>DocumentLibraryForm</Display>
-  <Edit>DocumentLibraryForm</Edit>
-  <New>DocumentLibraryForm</New>
-</FormTemplates>
-</file>
-
-<file path=customXml/item2.xml><?xml version="1.0" encoding="utf-8"?>
-<p:properties xmlns:p="http://schemas.microsoft.com/office/2006/metadata/properties" xmlns:xsi="http://www.w3.org/2001/XMLSchema-instance" xmlns:pc="http://schemas.microsoft.com/office/infopath/2007/PartnerControls">
-  <documentManagement>
-    <TaxCatchAll xmlns="9069f8e3-06b5-4841-af59-bd496f6fbcdc" xsi:nil="true"/>
-    <lcf76f155ced4ddcb4097134ff3c332f xmlns="ac4d9f64-92e6-40df-bbe5-cbf691cfe8ae">
-      <Terms xmlns="http://schemas.microsoft.com/office/infopath/2007/PartnerControls"/>
-    </lcf76f155ced4ddcb4097134ff3c332f>
-  </documentManagement>
-</p:properties>
-</file>
-
-<file path=customXml/item3.xml><?xml version="1.0" encoding="utf-8"?>
-<b:Sources xmlns:b="http://schemas.openxmlformats.org/officeDocument/2006/bibliography" xmlns="http://schemas.openxmlformats.org/officeDocument/2006/bibliography" SelectedStyle="\APASixthEditionOfficeOnline.xsl" StyleName="APA" Version="6"/>
-</file>
-
-<file path=customXml/item4.xml><?xml version="1.0" encoding="utf-8"?>
 <ct:contentTypeSchema xmlns:ct="http://schemas.microsoft.com/office/2006/metadata/contentType" xmlns:ma="http://schemas.microsoft.com/office/2006/metadata/properties/metaAttributes" ct:_="" ma:_="" ma:contentTypeName="Dokument" ma:contentTypeID="0x0101007AC253A931DA3842A9467F19871E2C1B" ma:contentTypeVersion="10" ma:contentTypeDescription="Vytvoří nový dokument" ma:contentTypeScope="" ma:versionID="9dbcdc17d608927f05e31a50324249a7">
   <xsd:schema xmlns:xsd="http://www.w3.org/2001/XMLSchema" xmlns:xs="http://www.w3.org/2001/XMLSchema" xmlns:p="http://schemas.microsoft.com/office/2006/metadata/properties" xmlns:ns2="ac4d9f64-92e6-40df-bbe5-cbf691cfe8ae" xmlns:ns3="9069f8e3-06b5-4841-af59-bd496f6fbcdc" targetNamespace="http://schemas.microsoft.com/office/2006/metadata/properties" ma:root="true" ma:fieldsID="fb3d1d1e590abe5f5a4ef74e9b43408f" ns2:_="" ns3:_="">
     <xsd:import namespace="ac4d9f64-92e6-40df-bbe5-cbf691cfe8ae"/>
@@ -7448,34 +7417,31 @@
 </ct:contentTypeSchema>
 </file>
 
-<file path=customXml/itemProps1.xml><?xml version="1.0" encoding="utf-8"?>
-<ds:datastoreItem xmlns:ds="http://schemas.openxmlformats.org/officeDocument/2006/customXml" ds:itemID="{E8FDF9F9-0BC5-4BD9-96CC-E3BC62E19A62}">
-  <ds:schemaRefs>
-    <ds:schemaRef ds:uri="http://schemas.microsoft.com/sharepoint/v3/contenttype/forms"/>
-  </ds:schemaRefs>
-</ds:datastoreItem>
+<file path=customXml/item2.xml><?xml version="1.0" encoding="utf-8"?>
+<b:Sources xmlns:b="http://schemas.openxmlformats.org/officeDocument/2006/bibliography" xmlns="http://schemas.openxmlformats.org/officeDocument/2006/bibliography" SelectedStyle="\APASixthEditionOfficeOnline.xsl" StyleName="APA" Version="6"/>
 </file>
 
-<file path=customXml/itemProps2.xml><?xml version="1.0" encoding="utf-8"?>
-<ds:datastoreItem xmlns:ds="http://schemas.openxmlformats.org/officeDocument/2006/customXml" ds:itemID="{FB1D83C0-C8CC-4C35-B0E6-D4B15A08C6B5}">
-  <ds:schemaRefs>
-    <ds:schemaRef ds:uri="http://schemas.microsoft.com/office/2006/metadata/properties"/>
-    <ds:schemaRef ds:uri="http://schemas.microsoft.com/office/infopath/2007/PartnerControls"/>
-    <ds:schemaRef ds:uri="9069f8e3-06b5-4841-af59-bd496f6fbcdc"/>
-    <ds:schemaRef ds:uri="ac4d9f64-92e6-40df-bbe5-cbf691cfe8ae"/>
-  </ds:schemaRefs>
-</ds:datastoreItem>
+<file path=customXml/item3.xml><?xml version="1.0" encoding="utf-8"?>
+<p:properties xmlns:p="http://schemas.microsoft.com/office/2006/metadata/properties" xmlns:xsi="http://www.w3.org/2001/XMLSchema-instance" xmlns:pc="http://schemas.microsoft.com/office/infopath/2007/PartnerControls">
+  <documentManagement>
+    <TaxCatchAll xmlns="9069f8e3-06b5-4841-af59-bd496f6fbcdc" xsi:nil="true"/>
+    <lcf76f155ced4ddcb4097134ff3c332f xmlns="ac4d9f64-92e6-40df-bbe5-cbf691cfe8ae">
+      <Terms xmlns="http://schemas.microsoft.com/office/infopath/2007/PartnerControls"/>
+    </lcf76f155ced4ddcb4097134ff3c332f>
+  </documentManagement>
+</p:properties>
 </file>
 
-<file path=customXml/itemProps3.xml><?xml version="1.0" encoding="utf-8"?>
-<ds:datastoreItem xmlns:ds="http://schemas.openxmlformats.org/officeDocument/2006/customXml" ds:itemID="{E0BB6427-4419-4C21-A0DF-4471F23995B6}">
-  <ds:schemaRefs>
-    <ds:schemaRef ds:uri="http://schemas.openxmlformats.org/officeDocument/2006/bibliography"/>
-  </ds:schemaRefs>
-</ds:datastoreItem>
+<file path=customXml/item4.xml><?xml version="1.0" encoding="utf-8"?>
+<?mso-contentType ?>
+<FormTemplates xmlns="http://schemas.microsoft.com/sharepoint/v3/contenttype/forms">
+  <Display>DocumentLibraryForm</Display>
+  <Edit>DocumentLibraryForm</Edit>
+  <New>DocumentLibraryForm</New>
+</FormTemplates>
 </file>
 
-<file path=customXml/itemProps4.xml><?xml version="1.0" encoding="utf-8"?>
+<file path=customXml/itemProps1.xml><?xml version="1.0" encoding="utf-8"?>
 <ds:datastoreItem xmlns:ds="http://schemas.openxmlformats.org/officeDocument/2006/customXml" ds:itemID="{D5874249-D0BB-47A2-ADCE-DE87B2259BE8}">
   <ds:schemaRefs>
     <ds:schemaRef ds:uri="http://schemas.microsoft.com/office/2006/metadata/contentType"/>
@@ -7492,4 +7458,31 @@
     <ds:schemaRef ds:uri="http://schemas.microsoft.com/internal/obd"/>
   </ds:schemaRefs>
 </ds:datastoreItem>
+</file>
+
+<file path=customXml/itemProps2.xml><?xml version="1.0" encoding="utf-8"?>
+<ds:datastoreItem xmlns:ds="http://schemas.openxmlformats.org/officeDocument/2006/customXml" ds:itemID="{E0BB6427-4419-4C21-A0DF-4471F23995B6}">
+  <ds:schemaRefs>
+    <ds:schemaRef ds:uri="http://schemas.openxmlformats.org/officeDocument/2006/bibliography"/>
+  </ds:schemaRefs>
+</ds:datastoreItem>
+</file>
+
+<file path=customXml/itemProps3.xml><?xml version="1.0" encoding="utf-8"?>
+<ds:datastoreItem xmlns:ds="http://schemas.openxmlformats.org/officeDocument/2006/customXml" ds:itemID="{FB1D83C0-C8CC-4C35-B0E6-D4B15A08C6B5}">
+  <ds:schemaRefs>
+    <ds:schemaRef ds:uri="http://schemas.microsoft.com/office/2006/metadata/properties"/>
+    <ds:schemaRef ds:uri="http://schemas.microsoft.com/office/infopath/2007/PartnerControls"/>
+    <ds:schemaRef ds:uri="9069f8e3-06b5-4841-af59-bd496f6fbcdc"/>
+    <ds:schemaRef ds:uri="ac4d9f64-92e6-40df-bbe5-cbf691cfe8ae"/>
+  </ds:schemaRefs>
+</ds:datastoreItem>
+</file>
+
+<file path=customXml/itemProps4.xml><?xml version="1.0" encoding="utf-8"?>
+<ds:datastoreItem xmlns:ds="http://schemas.openxmlformats.org/officeDocument/2006/customXml" ds:itemID="{E8FDF9F9-0BC5-4BD9-96CC-E3BC62E19A62}">
+  <ds:schemaRefs>
+    <ds:schemaRef ds:uri="http://schemas.microsoft.com/sharepoint/v3/contenttype/forms"/>
+  </ds:schemaRefs>
+</ds:datastoreItem>
 </file>
</xml_diff>

<commit_message>
chore: update .gitignore to exclude temporary files and improve documentation in Barta_rocnikova_prace.docx
</commit_message>
<xml_diff>
--- a/Barta_rocnikova_prace.docx
+++ b/Barta_rocnikova_prace.docx
@@ -196,27 +196,7 @@
           <w:sz w:val="40"/>
           <w:szCs w:val="40"/>
         </w:rPr>
-        <w:t xml:space="preserve">Single </w:t>
-      </w:r>
-      <w:proofErr w:type="spellStart"/>
-      <w:r>
-        <w:rPr>
-          <w:b/>
-          <w:bCs/>
-          <w:sz w:val="40"/>
-          <w:szCs w:val="40"/>
-        </w:rPr>
-        <w:t>page</w:t>
-      </w:r>
-      <w:proofErr w:type="spellEnd"/>
-      <w:r>
-        <w:rPr>
-          <w:b/>
-          <w:bCs/>
-          <w:sz w:val="40"/>
-          <w:szCs w:val="40"/>
-        </w:rPr>
-        <w:t xml:space="preserve"> webová aplikace na sledování návyků</w:t>
+        <w:t>Single page webová aplikace na sledování návyků</w:t>
       </w:r>
     </w:p>
     <w:p>
@@ -580,27 +560,7 @@
                 <w:bCs/>
                 <w:szCs w:val="22"/>
               </w:rPr>
-              <w:t xml:space="preserve">Single </w:t>
-            </w:r>
-            <w:proofErr w:type="spellStart"/>
-            <w:r>
-              <w:rPr>
-                <w:rFonts w:cs="Calibri"/>
-                <w:b/>
-                <w:bCs/>
-                <w:szCs w:val="22"/>
-              </w:rPr>
-              <w:t>page</w:t>
-            </w:r>
-            <w:proofErr w:type="spellEnd"/>
-            <w:r>
-              <w:rPr>
-                <w:rFonts w:cs="Calibri"/>
-                <w:b/>
-                <w:bCs/>
-                <w:szCs w:val="22"/>
-              </w:rPr>
-              <w:t xml:space="preserve"> webová aplikace na sledování návyků</w:t>
+              <w:t>Single page webová aplikace na sledování návyků</w:t>
             </w:r>
           </w:p>
         </w:tc>
@@ -2803,11 +2763,22 @@
       <w:pPr>
         <w:pStyle w:val="Nadpis2"/>
       </w:pPr>
+      <w:r>
+        <w:t>Visual Studio Code</w:t>
+      </w:r>
+    </w:p>
+    <w:p>
+      <w:pPr>
+        <w:pStyle w:val="Nadpis2"/>
+      </w:pPr>
       <w:bookmarkStart w:id="24" w:name="_Toc222315294"/>
       <w:r>
-        <w:t>Angular</w:t>
+        <w:t>Angula</w:t>
       </w:r>
       <w:bookmarkEnd w:id="24"/>
+      <w:r>
+        <w:t>r</w:t>
+      </w:r>
     </w:p>
     <w:p>
       <w:pPr>
@@ -2824,13 +2795,8 @@
         <w:pStyle w:val="Nadpis2"/>
       </w:pPr>
       <w:bookmarkStart w:id="26" w:name="_Toc222315296"/>
-      <w:proofErr w:type="spellStart"/>
-      <w:r>
-        <w:t>Sass</w:t>
-      </w:r>
-      <w:proofErr w:type="spellEnd"/>
-      <w:r>
-        <w:t xml:space="preserve"> CSS</w:t>
+      <w:r>
+        <w:t>Sass CSS</w:t>
       </w:r>
       <w:r>
         <w:t xml:space="preserve"> (</w:t>
@@ -2846,12 +2812,12 @@
     <w:p>
       <w:pPr>
         <w:pStyle w:val="Nadpis2"/>
-      </w:pPr>
-      <w:bookmarkStart w:id="27" w:name="_Toc222315297"/>
-      <w:r>
-        <w:t>Vývoj Habit Trackeru</w:t>
-      </w:r>
-      <w:bookmarkEnd w:id="27"/>
+        <w:numPr>
+          <w:ilvl w:val="0"/>
+          <w:numId w:val="0"/>
+        </w:numPr>
+        <w:ind w:left="1080"/>
+      </w:pPr>
       <w:r>
         <w:br w:type="page"/>
       </w:r>
@@ -2860,13 +2826,23 @@
       <w:pPr>
         <w:pStyle w:val="Nadpis1"/>
       </w:pPr>
-      <w:bookmarkStart w:id="28" w:name="_Toc222315298"/>
+      <w:bookmarkStart w:id="27" w:name="_Toc222315298"/>
       <w:r>
         <w:lastRenderedPageBreak/>
         <w:t>Praktická</w:t>
       </w:r>
       <w:r>
         <w:t xml:space="preserve"> část</w:t>
+      </w:r>
+      <w:bookmarkEnd w:id="27"/>
+    </w:p>
+    <w:p>
+      <w:pPr>
+        <w:pStyle w:val="Nadpis2"/>
+      </w:pPr>
+      <w:bookmarkStart w:id="28" w:name="_Toc222315299"/>
+      <w:r>
+        <w:t>Začátek vývoje</w:t>
       </w:r>
       <w:bookmarkEnd w:id="28"/>
     </w:p>
@@ -2874,21 +2850,27 @@
       <w:pPr>
         <w:pStyle w:val="Nadpis2"/>
       </w:pPr>
-      <w:bookmarkStart w:id="29" w:name="_Toc222315299"/>
-      <w:r>
-        <w:t>Začátek vývoje</w:t>
+      <w:bookmarkStart w:id="29" w:name="_Toc222315300"/>
+      <w:r>
+        <w:t xml:space="preserve">Problémy </w:t>
       </w:r>
       <w:bookmarkEnd w:id="29"/>
+      <w:r>
+        <w:t>při vývoji na začátku</w:t>
+      </w:r>
     </w:p>
     <w:p>
       <w:pPr>
         <w:pStyle w:val="Nadpis2"/>
       </w:pPr>
-      <w:bookmarkStart w:id="30" w:name="_Toc222315300"/>
-      <w:r>
-        <w:t>Problémy při začátcích</w:t>
-      </w:r>
-      <w:bookmarkEnd w:id="30"/>
+      <w:r>
+        <w:t>Občasné využití AI</w:t>
+      </w:r>
+    </w:p>
+    <w:p>
+      <w:pPr>
+        <w:pStyle w:val="Nadpis2"/>
+      </w:pPr>
     </w:p>
     <w:p>
       <w:pPr>
@@ -2908,12 +2890,12 @@
         </w:numPr>
         <w:ind w:left="720"/>
       </w:pPr>
-      <w:bookmarkStart w:id="31" w:name="_Toc222315301"/>
+      <w:bookmarkStart w:id="30" w:name="_Toc222315301"/>
       <w:r>
         <w:lastRenderedPageBreak/>
         <w:t>Závěr</w:t>
       </w:r>
-      <w:bookmarkEnd w:id="31"/>
+      <w:bookmarkEnd w:id="30"/>
       <w:r>
         <w:br w:type="page"/>
       </w:r>
@@ -2927,12 +2909,12 @@
         </w:numPr>
         <w:ind w:left="720"/>
       </w:pPr>
-      <w:bookmarkStart w:id="32" w:name="_Toc222315302"/>
+      <w:bookmarkStart w:id="31" w:name="_Toc222315302"/>
       <w:r>
         <w:lastRenderedPageBreak/>
         <w:t>Použitá literatura</w:t>
       </w:r>
-      <w:bookmarkEnd w:id="32"/>
+      <w:bookmarkEnd w:id="31"/>
     </w:p>
     <w:p>
       <w:pPr>
@@ -2976,12 +2958,12 @@
         </w:numPr>
         <w:ind w:left="720"/>
       </w:pPr>
-      <w:bookmarkStart w:id="33" w:name="_Toc222315303"/>
+      <w:bookmarkStart w:id="32" w:name="_Toc222315303"/>
       <w:r>
         <w:lastRenderedPageBreak/>
         <w:t>Seznam obrázků</w:t>
       </w:r>
-      <w:bookmarkEnd w:id="33"/>
+      <w:bookmarkEnd w:id="32"/>
     </w:p>
     <w:p>
       <w:pPr>
@@ -3001,12 +2983,12 @@
         </w:numPr>
         <w:ind w:left="720"/>
       </w:pPr>
-      <w:bookmarkStart w:id="34" w:name="_Toc222315304"/>
+      <w:bookmarkStart w:id="33" w:name="_Toc222315304"/>
       <w:r>
         <w:lastRenderedPageBreak/>
         <w:t>Seznam tabulek</w:t>
       </w:r>
-      <w:bookmarkEnd w:id="34"/>
+      <w:bookmarkEnd w:id="33"/>
     </w:p>
     <w:p>
       <w:pPr>
@@ -3026,12 +3008,12 @@
         </w:numPr>
         <w:ind w:left="720"/>
       </w:pPr>
-      <w:bookmarkStart w:id="35" w:name="_Toc222315305"/>
+      <w:bookmarkStart w:id="34" w:name="_Toc222315305"/>
       <w:r>
         <w:lastRenderedPageBreak/>
         <w:t>Seznam příloh</w:t>
       </w:r>
-      <w:bookmarkEnd w:id="35"/>
+      <w:bookmarkEnd w:id="34"/>
     </w:p>
     <w:p>
       <w:r>
@@ -3083,12 +3065,12 @@
         </w:numPr>
         <w:ind w:left="720"/>
       </w:pPr>
-      <w:bookmarkStart w:id="36" w:name="_Toc222315306"/>
+      <w:bookmarkStart w:id="35" w:name="_Toc222315306"/>
       <w:r>
         <w:lastRenderedPageBreak/>
         <w:t>Přílohy</w:t>
       </w:r>
-      <w:bookmarkEnd w:id="36"/>
+      <w:bookmarkEnd w:id="35"/>
     </w:p>
     <w:p>
       <w:r>
@@ -3244,7 +3226,7 @@
           <wp:extent cx="979230" cy="508520"/>
           <wp:effectExtent l="0" t="0" r="0" b="6350"/>
           <wp:wrapNone/>
-          <wp:docPr id="1120063655" name="Obrázek 187" descr="Obsah obrázku text, Písmo, rukopis, typografie&#10;&#10;Obsah generovaný pomocí AI může být nesprávný."/>
+          <wp:docPr id="777903400" name="Obrázek 187" descr="Obsah obrázku text, Písmo, rukopis, typografie&#10;&#10;Obsah generovaný pomocí AI může být nesprávný."/>
           <wp:cNvGraphicFramePr>
             <a:graphicFrameLocks xmlns:a="http://schemas.openxmlformats.org/drawingml/2006/main" noChangeAspect="1"/>
           </wp:cNvGraphicFramePr>
@@ -3304,7 +3286,7 @@
           <wp:extent cx="3675380" cy="532765"/>
           <wp:effectExtent l="0" t="0" r="1270" b="635"/>
           <wp:wrapNone/>
-          <wp:docPr id="461920018" name="Obrázek 184" descr="Obsah obrázku text, Písmo, černá, snímek obrazovky&#10;&#10;Obsah generovaný pomocí AI může být nesprávný."/>
+          <wp:docPr id="466290304" name="Obrázek 184" descr="Obsah obrázku text, Písmo, černá, snímek obrazovky&#10;&#10;Obsah generovaný pomocí AI může být nesprávný."/>
           <wp:cNvGraphicFramePr>
             <a:graphicFrameLocks xmlns:a="http://schemas.openxmlformats.org/drawingml/2006/main" noChangeAspect="1"/>
           </wp:cNvGraphicFramePr>
@@ -3368,7 +3350,7 @@
           <wp:extent cx="7566660" cy="10691495"/>
           <wp:effectExtent l="0" t="0" r="0" b="0"/>
           <wp:wrapNone/>
-          <wp:docPr id="440376016" name="Obrázek 1"/>
+          <wp:docPr id="747302244" name="Obrázek 1"/>
           <wp:cNvGraphicFramePr>
             <a:graphicFrameLocks xmlns:a="http://schemas.openxmlformats.org/drawingml/2006/main" noChangeAspect="1"/>
           </wp:cNvGraphicFramePr>
@@ -3449,7 +3431,7 @@
           <wp:extent cx="7567200" cy="10692000"/>
           <wp:effectExtent l="0" t="0" r="0" b="0"/>
           <wp:wrapNone/>
-          <wp:docPr id="891154050" name="Obrázek 1"/>
+          <wp:docPr id="590862540" name="Obrázek 1"/>
           <wp:cNvGraphicFramePr>
             <a:graphicFrameLocks xmlns:a="http://schemas.openxmlformats.org/drawingml/2006/main" noChangeAspect="1"/>
           </wp:cNvGraphicFramePr>

</xml_diff>

<commit_message>
chore: update .gitignore to include temporary files and start writing theoretical part of Barta_rocnikova_prace.docx
</commit_message>
<xml_diff>
--- a/Barta_rocnikova_prace.docx
+++ b/Barta_rocnikova_prace.docx
@@ -282,7 +282,6 @@
     <w:p>
       <w:pPr>
         <w:ind w:left="1416" w:firstLine="708"/>
-        <w:jc w:val="center"/>
         <w:rPr>
           <w:b/>
           <w:bCs/>
@@ -304,16 +303,7 @@
           <w:sz w:val="26"/>
           <w:szCs w:val="26"/>
         </w:rPr>
-        <w:t xml:space="preserve"> „jméno a příjmení oponenta prá</w:t>
-      </w:r>
-      <w:r>
-        <w:rPr>
-          <w:b/>
-          <w:bCs/>
-          <w:sz w:val="26"/>
-          <w:szCs w:val="26"/>
-        </w:rPr>
-        <w:t>ce“</w:t>
+        <w:t xml:space="preserve"> </w:t>
       </w:r>
       <w:r>
         <w:rPr>
@@ -1191,8 +1181,6 @@
         <w:spacing w:before="360" w:after="160" w:line="278" w:lineRule="auto"/>
         <w:jc w:val="left"/>
         <w:rPr>
-          <w:b/>
-          <w:bCs/>
           <w:sz w:val="26"/>
           <w:szCs w:val="26"/>
         </w:rPr>
@@ -1370,6 +1358,7 @@
       <w:bookmarkStart w:id="3" w:name="_Toc216425624"/>
       <w:bookmarkStart w:id="4" w:name="_Toc216425782"/>
       <w:bookmarkStart w:id="5" w:name="_Toc222315287"/>
+      <w:bookmarkStart w:id="6" w:name="_Toc223513762"/>
       <w:r>
         <w:lastRenderedPageBreak/>
         <w:t>Prohlášení</w:t>
@@ -1380,6 +1369,7 @@
       <w:bookmarkEnd w:id="3"/>
       <w:bookmarkEnd w:id="4"/>
       <w:bookmarkEnd w:id="5"/>
+      <w:bookmarkEnd w:id="6"/>
       <w:r>
         <w:t xml:space="preserve"> </w:t>
       </w:r>
@@ -1707,18 +1697,20 @@
         </w:numPr>
         <w:ind w:left="720"/>
       </w:pPr>
-      <w:bookmarkStart w:id="6" w:name="_Toc183979915"/>
-      <w:bookmarkStart w:id="7" w:name="_Toc216425625"/>
-      <w:bookmarkStart w:id="8" w:name="_Toc216425783"/>
-      <w:bookmarkStart w:id="9" w:name="_Toc222315288"/>
+      <w:bookmarkStart w:id="7" w:name="_Toc183979915"/>
+      <w:bookmarkStart w:id="8" w:name="_Toc216425625"/>
+      <w:bookmarkStart w:id="9" w:name="_Toc216425783"/>
+      <w:bookmarkStart w:id="10" w:name="_Toc222315288"/>
+      <w:bookmarkStart w:id="11" w:name="_Toc223513763"/>
       <w:r>
         <w:lastRenderedPageBreak/>
         <w:t>Poděkování</w:t>
       </w:r>
-      <w:bookmarkEnd w:id="6"/>
       <w:bookmarkEnd w:id="7"/>
       <w:bookmarkEnd w:id="8"/>
       <w:bookmarkEnd w:id="9"/>
+      <w:bookmarkEnd w:id="10"/>
+      <w:bookmarkEnd w:id="11"/>
     </w:p>
     <w:p>
       <w:r>
@@ -1755,18 +1747,20 @@
         </w:numPr>
         <w:ind w:left="720"/>
       </w:pPr>
-      <w:bookmarkStart w:id="10" w:name="_Toc183979916"/>
-      <w:bookmarkStart w:id="11" w:name="_Toc216425626"/>
-      <w:bookmarkStart w:id="12" w:name="_Toc216425784"/>
-      <w:bookmarkStart w:id="13" w:name="_Toc222315289"/>
+      <w:bookmarkStart w:id="12" w:name="_Toc183979916"/>
+      <w:bookmarkStart w:id="13" w:name="_Toc216425626"/>
+      <w:bookmarkStart w:id="14" w:name="_Toc216425784"/>
+      <w:bookmarkStart w:id="15" w:name="_Toc222315289"/>
+      <w:bookmarkStart w:id="16" w:name="_Toc223513764"/>
       <w:r>
         <w:lastRenderedPageBreak/>
         <w:t>Anotace</w:t>
       </w:r>
-      <w:bookmarkEnd w:id="10"/>
-      <w:bookmarkEnd w:id="11"/>
       <w:bookmarkEnd w:id="12"/>
       <w:bookmarkEnd w:id="13"/>
+      <w:bookmarkEnd w:id="14"/>
+      <w:bookmarkEnd w:id="15"/>
+      <w:bookmarkEnd w:id="16"/>
     </w:p>
     <w:p>
       <w:pPr>
@@ -1786,18 +1780,20 @@
         </w:numPr>
         <w:ind w:left="720"/>
       </w:pPr>
-      <w:bookmarkStart w:id="14" w:name="_Toc183979917"/>
-      <w:bookmarkStart w:id="15" w:name="_Toc216425627"/>
-      <w:bookmarkStart w:id="16" w:name="_Toc216425785"/>
-      <w:bookmarkStart w:id="17" w:name="_Toc222315290"/>
+      <w:bookmarkStart w:id="17" w:name="_Toc183979917"/>
+      <w:bookmarkStart w:id="18" w:name="_Toc216425627"/>
+      <w:bookmarkStart w:id="19" w:name="_Toc216425785"/>
+      <w:bookmarkStart w:id="20" w:name="_Toc222315290"/>
+      <w:bookmarkStart w:id="21" w:name="_Toc223513765"/>
       <w:r>
         <w:lastRenderedPageBreak/>
         <w:t>Klíčová slova</w:t>
       </w:r>
-      <w:bookmarkEnd w:id="14"/>
-      <w:bookmarkEnd w:id="15"/>
-      <w:bookmarkEnd w:id="16"/>
       <w:bookmarkEnd w:id="17"/>
+      <w:bookmarkEnd w:id="18"/>
+      <w:bookmarkEnd w:id="19"/>
+      <w:bookmarkEnd w:id="20"/>
+      <w:bookmarkEnd w:id="21"/>
     </w:p>
     <w:p>
       <w:pPr>
@@ -1817,18 +1813,20 @@
         </w:numPr>
         <w:ind w:left="720"/>
       </w:pPr>
-      <w:bookmarkStart w:id="18" w:name="_Toc183979918"/>
-      <w:bookmarkStart w:id="19" w:name="_Toc216425628"/>
-      <w:bookmarkStart w:id="20" w:name="_Toc216425786"/>
-      <w:bookmarkStart w:id="21" w:name="_Toc222315291"/>
+      <w:bookmarkStart w:id="22" w:name="_Toc183979918"/>
+      <w:bookmarkStart w:id="23" w:name="_Toc216425628"/>
+      <w:bookmarkStart w:id="24" w:name="_Toc216425786"/>
+      <w:bookmarkStart w:id="25" w:name="_Toc222315291"/>
+      <w:bookmarkStart w:id="26" w:name="_Toc223513766"/>
       <w:r>
         <w:lastRenderedPageBreak/>
         <w:t>Obsah</w:t>
       </w:r>
-      <w:bookmarkEnd w:id="18"/>
-      <w:bookmarkEnd w:id="19"/>
-      <w:bookmarkEnd w:id="20"/>
-      <w:bookmarkEnd w:id="21"/>
+      <w:bookmarkEnd w:id="22"/>
+      <w:bookmarkEnd w:id="23"/>
+      <w:bookmarkEnd w:id="24"/>
+      <w:bookmarkEnd w:id="25"/>
+      <w:bookmarkEnd w:id="26"/>
     </w:p>
     <w:sdt>
       <w:sdtPr>
@@ -1867,7 +1865,7 @@
           <w:r>
             <w:fldChar w:fldCharType="separate"/>
           </w:r>
-          <w:hyperlink w:anchor="_Toc222315292" w:history="1">
+          <w:hyperlink w:anchor="_Toc223513767" w:history="1">
             <w:r>
               <w:rPr>
                 <w:rStyle w:val="Hypertextovodkaz"/>
@@ -1894,7 +1892,7 @@
                 <w:noProof/>
                 <w:webHidden/>
               </w:rPr>
-              <w:instrText xml:space="preserve"> PAGEREF _Toc222315292 \h </w:instrText>
+              <w:instrText xml:space="preserve"> PAGEREF _Toc223513767 \h </w:instrText>
             </w:r>
             <w:r>
               <w:rPr>
@@ -1939,7 +1937,7 @@
               <w:lang w:eastAsia="cs-CZ"/>
             </w:rPr>
           </w:pPr>
-          <w:hyperlink w:anchor="_Toc222315293" w:history="1">
+          <w:hyperlink w:anchor="_Toc223513768" w:history="1">
             <w:r>
               <w:rPr>
                 <w:rStyle w:val="Hypertextovodkaz"/>
@@ -1982,7 +1980,7 @@
                 <w:noProof/>
                 <w:webHidden/>
               </w:rPr>
-              <w:instrText xml:space="preserve"> PAGEREF _Toc222315293 \h </w:instrText>
+              <w:instrText xml:space="preserve"> PAGEREF _Toc223513768 \h </w:instrText>
             </w:r>
             <w:r>
               <w:rPr>
@@ -2027,7 +2025,7 @@
               <w:lang w:eastAsia="cs-CZ"/>
             </w:rPr>
           </w:pPr>
-          <w:hyperlink w:anchor="_Toc222315294" w:history="1">
+          <w:hyperlink w:anchor="_Toc223513769" w:history="1">
             <w:r>
               <w:rPr>
                 <w:rStyle w:val="Hypertextovodkaz"/>
@@ -2049,7 +2047,7 @@
                 <w:rStyle w:val="Hypertextovodkaz"/>
                 <w:noProof/>
               </w:rPr>
-              <w:t>Angular</w:t>
+              <w:t>Visual Studio Code</w:t>
             </w:r>
             <w:r>
               <w:rPr>
@@ -2070,7 +2068,7 @@
                 <w:noProof/>
                 <w:webHidden/>
               </w:rPr>
-              <w:instrText xml:space="preserve"> PAGEREF _Toc222315294 \h </w:instrText>
+              <w:instrText xml:space="preserve"> PAGEREF _Toc223513769 \h </w:instrText>
             </w:r>
             <w:r>
               <w:rPr>
@@ -2115,7 +2113,7 @@
               <w:lang w:eastAsia="cs-CZ"/>
             </w:rPr>
           </w:pPr>
-          <w:hyperlink w:anchor="_Toc222315295" w:history="1">
+          <w:hyperlink w:anchor="_Toc223513770" w:history="1">
             <w:r>
               <w:rPr>
                 <w:rStyle w:val="Hypertextovodkaz"/>
@@ -2137,7 +2135,7 @@
                 <w:rStyle w:val="Hypertextovodkaz"/>
                 <w:noProof/>
               </w:rPr>
-              <w:t>Angular Material</w:t>
+              <w:t>Angular</w:t>
             </w:r>
             <w:r>
               <w:rPr>
@@ -2158,7 +2156,7 @@
                 <w:noProof/>
                 <w:webHidden/>
               </w:rPr>
-              <w:instrText xml:space="preserve"> PAGEREF _Toc222315295 \h </w:instrText>
+              <w:instrText xml:space="preserve"> PAGEREF _Toc223513770 \h </w:instrText>
             </w:r>
             <w:r>
               <w:rPr>
@@ -2203,7 +2201,7 @@
               <w:lang w:eastAsia="cs-CZ"/>
             </w:rPr>
           </w:pPr>
-          <w:hyperlink w:anchor="_Toc222315296" w:history="1">
+          <w:hyperlink w:anchor="_Toc223513771" w:history="1">
             <w:r>
               <w:rPr>
                 <w:rStyle w:val="Hypertextovodkaz"/>
@@ -2225,7 +2223,7 @@
                 <w:rStyle w:val="Hypertextovodkaz"/>
                 <w:noProof/>
               </w:rPr>
-              <w:t>Sass CSS (SCSS)</w:t>
+              <w:t>Angular Material</w:t>
             </w:r>
             <w:r>
               <w:rPr>
@@ -2246,7 +2244,7 @@
                 <w:noProof/>
                 <w:webHidden/>
               </w:rPr>
-              <w:instrText xml:space="preserve"> PAGEREF _Toc222315296 \h </w:instrText>
+              <w:instrText xml:space="preserve"> PAGEREF _Toc223513771 \h </w:instrText>
             </w:r>
             <w:r>
               <w:rPr>
@@ -2291,7 +2289,7 @@
               <w:lang w:eastAsia="cs-CZ"/>
             </w:rPr>
           </w:pPr>
-          <w:hyperlink w:anchor="_Toc222315297" w:history="1">
+          <w:hyperlink w:anchor="_Toc223513772" w:history="1">
             <w:r>
               <w:rPr>
                 <w:rStyle w:val="Hypertextovodkaz"/>
@@ -2313,7 +2311,7 @@
                 <w:rStyle w:val="Hypertextovodkaz"/>
                 <w:noProof/>
               </w:rPr>
-              <w:t>Vývoj Habit Trackeru</w:t>
+              <w:t>Sass CSS (SCSS)</w:t>
             </w:r>
             <w:r>
               <w:rPr>
@@ -2334,7 +2332,7 @@
                 <w:noProof/>
                 <w:webHidden/>
               </w:rPr>
-              <w:instrText xml:space="preserve"> PAGEREF _Toc222315297 \h </w:instrText>
+              <w:instrText xml:space="preserve"> PAGEREF _Toc223513772 \h </w:instrText>
             </w:r>
             <w:r>
               <w:rPr>
@@ -2379,7 +2377,7 @@
               <w:lang w:eastAsia="cs-CZ"/>
             </w:rPr>
           </w:pPr>
-          <w:hyperlink w:anchor="_Toc222315298" w:history="1">
+          <w:hyperlink w:anchor="_Toc223513773" w:history="1">
             <w:r>
               <w:rPr>
                 <w:rStyle w:val="Hypertextovodkaz"/>
@@ -2422,7 +2420,7 @@
                 <w:noProof/>
                 <w:webHidden/>
               </w:rPr>
-              <w:instrText xml:space="preserve"> PAGEREF _Toc222315298 \h </w:instrText>
+              <w:instrText xml:space="preserve"> PAGEREF _Toc223513773 \h </w:instrText>
             </w:r>
             <w:r>
               <w:rPr>
@@ -2467,7 +2465,7 @@
               <w:lang w:eastAsia="cs-CZ"/>
             </w:rPr>
           </w:pPr>
-          <w:hyperlink w:anchor="_Toc222315299" w:history="1">
+          <w:hyperlink w:anchor="_Toc223513774" w:history="1">
             <w:r>
               <w:rPr>
                 <w:rStyle w:val="Hypertextovodkaz"/>
@@ -2510,7 +2508,7 @@
                 <w:noProof/>
                 <w:webHidden/>
               </w:rPr>
-              <w:instrText xml:space="preserve"> PAGEREF _Toc222315299 \h </w:instrText>
+              <w:instrText xml:space="preserve"> PAGEREF _Toc223513774 \h </w:instrText>
             </w:r>
             <w:r>
               <w:rPr>
@@ -2555,7 +2553,7 @@
               <w:lang w:eastAsia="cs-CZ"/>
             </w:rPr>
           </w:pPr>
-          <w:hyperlink w:anchor="_Toc222315300" w:history="1">
+          <w:hyperlink w:anchor="_Toc223513775" w:history="1">
             <w:r>
               <w:rPr>
                 <w:rStyle w:val="Hypertextovodkaz"/>
@@ -2577,7 +2575,7 @@
                 <w:rStyle w:val="Hypertextovodkaz"/>
                 <w:noProof/>
               </w:rPr>
-              <w:t>Problémy při začátcích</w:t>
+              <w:t>Problémy při vývoji</w:t>
             </w:r>
             <w:r>
               <w:rPr>
@@ -2598,7 +2596,183 @@
                 <w:noProof/>
                 <w:webHidden/>
               </w:rPr>
-              <w:instrText xml:space="preserve"> PAGEREF _Toc222315300 \h </w:instrText>
+              <w:instrText xml:space="preserve"> PAGEREF _Toc223513775 \h </w:instrText>
+            </w:r>
+            <w:r>
+              <w:rPr>
+                <w:noProof/>
+                <w:webHidden/>
+              </w:rPr>
+            </w:r>
+            <w:r>
+              <w:rPr>
+                <w:noProof/>
+                <w:webHidden/>
+              </w:rPr>
+              <w:fldChar w:fldCharType="separate"/>
+            </w:r>
+            <w:r>
+              <w:rPr>
+                <w:noProof/>
+                <w:webHidden/>
+              </w:rPr>
+              <w:t>12</w:t>
+            </w:r>
+            <w:r>
+              <w:rPr>
+                <w:noProof/>
+                <w:webHidden/>
+              </w:rPr>
+              <w:fldChar w:fldCharType="end"/>
+            </w:r>
+          </w:hyperlink>
+        </w:p>
+        <w:p>
+          <w:pPr>
+            <w:pStyle w:val="Obsah2"/>
+            <w:tabs>
+              <w:tab w:val="left" w:pos="960"/>
+              <w:tab w:val="right" w:leader="dot" w:pos="9628"/>
+            </w:tabs>
+            <w:rPr>
+              <w:rFonts w:asciiTheme="minorHAnsi" w:eastAsiaTheme="minorEastAsia" w:hAnsiTheme="minorHAnsi"/>
+              <w:noProof/>
+              <w:sz w:val="24"/>
+              <w:lang w:eastAsia="cs-CZ"/>
+            </w:rPr>
+          </w:pPr>
+          <w:hyperlink w:anchor="_Toc223513776" w:history="1">
+            <w:r>
+              <w:rPr>
+                <w:rStyle w:val="Hypertextovodkaz"/>
+                <w:noProof/>
+              </w:rPr>
+              <w:t>2.3.</w:t>
+            </w:r>
+            <w:r>
+              <w:rPr>
+                <w:rFonts w:asciiTheme="minorHAnsi" w:eastAsiaTheme="minorEastAsia" w:hAnsiTheme="minorHAnsi"/>
+                <w:noProof/>
+                <w:sz w:val="24"/>
+                <w:lang w:eastAsia="cs-CZ"/>
+              </w:rPr>
+              <w:tab/>
+            </w:r>
+            <w:r>
+              <w:rPr>
+                <w:rStyle w:val="Hypertextovodkaz"/>
+                <w:noProof/>
+              </w:rPr>
+              <w:t>Občasné využití AI</w:t>
+            </w:r>
+            <w:r>
+              <w:rPr>
+                <w:noProof/>
+                <w:webHidden/>
+              </w:rPr>
+              <w:tab/>
+            </w:r>
+            <w:r>
+              <w:rPr>
+                <w:noProof/>
+                <w:webHidden/>
+              </w:rPr>
+              <w:fldChar w:fldCharType="begin"/>
+            </w:r>
+            <w:r>
+              <w:rPr>
+                <w:noProof/>
+                <w:webHidden/>
+              </w:rPr>
+              <w:instrText xml:space="preserve"> PAGEREF _Toc223513776 \h </w:instrText>
+            </w:r>
+            <w:r>
+              <w:rPr>
+                <w:noProof/>
+                <w:webHidden/>
+              </w:rPr>
+            </w:r>
+            <w:r>
+              <w:rPr>
+                <w:noProof/>
+                <w:webHidden/>
+              </w:rPr>
+              <w:fldChar w:fldCharType="separate"/>
+            </w:r>
+            <w:r>
+              <w:rPr>
+                <w:noProof/>
+                <w:webHidden/>
+              </w:rPr>
+              <w:t>12</w:t>
+            </w:r>
+            <w:r>
+              <w:rPr>
+                <w:noProof/>
+                <w:webHidden/>
+              </w:rPr>
+              <w:fldChar w:fldCharType="end"/>
+            </w:r>
+          </w:hyperlink>
+        </w:p>
+        <w:p>
+          <w:pPr>
+            <w:pStyle w:val="Obsah2"/>
+            <w:tabs>
+              <w:tab w:val="left" w:pos="960"/>
+              <w:tab w:val="right" w:leader="dot" w:pos="9628"/>
+            </w:tabs>
+            <w:rPr>
+              <w:rFonts w:asciiTheme="minorHAnsi" w:eastAsiaTheme="minorEastAsia" w:hAnsiTheme="minorHAnsi"/>
+              <w:noProof/>
+              <w:sz w:val="24"/>
+              <w:lang w:eastAsia="cs-CZ"/>
+            </w:rPr>
+          </w:pPr>
+          <w:hyperlink w:anchor="_Toc223513777" w:history="1">
+            <w:r>
+              <w:rPr>
+                <w:rStyle w:val="Hypertextovodkaz"/>
+                <w:noProof/>
+              </w:rPr>
+              <w:t>2.4.</w:t>
+            </w:r>
+            <w:r>
+              <w:rPr>
+                <w:rFonts w:asciiTheme="minorHAnsi" w:eastAsiaTheme="minorEastAsia" w:hAnsiTheme="minorHAnsi"/>
+                <w:noProof/>
+                <w:sz w:val="24"/>
+                <w:lang w:eastAsia="cs-CZ"/>
+              </w:rPr>
+              <w:tab/>
+            </w:r>
+            <w:r>
+              <w:rPr>
+                <w:rStyle w:val="Hypertextovodkaz"/>
+                <w:noProof/>
+              </w:rPr>
+              <w:t>Zkušenosti nabrané z této práce</w:t>
+            </w:r>
+            <w:r>
+              <w:rPr>
+                <w:noProof/>
+                <w:webHidden/>
+              </w:rPr>
+              <w:tab/>
+            </w:r>
+            <w:r>
+              <w:rPr>
+                <w:noProof/>
+                <w:webHidden/>
+              </w:rPr>
+              <w:fldChar w:fldCharType="begin"/>
+            </w:r>
+            <w:r>
+              <w:rPr>
+                <w:noProof/>
+                <w:webHidden/>
+              </w:rPr>
+              <w:instrText xml:space="preserve"> PAGEREF _Toc223513777 \h </w:instrText>
             </w:r>
             <w:r>
               <w:rPr>
@@ -2642,7 +2816,7 @@
               <w:lang w:eastAsia="cs-CZ"/>
             </w:rPr>
           </w:pPr>
-          <w:hyperlink w:anchor="_Toc222315301" w:history="1">
+          <w:hyperlink w:anchor="_Toc223513778" w:history="1">
             <w:r>
               <w:rPr>
                 <w:rStyle w:val="Hypertextovodkaz"/>
@@ -2669,7 +2843,7 @@
                 <w:noProof/>
                 <w:webHidden/>
               </w:rPr>
-              <w:instrText xml:space="preserve"> PAGEREF _Toc222315301 \h </w:instrText>
+              <w:instrText xml:space="preserve"> PAGEREF _Toc223513778 \h </w:instrText>
             </w:r>
             <w:r>
               <w:rPr>
@@ -2699,8 +2873,6 @@
               <w:fldChar w:fldCharType="end"/>
             </w:r>
           </w:hyperlink>
-        </w:p>
-        <w:p>
           <w:r>
             <w:rPr>
               <w:b/>
@@ -2729,12 +2901,56 @@
         </w:numPr>
         <w:ind w:left="720"/>
       </w:pPr>
-      <w:bookmarkStart w:id="22" w:name="_Toc222315292"/>
+      <w:bookmarkStart w:id="27" w:name="_Toc223513767"/>
       <w:r>
         <w:lastRenderedPageBreak/>
         <w:t>Úvod</w:t>
       </w:r>
-      <w:bookmarkEnd w:id="22"/>
+      <w:bookmarkEnd w:id="27"/>
+    </w:p>
+    <w:p>
+      <w:r>
+        <w:t>V této zrychlené a zvláštní době, která si ráda vyžaduje vysoké nároky od každého z</w:t>
+      </w:r>
+      <w:r>
+        <w:t> </w:t>
+      </w:r>
+      <w:r>
+        <w:t>nás</w:t>
+      </w:r>
+      <w:r>
+        <w:t>, hlavně na produktivitu a sebekázeň, se budování a tvarování návyků stává čím dál více aktuálním a důležitým tématem. Schopnost efektivního řízení své každodenní rutiny a eliminace nežádoucích zlozvyků je považována za jeden z klíčových pilířů osobního rozvoje a klidu. S neustále rostoucí digitalizací se přirozeně navyšuje i poptávka po nástrojích a aplikacích, které tento zdánlivě jednoduchý proces usnadňují a pomáhá ho dělat přehlednějším než kdy dřív.</w:t>
+      </w:r>
+    </w:p>
+    <w:p>
+      <w:r>
+        <w:t>Cíl této ročníkové práce je navrhnutí a realizování webové aplikace se jménem „Habit Tracker“. Tento co nejvíce moderní nástroj je koncipován jako digitální asistent a notýsek, který uživateli dá možnost</w:t>
+      </w:r>
+      <w:r>
+        <w:t xml:space="preserve"> monitorování jeho pokroku v reálném čase. Na rozdíl od běžných seznamů úkolů se tato aplikace snaží zaměřovat co nejvíce na dlouhodobou udržitelnost a vizualizaci úspěchů, což velmi výrazně přispěje k udržitelnosti vnitřní motivace uživatele</w:t>
+      </w:r>
+      <w:r>
+        <w:t>.</w:t>
+      </w:r>
+    </w:p>
+    <w:p>
+      <w:r>
+        <w:t>Hlavní inovací v rámci této ročníkové práce je rozdělení sledovaných aktivit na dvě nejzákladnější kategorie – pozitivní návyky a negativní zlozvyky. Uživatelské rozhraní je navrženo s ohledem na co možná největší přehlednost, přičemž přepínání mezi těmito kategoriemi je řešeno pomocí intuitivního systému karet. Technické řešení je postaveno na moderním frameworku Angular, který je velice dobrý při zajišťování rychlosti a responzivity aplikace na různých typech zařízení</w:t>
+      </w:r>
+    </w:p>
+    <w:p>
+      <w:r>
+        <w:t>Text v tomto dokumentu pro tuhle ročníkovou práci je strukturován do dvou hlavních bloků. V první části se zaměř</w:t>
+      </w:r>
+      <w:r>
+        <w:t>uji</w:t>
+      </w:r>
+      <w:r>
+        <w:t xml:space="preserve"> na teoretickou část, kde jsou představeny jednotlivé technologie a nástroje, které pro tento projekt byly použity. Mezi tyto technologie řadím vývojové prostředí Visual Studio Code, framework pro webové aplikace Angular včetně pomocné knihovny Angular Material a stylovací jazyk</w:t>
+      </w:r>
+      <w:r>
+        <w:t xml:space="preserve"> SCSS. V druhé části se už zaměřuji na praktickou část, kde se s co největší podrobností zabývá samotnou implementací a vývojem Habit Tracker aplikace, architekturou jednotlivých komponent a logikou ukládání dat pro uživatele. </w:t>
+      </w:r>
     </w:p>
     <w:p>
       <w:pPr>
@@ -2749,7 +2965,7 @@
       <w:pPr>
         <w:pStyle w:val="Nadpis1"/>
       </w:pPr>
-      <w:bookmarkStart w:id="23" w:name="_Toc222315293"/>
+      <w:bookmarkStart w:id="28" w:name="_Toc223513768"/>
       <w:r>
         <w:lastRenderedPageBreak/>
         <w:t>Teoretická čás</w:t>
@@ -2757,44 +2973,201 @@
       <w:r>
         <w:t>t</w:t>
       </w:r>
-      <w:bookmarkEnd w:id="23"/>
+      <w:bookmarkEnd w:id="28"/>
+    </w:p>
+    <w:p>
+      <w:r>
+        <w:t>V této části dokumentu bych vás (čtenáře) chtěl seznámit s nejpodstatnějšími částmi softwaru, programovacího jazyku atp., které byly využity pro vývoj a samostatné vytvoření Habit Tracker aplikace</w:t>
+      </w:r>
     </w:p>
     <w:p>
       <w:pPr>
         <w:pStyle w:val="Nadpis2"/>
       </w:pPr>
+      <w:bookmarkStart w:id="29" w:name="_Toc223513769"/>
       <w:r>
         <w:t>Visual Studio Code</w:t>
       </w:r>
+      <w:bookmarkEnd w:id="29"/>
+    </w:p>
+    <w:p>
+      <w:r>
+        <w:t>Pro vývoj této webové aplikace jsem si zvolil Visual Studio Code jako své vývojové prostředí</w:t>
+      </w:r>
+      <w:r>
+        <w:t xml:space="preserve"> </w:t>
+      </w:r>
+      <w:r>
+        <w:t>(IDE) od společnosti Microsoft. Považuji toto prostředí za sv</w:t>
+      </w:r>
+      <w:r>
+        <w:t xml:space="preserve">é standardní </w:t>
+      </w:r>
+      <w:r>
+        <w:t>z</w:t>
+      </w:r>
+      <w:r>
+        <w:t> </w:t>
+      </w:r>
+      <w:r>
+        <w:t>několika</w:t>
+      </w:r>
+      <w:r>
+        <w:t xml:space="preserve"> </w:t>
+      </w:r>
+      <w:r>
+        <w:t>důvodů.</w:t>
+      </w:r>
+    </w:p>
+    <w:p>
+      <w:pPr>
+        <w:pStyle w:val="Nadpis3"/>
+      </w:pPr>
+      <w:r>
+        <w:t>Školní zkušenost</w:t>
+      </w:r>
+    </w:p>
+    <w:p>
+      <w:r>
+        <w:t>Prvním z důvodu, proč toto IDE používám je velice prostý a to ten, že neumím</w:t>
+      </w:r>
+      <w:r>
+        <w:t xml:space="preserve"> používat</w:t>
+      </w:r>
+      <w:r>
+        <w:t xml:space="preserve"> žádné další. Vím moc dobře, že existuji další vývojová prostředí, ale v tomhle mám nejvíce zkušenosti hlavně díky </w:t>
+      </w:r>
+      <w:r>
+        <w:t>naší</w:t>
+      </w:r>
+      <w:r>
+        <w:t xml:space="preserve"> škole, kde pro programování se </w:t>
+      </w:r>
+      <w:r>
+        <w:t>většinu</w:t>
+      </w:r>
+      <w:r>
+        <w:t xml:space="preserve"> času využívá právě Visual Studio Code</w:t>
+      </w:r>
+      <w:r>
+        <w:t xml:space="preserve"> jako vývojové prostředí</w:t>
+      </w:r>
+      <w:r>
+        <w:t xml:space="preserve">. </w:t>
+      </w:r>
+    </w:p>
+    <w:p>
+      <w:pPr>
+        <w:pStyle w:val="Nadpis3"/>
+      </w:pPr>
+      <w:r>
+        <w:t>Integrovaný terminál</w:t>
+      </w:r>
+    </w:p>
+    <w:p>
+      <w:r>
+        <w:t xml:space="preserve">Další, ale </w:t>
+      </w:r>
+      <w:r>
+        <w:t xml:space="preserve">stejně </w:t>
+      </w:r>
+      <w:r>
+        <w:t xml:space="preserve">podstatný důvod, proč jsem se rozhodl vybrat si toto IDE je jeho integrovaný terminál. Programovací framework </w:t>
+      </w:r>
+      <w:r>
+        <w:t>Angular</w:t>
+      </w:r>
+      <w:r>
+        <w:t>, který používám pro vývoj Habit Trackeru</w:t>
+      </w:r>
+      <w:r>
+        <w:t>,</w:t>
+      </w:r>
+      <w:r>
+        <w:t xml:space="preserve"> využívá příkazovou řádku pro usnadnění několika běžných akcích při vývoji</w:t>
+      </w:r>
+      <w:r>
+        <w:t xml:space="preserve"> ale o tom více v sekci věnované Angularu samotnému</w:t>
+      </w:r>
+      <w:r>
+        <w:t>.</w:t>
+      </w:r>
+    </w:p>
+    <w:p>
+      <w:pPr>
+        <w:pStyle w:val="Nadpis3"/>
+      </w:pPr>
+      <w:r>
+        <w:t>Rozšíření</w:t>
+      </w:r>
+      <w:r>
+        <w:t xml:space="preserve"> prostředí</w:t>
+      </w:r>
+    </w:p>
+    <w:p>
+      <w:r>
+        <w:t>Poslední z důvodů, proč používám Visual Studio Code jsou jeho možnost rozšíření (dále jako Extentions). Teoretický vzato by bylo možné vytvořit tuto aplikaci a jakoukoliv jinou webovou aplikaci i bez použití rozšíření, ale byl by to velice, velice bolestivý a zdlouhavý proces</w:t>
+      </w:r>
+      <w:r>
+        <w:t>. Extentions můž</w:t>
+      </w:r>
+      <w:r>
+        <w:t>ou</w:t>
+      </w:r>
+      <w:r>
+        <w:t xml:space="preserve"> pomáhat vývojáři</w:t>
+      </w:r>
+      <w:r>
+        <w:t xml:space="preserve"> být rychlejší ve psaní kódu díky nápovědám syntaxe jako je konktrétně pro tento projekt Angular Language Service. Mohou také ale pomoc urovnat již napsaný kód pomocí například Prettier</w:t>
+      </w:r>
+      <w:r>
+        <w:t xml:space="preserve"> a spoustu dalších rozšíření pro co nejpřívětivější zkušenost a vývoj aplikací a programů.</w:t>
+      </w:r>
+    </w:p>
+    <w:p>
+      <w:pPr>
+        <w:pStyle w:val="Nadpis3"/>
+      </w:pPr>
+      <w:r>
+        <w:t>Git podpora</w:t>
+      </w:r>
+    </w:p>
+    <w:p>
+      <w:r>
+        <w:t xml:space="preserve">Přímo v prostředí Visual Studio Code existuje možnost pro uživatele spravovat veškeré věci týkající se verzování zdrojového kódu pomocí Git přímo v tomto vývojovém prostředí. </w:t>
+      </w:r>
     </w:p>
     <w:p>
       <w:pPr>
         <w:pStyle w:val="Nadpis2"/>
       </w:pPr>
-      <w:bookmarkStart w:id="24" w:name="_Toc222315294"/>
-      <w:r>
+      <w:bookmarkStart w:id="30" w:name="_Toc223513770"/>
+      <w:bookmarkStart w:id="31" w:name="_Angular"/>
+      <w:bookmarkEnd w:id="31"/>
+      <w:r>
+        <w:lastRenderedPageBreak/>
         <w:t>Angula</w:t>
       </w:r>
-      <w:bookmarkEnd w:id="24"/>
       <w:r>
         <w:t>r</w:t>
       </w:r>
+      <w:bookmarkEnd w:id="30"/>
     </w:p>
     <w:p>
       <w:pPr>
         <w:pStyle w:val="Nadpis2"/>
       </w:pPr>
-      <w:bookmarkStart w:id="25" w:name="_Toc222315295"/>
+      <w:bookmarkStart w:id="32" w:name="_Toc223513771"/>
       <w:r>
         <w:t>Angular Material</w:t>
       </w:r>
-      <w:bookmarkEnd w:id="25"/>
+      <w:bookmarkEnd w:id="32"/>
     </w:p>
     <w:p>
       <w:pPr>
         <w:pStyle w:val="Nadpis2"/>
       </w:pPr>
-      <w:bookmarkStart w:id="26" w:name="_Toc222315296"/>
+      <w:bookmarkStart w:id="33" w:name="_Toc223513772"/>
       <w:r>
         <w:t>Sass CSS</w:t>
       </w:r>
@@ -2807,7 +3180,7 @@
       <w:r>
         <w:t>)</w:t>
       </w:r>
-      <w:bookmarkEnd w:id="26"/>
+      <w:bookmarkEnd w:id="33"/>
     </w:p>
     <w:p>
       <w:pPr>
@@ -2826,7 +3199,7 @@
       <w:pPr>
         <w:pStyle w:val="Nadpis1"/>
       </w:pPr>
-      <w:bookmarkStart w:id="27" w:name="_Toc222315298"/>
+      <w:bookmarkStart w:id="34" w:name="_Toc223513773"/>
       <w:r>
         <w:lastRenderedPageBreak/>
         <w:t>Praktická</w:t>
@@ -2834,43 +3207,58 @@
       <w:r>
         <w:t xml:space="preserve"> část</w:t>
       </w:r>
-      <w:bookmarkEnd w:id="27"/>
+      <w:bookmarkEnd w:id="34"/>
     </w:p>
     <w:p>
       <w:pPr>
         <w:pStyle w:val="Nadpis2"/>
       </w:pPr>
-      <w:bookmarkStart w:id="28" w:name="_Toc222315299"/>
-      <w:r>
-        <w:t>Začátek vývoje</w:t>
-      </w:r>
-      <w:bookmarkEnd w:id="28"/>
+      <w:bookmarkStart w:id="35" w:name="_Toc223513774"/>
+      <w:r>
+        <w:t xml:space="preserve">Příprava </w:t>
+      </w:r>
+      <w:proofErr w:type="gramStart"/>
+      <w:r>
+        <w:t xml:space="preserve">na </w:t>
+      </w:r>
+      <w:r>
+        <w:t xml:space="preserve"> vývoj</w:t>
+      </w:r>
+      <w:bookmarkEnd w:id="35"/>
+      <w:proofErr w:type="gramEnd"/>
     </w:p>
     <w:p>
       <w:pPr>
         <w:pStyle w:val="Nadpis2"/>
       </w:pPr>
-      <w:bookmarkStart w:id="29" w:name="_Toc222315300"/>
+      <w:bookmarkStart w:id="36" w:name="_Toc223513775"/>
       <w:r>
         <w:t xml:space="preserve">Problémy </w:t>
       </w:r>
-      <w:bookmarkEnd w:id="29"/>
-      <w:r>
-        <w:t>při vývoji na začátku</w:t>
-      </w:r>
+      <w:r>
+        <w:t>při vývoji</w:t>
+      </w:r>
+      <w:bookmarkEnd w:id="36"/>
     </w:p>
     <w:p>
       <w:pPr>
         <w:pStyle w:val="Nadpis2"/>
       </w:pPr>
+      <w:bookmarkStart w:id="37" w:name="_Toc223513776"/>
       <w:r>
         <w:t>Občasné využití AI</w:t>
       </w:r>
+      <w:bookmarkEnd w:id="37"/>
     </w:p>
     <w:p>
       <w:pPr>
         <w:pStyle w:val="Nadpis2"/>
       </w:pPr>
+      <w:bookmarkStart w:id="38" w:name="_Toc223513777"/>
+      <w:r>
+        <w:t>Zkušenosti nabrané z této práce</w:t>
+      </w:r>
+      <w:bookmarkEnd w:id="38"/>
     </w:p>
     <w:p>
       <w:pPr>
@@ -2890,12 +3278,12 @@
         </w:numPr>
         <w:ind w:left="720"/>
       </w:pPr>
-      <w:bookmarkStart w:id="30" w:name="_Toc222315301"/>
+      <w:bookmarkStart w:id="39" w:name="_Toc223513778"/>
       <w:r>
         <w:lastRenderedPageBreak/>
         <w:t>Závěr</w:t>
       </w:r>
-      <w:bookmarkEnd w:id="30"/>
+      <w:bookmarkEnd w:id="39"/>
       <w:r>
         <w:br w:type="page"/>
       </w:r>
@@ -2909,12 +3297,14 @@
         </w:numPr>
         <w:ind w:left="720"/>
       </w:pPr>
-      <w:bookmarkStart w:id="31" w:name="_Toc222315302"/>
+      <w:bookmarkStart w:id="40" w:name="_Toc222315302"/>
+      <w:bookmarkStart w:id="41" w:name="_Toc223513779"/>
       <w:r>
         <w:lastRenderedPageBreak/>
         <w:t>Použitá literatura</w:t>
       </w:r>
-      <w:bookmarkEnd w:id="31"/>
+      <w:bookmarkEnd w:id="40"/>
+      <w:bookmarkEnd w:id="41"/>
     </w:p>
     <w:p>
       <w:pPr>
@@ -2958,12 +3348,14 @@
         </w:numPr>
         <w:ind w:left="720"/>
       </w:pPr>
-      <w:bookmarkStart w:id="32" w:name="_Toc222315303"/>
+      <w:bookmarkStart w:id="42" w:name="_Toc222315303"/>
+      <w:bookmarkStart w:id="43" w:name="_Toc223513780"/>
       <w:r>
         <w:lastRenderedPageBreak/>
         <w:t>Seznam obrázků</w:t>
       </w:r>
-      <w:bookmarkEnd w:id="32"/>
+      <w:bookmarkEnd w:id="42"/>
+      <w:bookmarkEnd w:id="43"/>
     </w:p>
     <w:p>
       <w:pPr>
@@ -2983,12 +3375,14 @@
         </w:numPr>
         <w:ind w:left="720"/>
       </w:pPr>
-      <w:bookmarkStart w:id="33" w:name="_Toc222315304"/>
+      <w:bookmarkStart w:id="44" w:name="_Toc222315304"/>
+      <w:bookmarkStart w:id="45" w:name="_Toc223513781"/>
       <w:r>
         <w:lastRenderedPageBreak/>
         <w:t>Seznam tabulek</w:t>
       </w:r>
-      <w:bookmarkEnd w:id="33"/>
+      <w:bookmarkEnd w:id="44"/>
+      <w:bookmarkEnd w:id="45"/>
     </w:p>
     <w:p>
       <w:pPr>
@@ -3008,12 +3402,14 @@
         </w:numPr>
         <w:ind w:left="720"/>
       </w:pPr>
-      <w:bookmarkStart w:id="34" w:name="_Toc222315305"/>
+      <w:bookmarkStart w:id="46" w:name="_Toc222315305"/>
+      <w:bookmarkStart w:id="47" w:name="_Toc223513782"/>
       <w:r>
         <w:lastRenderedPageBreak/>
         <w:t>Seznam příloh</w:t>
       </w:r>
-      <w:bookmarkEnd w:id="34"/>
+      <w:bookmarkEnd w:id="46"/>
+      <w:bookmarkEnd w:id="47"/>
     </w:p>
     <w:p>
       <w:r>
@@ -3065,12 +3461,14 @@
         </w:numPr>
         <w:ind w:left="720"/>
       </w:pPr>
-      <w:bookmarkStart w:id="35" w:name="_Toc222315306"/>
+      <w:bookmarkStart w:id="48" w:name="_Toc222315306"/>
+      <w:bookmarkStart w:id="49" w:name="_Toc223513783"/>
       <w:r>
         <w:lastRenderedPageBreak/>
         <w:t>Přílohy</w:t>
       </w:r>
-      <w:bookmarkEnd w:id="35"/>
+      <w:bookmarkEnd w:id="48"/>
+      <w:bookmarkEnd w:id="49"/>
     </w:p>
     <w:p>
       <w:r>
@@ -3136,7 +3534,7 @@
       <w:pStyle w:val="Zpat"/>
     </w:pPr>
     <w:r>
-      <w:t>SPS-CL ročníková/maturitní práce</w:t>
+      <w:t>SPS-CL ročníková práce</w:t>
     </w:r>
     <w:r>
       <w:ptab w:relativeTo="margin" w:alignment="right" w:leader="none"/>
@@ -6912,6 +7310,18 @@
       <w:ind w:left="220"/>
     </w:pPr>
   </w:style>
+  <w:style w:type="character" w:styleId="Nevyeenzmnka">
+    <w:name w:val="Unresolved Mention"/>
+    <w:basedOn w:val="Standardnpsmoodstavce"/>
+    <w:uiPriority w:val="99"/>
+    <w:semiHidden/>
+    <w:unhideWhenUsed/>
+    <w:rsid w:val="00C70B74"/>
+    <w:rPr>
+      <w:color w:val="605E5C"/>
+      <w:shd w:val="clear" w:color="auto" w:fill="E1DFDD"/>
+    </w:rPr>
+  </w:style>
 </w:styles>
 </file>
 
@@ -7211,6 +7621,10 @@
 </file>
 
 <file path=customXml/item1.xml><?xml version="1.0" encoding="utf-8"?>
+<b:Sources xmlns:b="http://schemas.openxmlformats.org/officeDocument/2006/bibliography" xmlns="http://schemas.openxmlformats.org/officeDocument/2006/bibliography" SelectedStyle="\APASixthEditionOfficeOnline.xsl" StyleName="APA" Version="6"/>
+</file>
+
+<file path=customXml/item2.xml><?xml version="1.0" encoding="utf-8"?>
 <ct:contentTypeSchema xmlns:ct="http://schemas.microsoft.com/office/2006/metadata/contentType" xmlns:ma="http://schemas.microsoft.com/office/2006/metadata/properties/metaAttributes" ct:_="" ma:_="" ma:contentTypeName="Dokument" ma:contentTypeID="0x0101007AC253A931DA3842A9467F19871E2C1B" ma:contentTypeVersion="10" ma:contentTypeDescription="Vytvoří nový dokument" ma:contentTypeScope="" ma:versionID="9dbcdc17d608927f05e31a50324249a7">
   <xsd:schema xmlns:xsd="http://www.w3.org/2001/XMLSchema" xmlns:xs="http://www.w3.org/2001/XMLSchema" xmlns:p="http://schemas.microsoft.com/office/2006/metadata/properties" xmlns:ns2="ac4d9f64-92e6-40df-bbe5-cbf691cfe8ae" xmlns:ns3="9069f8e3-06b5-4841-af59-bd496f6fbcdc" targetNamespace="http://schemas.microsoft.com/office/2006/metadata/properties" ma:root="true" ma:fieldsID="fb3d1d1e590abe5f5a4ef74e9b43408f" ns2:_="" ns3:_="">
     <xsd:import namespace="ac4d9f64-92e6-40df-bbe5-cbf691cfe8ae"/>
@@ -7399,10 +7813,6 @@
 </ct:contentTypeSchema>
 </file>
 
-<file path=customXml/item2.xml><?xml version="1.0" encoding="utf-8"?>
-<b:Sources xmlns:b="http://schemas.openxmlformats.org/officeDocument/2006/bibliography" xmlns="http://schemas.openxmlformats.org/officeDocument/2006/bibliography" SelectedStyle="\APASixthEditionOfficeOnline.xsl" StyleName="APA" Version="6"/>
-</file>
-
 <file path=customXml/item3.xml><?xml version="1.0" encoding="utf-8"?>
 <p:properties xmlns:p="http://schemas.microsoft.com/office/2006/metadata/properties" xmlns:xsi="http://www.w3.org/2001/XMLSchema-instance" xmlns:pc="http://schemas.microsoft.com/office/infopath/2007/PartnerControls">
   <documentManagement>
@@ -7424,6 +7834,14 @@
 </file>
 
 <file path=customXml/itemProps1.xml><?xml version="1.0" encoding="utf-8"?>
+<ds:datastoreItem xmlns:ds="http://schemas.openxmlformats.org/officeDocument/2006/customXml" ds:itemID="{E0BB6427-4419-4C21-A0DF-4471F23995B6}">
+  <ds:schemaRefs>
+    <ds:schemaRef ds:uri="http://schemas.openxmlformats.org/officeDocument/2006/bibliography"/>
+  </ds:schemaRefs>
+</ds:datastoreItem>
+</file>
+
+<file path=customXml/itemProps2.xml><?xml version="1.0" encoding="utf-8"?>
 <ds:datastoreItem xmlns:ds="http://schemas.openxmlformats.org/officeDocument/2006/customXml" ds:itemID="{D5874249-D0BB-47A2-ADCE-DE87B2259BE8}">
   <ds:schemaRefs>
     <ds:schemaRef ds:uri="http://schemas.microsoft.com/office/2006/metadata/contentType"/>
@@ -7438,14 +7856,6 @@
     <ds:schemaRef ds:uri="http://purl.org/dc/elements/1.1/"/>
     <ds:schemaRef ds:uri="http://purl.org/dc/terms/"/>
     <ds:schemaRef ds:uri="http://schemas.microsoft.com/internal/obd"/>
-  </ds:schemaRefs>
-</ds:datastoreItem>
-</file>
-
-<file path=customXml/itemProps2.xml><?xml version="1.0" encoding="utf-8"?>
-<ds:datastoreItem xmlns:ds="http://schemas.openxmlformats.org/officeDocument/2006/customXml" ds:itemID="{E0BB6427-4419-4C21-A0DF-4471F23995B6}">
-  <ds:schemaRefs>
-    <ds:schemaRef ds:uri="http://schemas.openxmlformats.org/officeDocument/2006/bibliography"/>
   </ds:schemaRefs>
 </ds:datastoreItem>
 </file>

</xml_diff>

<commit_message>
docs: finish writing theoretical section of Barta_rocnikova_prace.docx
</commit_message>
<xml_diff>
--- a/Barta_rocnikova_prace.docx
+++ b/Barta_rocnikova_prace.docx
@@ -3134,24 +3134,141 @@
     </w:p>
     <w:p>
       <w:r>
-        <w:t xml:space="preserve">Přímo v prostředí Visual Studio Code existuje možnost pro uživatele spravovat veškeré věci týkající se verzování zdrojového kódu pomocí Git přímo v tomto vývojovém prostředí. </w:t>
+        <w:t xml:space="preserve">Přímo v prostředí Visual Studio Code existuje možnost pro uživatele spravovat veškeré věci týkající se verzování pomocí Git </w:t>
+      </w:r>
+      <w:r>
+        <w:t>v jednoduše pochopitelném uživatelském rozhraní</w:t>
+      </w:r>
+      <w:r>
+        <w:t xml:space="preserve">. Tuto možnost jsem využil pro postupné commitování změn tohoto projektu, což mi pomohlo také ve psaní praktické části tohoto dokumentu. </w:t>
       </w:r>
     </w:p>
     <w:p>
       <w:pPr>
         <w:pStyle w:val="Nadpis2"/>
       </w:pPr>
-      <w:bookmarkStart w:id="30" w:name="_Toc223513770"/>
-      <w:bookmarkStart w:id="31" w:name="_Angular"/>
+      <w:bookmarkStart w:id="30" w:name="_Angular"/>
+      <w:bookmarkStart w:id="31" w:name="_Toc223513770"/>
+      <w:bookmarkEnd w:id="30"/>
+      <w:r>
+        <w:t>Angula</w:t>
+      </w:r>
+      <w:r>
+        <w:t>r</w:t>
+      </w:r>
       <w:bookmarkEnd w:id="31"/>
+    </w:p>
+    <w:p>
+      <w:r>
+        <w:t>Každá aplikace potřebuje své jádro, na kterém je postavena. Jelikož je tento projekt Single Page, nenapadlo mě žádný jiný framework, který by udělal tuhle práci lépe než Angular</w:t>
+      </w:r>
+      <w:r>
+        <w:t xml:space="preserve"> od společnosti Google, který je přímo dělaný na vývoj těchto jednostránkových aplikací</w:t>
+      </w:r>
+      <w:r>
+        <w:t xml:space="preserve">. </w:t>
+      </w:r>
+      <w:r>
+        <w:t xml:space="preserve">Před datumem 21. 2. 2026 byla v projektu využita verze 20, ale díky </w:t>
+      </w:r>
+      <w:r>
+        <w:t xml:space="preserve">aktualizaci se v tomto dokumentu budeme bavit o </w:t>
+      </w:r>
+      <w:r>
+        <w:t xml:space="preserve">novější verzi </w:t>
+      </w:r>
+      <w:r>
+        <w:t>Angularu 21.2.0.</w:t>
+      </w:r>
+      <w:r>
+        <w:t xml:space="preserve"> Tento Framework obsahuje několik aspektů, které jsou </w:t>
+      </w:r>
+      <w:r>
+        <w:t>velice užitečné pro tento projekt.</w:t>
+      </w:r>
+    </w:p>
+    <w:p>
+      <w:pPr>
+        <w:pStyle w:val="Nadpis3"/>
+      </w:pPr>
       <w:r>
         <w:lastRenderedPageBreak/>
-        <w:t>Angula</w:t>
-      </w:r>
-      <w:r>
-        <w:t>r</w:t>
-      </w:r>
-      <w:bookmarkEnd w:id="30"/>
+        <w:t>TypeScript</w:t>
+      </w:r>
+    </w:p>
+    <w:p>
+      <w:r>
+        <w:t xml:space="preserve"> </w:t>
+      </w:r>
+      <w:r>
+        <w:t>Tento projekt je psaný v jazyce, který rozšiřuje Javascript o statické typování proměn a funkc</w:t>
+      </w:r>
+      <w:r>
+        <w:t>í. V rámci tohoto projektu jsou definovány rozhraní (Interfaces) pro objekty návyků pro zachycení případných chyb již během vývoje, zajišťuje konzistenci dat a výrazně zvyšuje čitelnost a udržitelnost projektového kódu.</w:t>
+      </w:r>
+    </w:p>
+    <w:p>
+      <w:pPr>
+        <w:pStyle w:val="Nadpis3"/>
+      </w:pPr>
+      <w:r>
+        <w:t>Komponentová architektura</w:t>
+      </w:r>
+    </w:p>
+    <w:p>
+      <w:r>
+        <w:t xml:space="preserve">Celý Habit Tracker jsem rozdělil na nezávislé a znovupoužitelné komponenty. Takto jsem učinil například pro seznam návyků, detailní zobrazení jednotlivých návyků a přepínací karty mezi dobrými a špatnými návyky. Užití komponentů velmi usnadňuje jak údržbu aplikace, tak i její případnou rozšiřitelnost v budoucnu, protože se nebude muset upravovat celá </w:t>
+      </w:r>
+      <w:r>
+        <w:t>struktura aplikace, ale jen ovlivněné komponenty.</w:t>
+      </w:r>
+    </w:p>
+    <w:p>
+      <w:pPr>
+        <w:pStyle w:val="Nadpis3"/>
+      </w:pPr>
+      <w:r>
+        <w:t>Services &amp; Dependency Injection</w:t>
+      </w:r>
+    </w:p>
+    <w:p>
+      <w:r>
+        <w:t xml:space="preserve">Pro správu logiky dat je v projektu </w:t>
+      </w:r>
+      <w:r>
+        <w:t>využívána</w:t>
+      </w:r>
+      <w:r>
+        <w:t xml:space="preserve"> tzv. DataService. Tato služba frameworku </w:t>
+      </w:r>
+      <w:r>
+        <w:t>zajišťuje komunikaci s lokálním uložištěm vašeho prohlížeče a poskytuje data všem komponentám napříč aplikací, které daná data vyžadují. Díky systému vkládání závislostí (</w:t>
+      </w:r>
+      <w:r>
+        <w:t xml:space="preserve">Dependency </w:t>
+      </w:r>
+      <w:r>
+        <w:t>Injection) je dosaženo čistého a přehledného rozdělení uživatelského rozhraní od samotné logiky Habit Trackeru.</w:t>
+      </w:r>
+    </w:p>
+    <w:p>
+      <w:pPr>
+        <w:pStyle w:val="Nadpis3"/>
+      </w:pPr>
+      <w:r>
+        <w:t>Angular CLI</w:t>
+      </w:r>
+    </w:p>
+    <w:p>
+      <w:r>
+        <w:t>Při vývoji bylo hodně využíváno rozhraní příkazového řádku, které framework Angular přináší s sebou do projektu. Toto rozhraní je využíváno například pro generaci nových komponent</w:t>
+      </w:r>
+      <w:r>
+        <w:t>, služeb a</w:t>
+      </w:r>
+      <w:r>
+        <w:t xml:space="preserve"> spouštění vývojového serveru v localhost. Angular Cli mi velmi urychlilo celý proces vytváření aplikace.</w:t>
+      </w:r>
     </w:p>
     <w:p>
       <w:pPr>
@@ -3164,11 +3281,70 @@
       <w:bookmarkEnd w:id="32"/>
     </w:p>
     <w:p>
+      <w:r>
+        <w:t>Pro co nejlepší zajištění profesionálního vzhledu a velmi vysoké úrovně uživatelské přívětivosti, používám v projektu integrovanou knihovnu Angular Material. Angular Material je oficiální sada komponent, které byly navrhnuty podle principu Material Designu od společnosti Google. Tento systém zajistí konzistenci z vizuální stránky napříč celým Habit Trackerem.</w:t>
+      </w:r>
+    </w:p>
+    <w:p>
+      <w:pPr>
+        <w:pStyle w:val="Nadpis3"/>
+      </w:pPr>
+      <w:r>
+        <w:t>Karty a panely</w:t>
+      </w:r>
+    </w:p>
+    <w:p>
+      <w:r>
+        <w:t xml:space="preserve">Komponenty MatCard a MatTabs jsou klíčové pro hlavní stránku, protože zajistí pořádnou strukturu. Slouží hlavně k přehlednému zobrazení jednotlivých </w:t>
+      </w:r>
+      <w:r>
+        <w:t>návyků</w:t>
+      </w:r>
+      <w:r>
+        <w:t xml:space="preserve"> a umožní požadované přepínání mezi návyky „dobrými“ a „špatnými“ ve formě 2 oddělených záložek.</w:t>
+      </w:r>
+    </w:p>
+    <w:p>
+      <w:pPr>
+        <w:pStyle w:val="Nadpis3"/>
+      </w:pPr>
+      <w:r>
+        <w:t>Formulářové prvky a ikony</w:t>
+      </w:r>
+    </w:p>
+    <w:p>
+      <w:r>
+        <w:t xml:space="preserve">Pro </w:t>
+      </w:r>
+      <w:r>
+        <w:t>zadání</w:t>
+      </w:r>
+      <w:r>
+        <w:t xml:space="preserve"> názvů </w:t>
+      </w:r>
+      <w:r>
+        <w:t>návyků</w:t>
+      </w:r>
+      <w:r>
+        <w:t xml:space="preserve"> a výběr barev byly využity optimalizované ovládací prvky MatFormField. Součástí Angular </w:t>
+      </w:r>
+      <w:r>
+        <w:t>Material</w:t>
+      </w:r>
+      <w:r>
+        <w:t xml:space="preserve"> je také systém ikon pomocí MatIcon komponenty, které jsem využil </w:t>
+      </w:r>
+      <w:r>
+        <w:t>pro vizuální odlišení jednotlivých návyků od sebe. Toto řešení pomáhá uživateli se lépe orientovat v uživatelském rozhraní Habit Trackeru.</w:t>
+      </w:r>
+    </w:p>
+    <w:p>
       <w:pPr>
         <w:pStyle w:val="Nadpis2"/>
       </w:pPr>
       <w:bookmarkStart w:id="33" w:name="_Toc223513772"/>
       <w:r>
+        <w:lastRenderedPageBreak/>
         <w:t>Sass CSS</w:t>
       </w:r>
       <w:r>
@@ -3183,14 +3359,102 @@
       <w:bookmarkEnd w:id="33"/>
     </w:p>
     <w:p>
-      <w:pPr>
-        <w:pStyle w:val="Nadpis2"/>
-        <w:numPr>
-          <w:ilvl w:val="0"/>
-          <w:numId w:val="0"/>
-        </w:numPr>
-        <w:ind w:left="1080"/>
-      </w:pPr>
+      <w:r>
+        <w:t xml:space="preserve">Původně byla tato podkapitola teoretické části zaměřena na technologii LESS (Leaner Style Sheets). V průběhu implementace knihovny Angular Material do projektu Habit Tracker </w:t>
+      </w:r>
+      <w:r>
+        <w:t>jsem se však rozhodl</w:t>
+      </w:r>
+      <w:r>
+        <w:t xml:space="preserve"> o přechodu na technologii SCSS. Vzhledem k tomu, že je Angular Material interně postaven právě na preprocesoru Sass, byla tato volba logickým krokem k zajištění plné technické kompatibility, maximální konzistence stylů a snazší přizpůsobitelnost grafických komponent napříč celým </w:t>
+      </w:r>
+      <w:r>
+        <w:t>Habit Trackem</w:t>
+      </w:r>
+      <w:r>
+        <w:t>. Bylo tak zajištěno, že v projektu je využíván pouze jeden jednotný stylovací systém.</w:t>
+      </w:r>
+      <w:r>
+        <w:t xml:space="preserve"> </w:t>
+      </w:r>
+      <w:r>
+        <w:t>Na rozdíl od standartního CSS nabízí SCSS pokročile programové funkce</w:t>
+      </w:r>
+      <w:r>
+        <w:t>, které</w:t>
+      </w:r>
+      <w:r>
+        <w:t xml:space="preserve"> zvyšují přehlednost</w:t>
+      </w:r>
+      <w:r>
+        <w:t xml:space="preserve"> grafického návrhu. Tento postup umožní efektivní předcházení redundanc</w:t>
+      </w:r>
+      <w:r>
+        <w:t>i (opakování) kódu, což je klíčové pro případné budoucí rozšiřitelnost Habit Trackeru.</w:t>
+      </w:r>
+    </w:p>
+    <w:p>
+      <w:pPr>
+        <w:pStyle w:val="Nadpis3"/>
+      </w:pPr>
+      <w:r>
+        <w:t>Variables</w:t>
+      </w:r>
+    </w:p>
+    <w:p>
+      <w:r>
+        <w:t>Tato funkce SCSS je využita pro definici centrální barevné palety a typografie uživatelského rozhraní. V souboru s globálními styly jsou definovány barvy pro pozitivní návyky (např.: zelená), negativní návyky (např.: červená) a hlavní barvy v celém uživatelském rozhraní. Díky této možnosti můžeme provést kompletní změnu barevného schématu pro celou aplikaci úpravou pouze jednoho jediného řádku v kódu.</w:t>
+      </w:r>
+    </w:p>
+    <w:p>
+      <w:pPr>
+        <w:pStyle w:val="Nadpis3"/>
+      </w:pPr>
+      <w:r>
+        <w:t>Nesting</w:t>
+      </w:r>
+    </w:p>
+    <w:p>
+      <w:r>
+        <w:t>Vnořování neboli Nesting je technika využita pro zachování hierarchické struktury stylů, která velmi věrně může kopírovat HTML strukturu každé z komponent v uživatelském prostředí. Tato technika slouží hlavně pro mnohonásobně lepší čitelnost kódu a snazší orientaci při ladění vzhledu konkrétních prvků, jako na příklad tlačítka v kartách jednotlivých návyků.</w:t>
+      </w:r>
+    </w:p>
+    <w:p>
+      <w:pPr>
+        <w:pStyle w:val="Nadpis3"/>
+      </w:pPr>
+      <w:r>
+        <w:t>Mixiny</w:t>
+      </w:r>
+    </w:p>
+    <w:p>
+      <w:r>
+        <w:t xml:space="preserve">Když se někde v kódu objevují opakování stejných vizuálních efektů a píšeme aplikaci s SCSS, pomohou v zabránění tohoto problému Mixiny. Šablony, které jsou implementované na místa, kde se tyto vizuální efekty </w:t>
+      </w:r>
+      <w:proofErr w:type="gramStart"/>
+      <w:r>
+        <w:t>objevují  V</w:t>
+      </w:r>
+      <w:proofErr w:type="gramEnd"/>
+      <w:r>
+        <w:t> Habit Trackeru tyto šablony aplikujeme po příkladě pro definici stínů karet s návyky (box-</w:t>
+      </w:r>
+      <w:proofErr w:type="spellStart"/>
+      <w:r>
+        <w:t>shadow</w:t>
+      </w:r>
+      <w:proofErr w:type="spellEnd"/>
+      <w:r>
+        <w:t xml:space="preserve">) nebo dále třeba pro nastavení responzivních bodů (media </w:t>
+      </w:r>
+      <w:proofErr w:type="spellStart"/>
+      <w:r>
+        <w:t>queries</w:t>
+      </w:r>
+      <w:proofErr w:type="spellEnd"/>
+      <w:r>
+        <w:t>). Tento způsob nám zajistí naprostou vizuální konzistenci napříč celým Habit Trackem bez žádné nutnosti vícenásobného kopírování stejných bloků kódu.</w:t>
+      </w:r>
       <w:r>
         <w:br w:type="page"/>
       </w:r>
@@ -3236,29 +3500,22 @@
         <w:t xml:space="preserve">Problémy </w:t>
       </w:r>
       <w:r>
-        <w:t>při vývoji</w:t>
+        <w:t xml:space="preserve">při </w:t>
       </w:r>
       <w:bookmarkEnd w:id="36"/>
+      <w:r>
+        <w:t>přípravě</w:t>
+      </w:r>
     </w:p>
     <w:p>
       <w:pPr>
         <w:pStyle w:val="Nadpis2"/>
       </w:pPr>
-      <w:bookmarkStart w:id="37" w:name="_Toc223513776"/>
-      <w:r>
-        <w:t>Občasné využití AI</w:t>
+      <w:bookmarkStart w:id="37" w:name="_Toc223513777"/>
+      <w:r>
+        <w:t>Zkušenosti nabrané z této práce</w:t>
       </w:r>
       <w:bookmarkEnd w:id="37"/>
-    </w:p>
-    <w:p>
-      <w:pPr>
-        <w:pStyle w:val="Nadpis2"/>
-      </w:pPr>
-      <w:bookmarkStart w:id="38" w:name="_Toc223513777"/>
-      <w:r>
-        <w:t>Zkušenosti nabrané z této práce</w:t>
-      </w:r>
-      <w:bookmarkEnd w:id="38"/>
     </w:p>
     <w:p>
       <w:pPr>
@@ -3278,12 +3535,12 @@
         </w:numPr>
         <w:ind w:left="720"/>
       </w:pPr>
-      <w:bookmarkStart w:id="39" w:name="_Toc223513778"/>
+      <w:bookmarkStart w:id="38" w:name="_Toc223513778"/>
       <w:r>
         <w:lastRenderedPageBreak/>
         <w:t>Závěr</w:t>
       </w:r>
-      <w:bookmarkEnd w:id="39"/>
+      <w:bookmarkEnd w:id="38"/>
       <w:r>
         <w:br w:type="page"/>
       </w:r>
@@ -3297,14 +3554,14 @@
         </w:numPr>
         <w:ind w:left="720"/>
       </w:pPr>
-      <w:bookmarkStart w:id="40" w:name="_Toc222315302"/>
-      <w:bookmarkStart w:id="41" w:name="_Toc223513779"/>
+      <w:bookmarkStart w:id="39" w:name="_Toc222315302"/>
+      <w:bookmarkStart w:id="40" w:name="_Toc223513779"/>
       <w:r>
         <w:lastRenderedPageBreak/>
         <w:t>Použitá literatura</w:t>
       </w:r>
+      <w:bookmarkEnd w:id="39"/>
       <w:bookmarkEnd w:id="40"/>
-      <w:bookmarkEnd w:id="41"/>
     </w:p>
     <w:p>
       <w:pPr>
@@ -3348,14 +3605,14 @@
         </w:numPr>
         <w:ind w:left="720"/>
       </w:pPr>
-      <w:bookmarkStart w:id="42" w:name="_Toc222315303"/>
-      <w:bookmarkStart w:id="43" w:name="_Toc223513780"/>
+      <w:bookmarkStart w:id="41" w:name="_Toc222315303"/>
+      <w:bookmarkStart w:id="42" w:name="_Toc223513780"/>
       <w:r>
         <w:lastRenderedPageBreak/>
         <w:t>Seznam obrázků</w:t>
       </w:r>
+      <w:bookmarkEnd w:id="41"/>
       <w:bookmarkEnd w:id="42"/>
-      <w:bookmarkEnd w:id="43"/>
     </w:p>
     <w:p>
       <w:pPr>
@@ -3375,14 +3632,14 @@
         </w:numPr>
         <w:ind w:left="720"/>
       </w:pPr>
-      <w:bookmarkStart w:id="44" w:name="_Toc222315304"/>
-      <w:bookmarkStart w:id="45" w:name="_Toc223513781"/>
+      <w:bookmarkStart w:id="43" w:name="_Toc222315304"/>
+      <w:bookmarkStart w:id="44" w:name="_Toc223513781"/>
       <w:r>
         <w:lastRenderedPageBreak/>
         <w:t>Seznam tabulek</w:t>
       </w:r>
+      <w:bookmarkEnd w:id="43"/>
       <w:bookmarkEnd w:id="44"/>
-      <w:bookmarkEnd w:id="45"/>
     </w:p>
     <w:p>
       <w:pPr>
@@ -3402,14 +3659,14 @@
         </w:numPr>
         <w:ind w:left="720"/>
       </w:pPr>
-      <w:bookmarkStart w:id="46" w:name="_Toc222315305"/>
-      <w:bookmarkStart w:id="47" w:name="_Toc223513782"/>
+      <w:bookmarkStart w:id="45" w:name="_Toc222315305"/>
+      <w:bookmarkStart w:id="46" w:name="_Toc223513782"/>
       <w:r>
         <w:lastRenderedPageBreak/>
         <w:t>Seznam příloh</w:t>
       </w:r>
+      <w:bookmarkEnd w:id="45"/>
       <w:bookmarkEnd w:id="46"/>
-      <w:bookmarkEnd w:id="47"/>
     </w:p>
     <w:p>
       <w:r>
@@ -3461,14 +3718,14 @@
         </w:numPr>
         <w:ind w:left="720"/>
       </w:pPr>
-      <w:bookmarkStart w:id="48" w:name="_Toc222315306"/>
-      <w:bookmarkStart w:id="49" w:name="_Toc223513783"/>
+      <w:bookmarkStart w:id="47" w:name="_Toc222315306"/>
+      <w:bookmarkStart w:id="48" w:name="_Toc223513783"/>
       <w:r>
         <w:lastRenderedPageBreak/>
         <w:t>Přílohy</w:t>
       </w:r>
+      <w:bookmarkEnd w:id="47"/>
       <w:bookmarkEnd w:id="48"/>
-      <w:bookmarkEnd w:id="49"/>
     </w:p>
     <w:p>
       <w:r>
@@ -4128,13 +4385,21 @@
       <w:ptab w:relativeTo="margin" w:alignment="right" w:leader="none"/>
     </w:r>
     <w:r>
-      <w:t>3.E</w:t>
+      <w:t>3.</w:t>
+    </w:r>
+    <w:proofErr w:type="gramStart"/>
+    <w:r>
+      <w:t>E</w:t>
     </w:r>
     <w:r>
       <w:t xml:space="preserve"> – </w:t>
     </w:r>
     <w:r>
-      <w:t>2025/2026</w:t>
+      <w:t>2025</w:t>
+    </w:r>
+    <w:proofErr w:type="gramEnd"/>
+    <w:r>
+      <w:t>/2026</w:t>
     </w:r>
   </w:p>
 </w:hdr>
@@ -6753,7 +7018,6 @@
   <w:style w:type="character" w:default="1" w:styleId="Standardnpsmoodstavce">
     <w:name w:val="Default Paragraph Font"/>
     <w:uiPriority w:val="1"/>
-    <w:semiHidden/>
     <w:unhideWhenUsed/>
   </w:style>
   <w:style w:type="table" w:default="1" w:styleId="Normlntabulka">
@@ -7322,6 +7586,20 @@
       <w:shd w:val="clear" w:color="auto" w:fill="E1DFDD"/>
     </w:rPr>
   </w:style>
+  <w:style w:type="paragraph" w:styleId="Bezmezer">
+    <w:name w:val="No Spacing"/>
+    <w:uiPriority w:val="1"/>
+    <w:qFormat/>
+    <w:rsid w:val="001748ED"/>
+    <w:pPr>
+      <w:spacing w:after="0" w:line="240" w:lineRule="auto"/>
+      <w:jc w:val="both"/>
+    </w:pPr>
+    <w:rPr>
+      <w:rFonts w:ascii="Calibri" w:hAnsi="Calibri"/>
+      <w:sz w:val="22"/>
+    </w:rPr>
+  </w:style>
 </w:styles>
 </file>
 

</xml_diff>

<commit_message>
feat: update app layout and styling for improved UI consistency and responsiveness + start writing practical part of Word docs
</commit_message>
<xml_diff>
--- a/Barta_rocnikova_prace.docx
+++ b/Barta_rocnikova_prace.docx
@@ -281,44 +281,7 @@
     </w:p>
     <w:p>
       <w:pPr>
-        <w:ind w:left="1416" w:firstLine="708"/>
-        <w:rPr>
-          <w:b/>
-          <w:bCs/>
-          <w:sz w:val="26"/>
-          <w:szCs w:val="26"/>
-        </w:rPr>
-      </w:pPr>
-      <w:r>
-        <w:rPr>
-          <w:sz w:val="26"/>
-          <w:szCs w:val="26"/>
-        </w:rPr>
-        <w:t>Oponent práce:</w:t>
-      </w:r>
-      <w:r>
-        <w:rPr>
-          <w:b/>
-          <w:bCs/>
-          <w:sz w:val="26"/>
-          <w:szCs w:val="26"/>
-        </w:rPr>
-        <w:t xml:space="preserve"> </w:t>
-      </w:r>
-      <w:r>
-        <w:rPr>
-          <w:b/>
-          <w:bCs/>
-          <w:sz w:val="26"/>
-          <w:szCs w:val="26"/>
-        </w:rPr>
-        <w:br w:type="page"/>
-      </w:r>
-    </w:p>
-    <w:p>
-      <w:pPr>
-        <w:spacing w:after="0"/>
-        <w:ind w:right="10466"/>
+        <w:ind w:left="2832" w:firstLine="708"/>
         <w:rPr>
           <w:b/>
           <w:bCs/>
@@ -335,6 +298,31 @@
           <w:docGrid w:linePitch="360"/>
         </w:sectPr>
       </w:pPr>
+      <w:r>
+        <w:rPr>
+          <w:sz w:val="26"/>
+          <w:szCs w:val="26"/>
+        </w:rPr>
+        <w:t>Oponent práce:</w:t>
+      </w:r>
+      <w:r>
+        <w:rPr>
+          <w:b/>
+          <w:bCs/>
+          <w:sz w:val="26"/>
+          <w:szCs w:val="26"/>
+        </w:rPr>
+        <w:t xml:space="preserve"> </w:t>
+      </w:r>
+      <w:r>
+        <w:rPr>
+          <w:b/>
+          <w:bCs/>
+          <w:sz w:val="26"/>
+          <w:szCs w:val="26"/>
+        </w:rPr>
+        <w:t>Pavel Pácl</w:t>
+      </w:r>
     </w:p>
     <w:p>
       <w:pPr>
@@ -2924,7 +2912,13 @@
     </w:p>
     <w:p>
       <w:r>
-        <w:t>Cíl této ročníkové práce je navrhnutí a realizování webové aplikace se jménem „Habit Tracker“. Tento co nejvíce moderní nástroj je koncipován jako digitální asistent a notýsek, který uživateli dá možnost</w:t>
+        <w:t>Cíl této ročníkové práce je navrhnutí a realizování webové aplikace se jménem „</w:t>
+      </w:r>
+      <w:r>
+        <w:t>Habit-Tracker</w:t>
+      </w:r>
+      <w:r>
+        <w:t>“. Tento co nejvíce moderní nástroj je koncipován jako digitální asistent a notýsek, který uživateli dá možnost</w:t>
       </w:r>
       <w:r>
         <w:t xml:space="preserve"> monitorování jeho pokroku v reálném čase. Na rozdíl od běžných seznamů úkolů se tato aplikace snaží zaměřovat co nejvíce na dlouhodobou udržitelnost a vizualizaci úspěchů, což velmi výrazně přispěje k udržitelnosti vnitřní motivace uživatele</w:t>
@@ -2949,7 +2943,13 @@
         <w:t xml:space="preserve"> na teoretickou část, kde jsou představeny jednotlivé technologie a nástroje, které pro tento projekt byly použity. Mezi tyto technologie řadím vývojové prostředí Visual Studio Code, framework pro webové aplikace Angular včetně pomocné knihovny Angular Material a stylovací jazyk</w:t>
       </w:r>
       <w:r>
-        <w:t xml:space="preserve"> SCSS. V druhé části se už zaměřuji na praktickou část, kde se s co největší podrobností zabývá samotnou implementací a vývojem Habit Tracker aplikace, architekturou jednotlivých komponent a logikou ukládání dat pro uživatele. </w:t>
+        <w:t xml:space="preserve"> SCSS. V druhé části se už zaměřuji na praktickou část, kde se s co největší podrobností zabývá samotnou implementací a vývojem </w:t>
+      </w:r>
+      <w:r>
+        <w:t>Habit-Tracker</w:t>
+      </w:r>
+      <w:r>
+        <w:t xml:space="preserve"> aplikace, architekturou jednotlivých komponent a logikou ukládání dat pro uživatele. </w:t>
       </w:r>
     </w:p>
     <w:p>
@@ -2977,7 +2977,13 @@
     </w:p>
     <w:p>
       <w:r>
-        <w:t>V této části dokumentu bych vás (čtenáře) chtěl seznámit s nejpodstatnějšími částmi softwaru, programovacího jazyku atp., které byly využity pro vývoj a samostatné vytvoření Habit Tracker aplikace</w:t>
+        <w:t xml:space="preserve">V této části dokumentu bych vás (čtenáře) chtěl seznámit s nejpodstatnějšími částmi softwaru, programovacího jazyku atp., které byly využity pro vývoj a samostatné vytvoření </w:t>
+      </w:r>
+      <w:r>
+        <w:t>Habit-Tracker</w:t>
+      </w:r>
+      <w:r>
+        <w:t xml:space="preserve"> aplikace</w:t>
       </w:r>
     </w:p>
     <w:p>
@@ -3078,7 +3084,13 @@
         <w:t>Angular</w:t>
       </w:r>
       <w:r>
-        <w:t>, který používám pro vývoj Habit Trackeru</w:t>
+        <w:t xml:space="preserve">, který používám pro vývoj </w:t>
+      </w:r>
+      <w:r>
+        <w:t>Habit-Tracker</w:t>
+      </w:r>
+      <w:r>
+        <w:t>u</w:t>
       </w:r>
       <w:r>
         <w:t>,</w:t>
@@ -3140,7 +3152,10 @@
         <w:t>v jednoduše pochopitelném uživatelském rozhraní</w:t>
       </w:r>
       <w:r>
-        <w:t xml:space="preserve">. Tuto možnost jsem využil pro postupné commitování změn tohoto projektu, což mi pomohlo také ve psaní praktické části tohoto dokumentu. </w:t>
+        <w:t>. Tuto možnost jsem využil pro postupné commitování změn tohoto projektu</w:t>
+      </w:r>
+      <w:r>
+        <w:t xml:space="preserve"> pro případ, že by se ve vývoji nové verze pokazila nad možnost opravy.</w:t>
       </w:r>
     </w:p>
     <w:p>
@@ -3217,7 +3232,13 @@
     </w:p>
     <w:p>
       <w:r>
-        <w:t xml:space="preserve">Celý Habit Tracker jsem rozdělil na nezávislé a znovupoužitelné komponenty. Takto jsem učinil například pro seznam návyků, detailní zobrazení jednotlivých návyků a přepínací karty mezi dobrými a špatnými návyky. Užití komponentů velmi usnadňuje jak údržbu aplikace, tak i její případnou rozšiřitelnost v budoucnu, protože se nebude muset upravovat celá </w:t>
+        <w:t xml:space="preserve">Celý </w:t>
+      </w:r>
+      <w:r>
+        <w:t>Habit-Tracker</w:t>
+      </w:r>
+      <w:r>
+        <w:t xml:space="preserve"> jsem rozdělil na nezávislé a znovupoužitelné komponenty. Takto jsem učinil například pro seznam návyků, detailní zobrazení jednotlivých návyků a přepínací karty mezi dobrými a špatnými návyky. Užití komponentů velmi usnadňuje jak údržbu aplikace, tak i její případnou rozšiřitelnost v budoucnu, protože se nebude muset upravovat celá </w:t>
       </w:r>
       <w:r>
         <w:t>struktura aplikace, ale jen ovlivněné komponenty.</w:t>
@@ -3233,22 +3254,16 @@
     </w:p>
     <w:p>
       <w:r>
-        <w:t xml:space="preserve">Pro správu logiky dat je v projektu </w:t>
-      </w:r>
-      <w:r>
-        <w:t>využívána</w:t>
-      </w:r>
-      <w:r>
-        <w:t xml:space="preserve"> tzv. DataService. Tato služba frameworku </w:t>
-      </w:r>
-      <w:r>
-        <w:t>zajišťuje komunikaci s lokálním uložištěm vašeho prohlížeče a poskytuje data všem komponentám napříč aplikací, které daná data vyžadují. Díky systému vkládání závislostí (</w:t>
-      </w:r>
-      <w:r>
-        <w:t xml:space="preserve">Dependency </w:t>
-      </w:r>
-      <w:r>
-        <w:t>Injection) je dosaženo čistého a přehledného rozdělení uživatelského rozhraní od samotné logiky Habit Trackeru.</w:t>
+        <w:t xml:space="preserve">Pro správu logiky dat je v projektu využívána tzv. DataService. Tato služba frameworku </w:t>
+      </w:r>
+      <w:r>
+        <w:t xml:space="preserve">zajišťuje komunikaci s lokálním uložištěm vašeho prohlížeče a poskytuje data všem komponentám napříč aplikací, které daná data vyžadují. Díky systému vkládání závislostí (Dependency Injection) je dosaženo čistého a přehledného rozdělení uživatelského rozhraní od samotné logiky </w:t>
+      </w:r>
+      <w:r>
+        <w:t>Habit-Tracker</w:t>
+      </w:r>
+      <w:r>
+        <w:t>u.</w:t>
       </w:r>
     </w:p>
     <w:p>
@@ -3282,7 +3297,21 @@
     </w:p>
     <w:p>
       <w:r>
-        <w:t>Pro co nejlepší zajištění profesionálního vzhledu a velmi vysoké úrovně uživatelské přívětivosti, používám v projektu integrovanou knihovnu Angular Material. Angular Material je oficiální sada komponent, které byly navrhnuty podle principu Material Designu od společnosti Google. Tento systém zajistí konzistenci z vizuální stránky napříč celým Habit Trackerem.</w:t>
+        <w:t xml:space="preserve">Pro co nejlepší zajištění profesionálního vzhledu a velmi vysoké úrovně uživatelské přívětivosti, používám v projektu integrovanou knihovnu Angular Material. Angular Material je oficiální sada komponent, které byly navrhnuty podle principu Material Designu od společnosti Google. Tento systém zajistí konzistenci z vizuální stránky napříč celým </w:t>
+      </w:r>
+      <w:r>
+        <w:t>Habit-</w:t>
+      </w:r>
+      <w:proofErr w:type="spellStart"/>
+      <w:r>
+        <w:t>Tracker</w:t>
+      </w:r>
+      <w:r>
+        <w:t>em</w:t>
+      </w:r>
+      <w:proofErr w:type="spellEnd"/>
+      <w:r>
+        <w:t>.</w:t>
       </w:r>
     </w:p>
     <w:p>
@@ -3335,7 +3364,13 @@
         <w:t xml:space="preserve"> je také systém ikon pomocí MatIcon komponenty, které jsem využil </w:t>
       </w:r>
       <w:r>
-        <w:t>pro vizuální odlišení jednotlivých návyků od sebe. Toto řešení pomáhá uživateli se lépe orientovat v uživatelském rozhraní Habit Trackeru.</w:t>
+        <w:t xml:space="preserve">pro vizuální odlišení jednotlivých návyků od sebe. Toto řešení pomáhá uživateli se lépe orientovat v uživatelském rozhraní </w:t>
+      </w:r>
+      <w:r>
+        <w:t>Habit-Tracker</w:t>
+      </w:r>
+      <w:r>
+        <w:t>u.</w:t>
       </w:r>
     </w:p>
     <w:p>
@@ -3360,7 +3395,13 @@
     </w:p>
     <w:p>
       <w:r>
-        <w:t xml:space="preserve">Původně byla tato podkapitola teoretické části zaměřena na technologii LESS (Leaner Style Sheets). V průběhu implementace knihovny Angular Material do projektu Habit Tracker </w:t>
+        <w:t xml:space="preserve">Původně byla tato podkapitola teoretické části zaměřena na technologii LESS (Leaner Style Sheets). V průběhu implementace knihovny Angular Material do projektu </w:t>
+      </w:r>
+      <w:r>
+        <w:t>Habit-Tracker</w:t>
+      </w:r>
+      <w:r>
+        <w:t xml:space="preserve"> </w:t>
       </w:r>
       <w:r>
         <w:t>jsem se však rozhodl</w:t>
@@ -3372,10 +3413,7 @@
         <w:t>Habit Trackem</w:t>
       </w:r>
       <w:r>
-        <w:t>. Bylo tak zajištěno, že v projektu je využíván pouze jeden jednotný stylovací systém.</w:t>
-      </w:r>
-      <w:r>
-        <w:t xml:space="preserve"> </w:t>
+        <w:t xml:space="preserve">. Bylo tak zajištěno, že v projektu je využíván pouze jeden jednotný stylovací systém. </w:t>
       </w:r>
       <w:r>
         <w:t>Na rozdíl od standartního CSS nabízí SCSS pokročile programové funkce</w:t>
@@ -3390,7 +3428,13 @@
         <w:t xml:space="preserve"> grafického návrhu. Tento postup umožní efektivní předcházení redundanc</w:t>
       </w:r>
       <w:r>
-        <w:t>i (opakování) kódu, což je klíčové pro případné budoucí rozšiřitelnost Habit Trackeru.</w:t>
+        <w:t xml:space="preserve">i (opakování) kódu, což je klíčové pro případné budoucí rozšiřitelnost </w:t>
+      </w:r>
+      <w:r>
+        <w:t>Habit-Tracker</w:t>
+      </w:r>
+      <w:r>
+        <w:t>u.</w:t>
       </w:r>
     </w:p>
     <w:p>
@@ -3437,7 +3481,13 @@
       </w:r>
       <w:proofErr w:type="gramEnd"/>
       <w:r>
-        <w:t> Habit Trackeru tyto šablony aplikujeme po příkladě pro definici stínů karet s návyky (box-</w:t>
+        <w:t> </w:t>
+      </w:r>
+      <w:r>
+        <w:t>Habit-Tracker</w:t>
+      </w:r>
+      <w:r>
+        <w:t>u tyto šablony aplikujeme po příkladě pro definici stínů karet s návyky (box-</w:t>
       </w:r>
       <w:proofErr w:type="spellStart"/>
       <w:r>
@@ -3474,6 +3524,20 @@
       <w:bookmarkEnd w:id="34"/>
     </w:p>
     <w:p>
+      <w:r>
+        <w:t>Když jsme si teď prošli základy nástrojů a Angular knihoven, je nejlepší čas se podívat na to, jak přesně jsem s těmito vymoženostmi pracoval</w:t>
+      </w:r>
+      <w:r>
+        <w:t xml:space="preserve"> při vytvářeních jednotlivých částí mého </w:t>
+      </w:r>
+      <w:r>
+        <w:t>Habit-Tracker</w:t>
+      </w:r>
+      <w:r>
+        <w:t>u.</w:t>
+      </w:r>
+    </w:p>
+    <w:p>
       <w:pPr>
         <w:pStyle w:val="Nadpis2"/>
       </w:pPr>
@@ -3481,41 +3545,84 @@
       <w:r>
         <w:t xml:space="preserve">Příprava </w:t>
       </w:r>
-      <w:proofErr w:type="gramStart"/>
-      <w:r>
-        <w:t xml:space="preserve">na </w:t>
-      </w:r>
-      <w:r>
-        <w:t xml:space="preserve"> vývoj</w:t>
-      </w:r>
       <w:bookmarkEnd w:id="35"/>
-      <w:proofErr w:type="gramEnd"/>
+      <w:r>
+        <w:t>repositáře</w:t>
+      </w:r>
     </w:p>
     <w:p>
       <w:pPr>
         <w:pStyle w:val="Nadpis2"/>
       </w:pPr>
-      <w:bookmarkStart w:id="36" w:name="_Toc223513775"/>
-      <w:r>
-        <w:t xml:space="preserve">Problémy </w:t>
-      </w:r>
-      <w:r>
-        <w:t xml:space="preserve">při </w:t>
+      <w:r>
+        <w:t>První kroky před vývojem</w:t>
+      </w:r>
+    </w:p>
+    <w:p>
+      <w:pPr>
+        <w:pStyle w:val="Nadpis2"/>
+      </w:pPr>
+      <w:r>
+        <w:t>Modelovaní dat a služby</w:t>
+      </w:r>
+    </w:p>
+    <w:p>
+      <w:pPr>
+        <w:pStyle w:val="Nadpis2"/>
+      </w:pPr>
+      <w:r>
+        <w:t>Hlavní UI a navigace</w:t>
+      </w:r>
+    </w:p>
+    <w:p>
+      <w:pPr>
+        <w:pStyle w:val="Nadpis2"/>
+      </w:pPr>
+      <w:r>
+        <w:t>Formulář pro vytváření nových návyků</w:t>
+      </w:r>
+    </w:p>
+    <w:p>
+      <w:pPr>
+        <w:pStyle w:val="Nadpis2"/>
+      </w:pPr>
+      <w:r>
+        <w:t>Seznamy návyků</w:t>
+      </w:r>
+    </w:p>
+    <w:p>
+      <w:pPr>
+        <w:pStyle w:val="Nadpis2"/>
+      </w:pPr>
+      <w:r>
+        <w:t>Vizualizace plnění návyku</w:t>
+      </w:r>
+    </w:p>
+    <w:p>
+      <w:pPr>
+        <w:pStyle w:val="Nadpis2"/>
+      </w:pPr>
+      <w:r>
+        <w:t>Styling a responzivita aplikace</w:t>
+      </w:r>
+    </w:p>
+    <w:p>
+      <w:pPr>
+        <w:pStyle w:val="Nadpis2"/>
+      </w:pPr>
+      <w:r>
+        <w:t>Optimalizace</w:t>
+      </w:r>
+    </w:p>
+    <w:p>
+      <w:pPr>
+        <w:pStyle w:val="Nadpis2"/>
+      </w:pPr>
+      <w:bookmarkStart w:id="36" w:name="_Toc223513777"/>
+      <w:r>
+        <w:t>Zkušenosti nabrané z této práce</w:t>
       </w:r>
       <w:bookmarkEnd w:id="36"/>
-      <w:r>
-        <w:t>přípravě</w:t>
-      </w:r>
-    </w:p>
-    <w:p>
-      <w:pPr>
-        <w:pStyle w:val="Nadpis2"/>
-      </w:pPr>
-      <w:bookmarkStart w:id="37" w:name="_Toc223513777"/>
-      <w:r>
-        <w:t>Zkušenosti nabrané z této práce</w:t>
-      </w:r>
-      <w:bookmarkEnd w:id="37"/>
     </w:p>
     <w:p>
       <w:pPr>
@@ -3535,12 +3642,12 @@
         </w:numPr>
         <w:ind w:left="720"/>
       </w:pPr>
-      <w:bookmarkStart w:id="38" w:name="_Toc223513778"/>
+      <w:bookmarkStart w:id="37" w:name="_Toc223513778"/>
       <w:r>
         <w:lastRenderedPageBreak/>
         <w:t>Závěr</w:t>
       </w:r>
-      <w:bookmarkEnd w:id="38"/>
+      <w:bookmarkEnd w:id="37"/>
       <w:r>
         <w:br w:type="page"/>
       </w:r>
@@ -3554,14 +3661,14 @@
         </w:numPr>
         <w:ind w:left="720"/>
       </w:pPr>
-      <w:bookmarkStart w:id="39" w:name="_Toc222315302"/>
-      <w:bookmarkStart w:id="40" w:name="_Toc223513779"/>
+      <w:bookmarkStart w:id="38" w:name="_Toc222315302"/>
+      <w:bookmarkStart w:id="39" w:name="_Toc223513779"/>
       <w:r>
         <w:lastRenderedPageBreak/>
         <w:t>Použitá literatura</w:t>
       </w:r>
+      <w:bookmarkEnd w:id="38"/>
       <w:bookmarkEnd w:id="39"/>
-      <w:bookmarkEnd w:id="40"/>
     </w:p>
     <w:p>
       <w:pPr>
@@ -3605,14 +3712,14 @@
         </w:numPr>
         <w:ind w:left="720"/>
       </w:pPr>
-      <w:bookmarkStart w:id="41" w:name="_Toc222315303"/>
-      <w:bookmarkStart w:id="42" w:name="_Toc223513780"/>
+      <w:bookmarkStart w:id="40" w:name="_Toc222315303"/>
+      <w:bookmarkStart w:id="41" w:name="_Toc223513780"/>
       <w:r>
         <w:lastRenderedPageBreak/>
         <w:t>Seznam obrázků</w:t>
       </w:r>
+      <w:bookmarkEnd w:id="40"/>
       <w:bookmarkEnd w:id="41"/>
-      <w:bookmarkEnd w:id="42"/>
     </w:p>
     <w:p>
       <w:pPr>
@@ -3632,14 +3739,14 @@
         </w:numPr>
         <w:ind w:left="720"/>
       </w:pPr>
-      <w:bookmarkStart w:id="43" w:name="_Toc222315304"/>
-      <w:bookmarkStart w:id="44" w:name="_Toc223513781"/>
+      <w:bookmarkStart w:id="42" w:name="_Toc222315304"/>
+      <w:bookmarkStart w:id="43" w:name="_Toc223513781"/>
       <w:r>
         <w:lastRenderedPageBreak/>
         <w:t>Seznam tabulek</w:t>
       </w:r>
+      <w:bookmarkEnd w:id="42"/>
       <w:bookmarkEnd w:id="43"/>
-      <w:bookmarkEnd w:id="44"/>
     </w:p>
     <w:p>
       <w:pPr>
@@ -3659,14 +3766,14 @@
         </w:numPr>
         <w:ind w:left="720"/>
       </w:pPr>
-      <w:bookmarkStart w:id="45" w:name="_Toc222315305"/>
-      <w:bookmarkStart w:id="46" w:name="_Toc223513782"/>
+      <w:bookmarkStart w:id="44" w:name="_Toc222315305"/>
+      <w:bookmarkStart w:id="45" w:name="_Toc223513782"/>
       <w:r>
         <w:lastRenderedPageBreak/>
         <w:t>Seznam příloh</w:t>
       </w:r>
+      <w:bookmarkEnd w:id="44"/>
       <w:bookmarkEnd w:id="45"/>
-      <w:bookmarkEnd w:id="46"/>
     </w:p>
     <w:p>
       <w:r>
@@ -3718,14 +3825,14 @@
         </w:numPr>
         <w:ind w:left="720"/>
       </w:pPr>
-      <w:bookmarkStart w:id="47" w:name="_Toc222315306"/>
-      <w:bookmarkStart w:id="48" w:name="_Toc223513783"/>
+      <w:bookmarkStart w:id="46" w:name="_Toc222315306"/>
+      <w:bookmarkStart w:id="47" w:name="_Toc223513783"/>
       <w:r>
         <w:lastRenderedPageBreak/>
         <w:t>Přílohy</w:t>
       </w:r>
+      <w:bookmarkEnd w:id="46"/>
       <w:bookmarkEnd w:id="47"/>
-      <w:bookmarkEnd w:id="48"/>
     </w:p>
     <w:p>
       <w:r>
@@ -7018,6 +7125,7 @@
   <w:style w:type="character" w:default="1" w:styleId="Standardnpsmoodstavce">
     <w:name w:val="Default Paragraph Font"/>
     <w:uiPriority w:val="1"/>
+    <w:semiHidden/>
     <w:unhideWhenUsed/>
   </w:style>
   <w:style w:type="table" w:default="1" w:styleId="Normlntabulka">
@@ -7899,10 +8007,26 @@
 </file>
 
 <file path=customXml/item1.xml><?xml version="1.0" encoding="utf-8"?>
-<b:Sources xmlns:b="http://schemas.openxmlformats.org/officeDocument/2006/bibliography" xmlns="http://schemas.openxmlformats.org/officeDocument/2006/bibliography" SelectedStyle="\APASixthEditionOfficeOnline.xsl" StyleName="APA" Version="6"/>
+<?mso-contentType ?>
+<FormTemplates xmlns="http://schemas.microsoft.com/sharepoint/v3/contenttype/forms">
+  <Display>DocumentLibraryForm</Display>
+  <Edit>DocumentLibraryForm</Edit>
+  <New>DocumentLibraryForm</New>
+</FormTemplates>
 </file>
 
 <file path=customXml/item2.xml><?xml version="1.0" encoding="utf-8"?>
+<p:properties xmlns:p="http://schemas.microsoft.com/office/2006/metadata/properties" xmlns:xsi="http://www.w3.org/2001/XMLSchema-instance" xmlns:pc="http://schemas.microsoft.com/office/infopath/2007/PartnerControls">
+  <documentManagement>
+    <TaxCatchAll xmlns="9069f8e3-06b5-4841-af59-bd496f6fbcdc" xsi:nil="true"/>
+    <lcf76f155ced4ddcb4097134ff3c332f xmlns="ac4d9f64-92e6-40df-bbe5-cbf691cfe8ae">
+      <Terms xmlns="http://schemas.microsoft.com/office/infopath/2007/PartnerControls"/>
+    </lcf76f155ced4ddcb4097134ff3c332f>
+  </documentManagement>
+</p:properties>
+</file>
+
+<file path=customXml/item3.xml><?xml version="1.0" encoding="utf-8"?>
 <ct:contentTypeSchema xmlns:ct="http://schemas.microsoft.com/office/2006/metadata/contentType" xmlns:ma="http://schemas.microsoft.com/office/2006/metadata/properties/metaAttributes" ct:_="" ma:_="" ma:contentTypeName="Dokument" ma:contentTypeID="0x0101007AC253A931DA3842A9467F19871E2C1B" ma:contentTypeVersion="10" ma:contentTypeDescription="Vytvoří nový dokument" ma:contentTypeScope="" ma:versionID="9dbcdc17d608927f05e31a50324249a7">
   <xsd:schema xmlns:xsd="http://www.w3.org/2001/XMLSchema" xmlns:xs="http://www.w3.org/2001/XMLSchema" xmlns:p="http://schemas.microsoft.com/office/2006/metadata/properties" xmlns:ns2="ac4d9f64-92e6-40df-bbe5-cbf691cfe8ae" xmlns:ns3="9069f8e3-06b5-4841-af59-bd496f6fbcdc" targetNamespace="http://schemas.microsoft.com/office/2006/metadata/properties" ma:root="true" ma:fieldsID="fb3d1d1e590abe5f5a4ef74e9b43408f" ns2:_="" ns3:_="">
     <xsd:import namespace="ac4d9f64-92e6-40df-bbe5-cbf691cfe8ae"/>
@@ -8091,35 +8215,30 @@
 </ct:contentTypeSchema>
 </file>
 
-<file path=customXml/item3.xml><?xml version="1.0" encoding="utf-8"?>
-<p:properties xmlns:p="http://schemas.microsoft.com/office/2006/metadata/properties" xmlns:xsi="http://www.w3.org/2001/XMLSchema-instance" xmlns:pc="http://schemas.microsoft.com/office/infopath/2007/PartnerControls">
-  <documentManagement>
-    <TaxCatchAll xmlns="9069f8e3-06b5-4841-af59-bd496f6fbcdc" xsi:nil="true"/>
-    <lcf76f155ced4ddcb4097134ff3c332f xmlns="ac4d9f64-92e6-40df-bbe5-cbf691cfe8ae">
-      <Terms xmlns="http://schemas.microsoft.com/office/infopath/2007/PartnerControls"/>
-    </lcf76f155ced4ddcb4097134ff3c332f>
-  </documentManagement>
-</p:properties>
-</file>
-
 <file path=customXml/item4.xml><?xml version="1.0" encoding="utf-8"?>
-<?mso-contentType ?>
-<FormTemplates xmlns="http://schemas.microsoft.com/sharepoint/v3/contenttype/forms">
-  <Display>DocumentLibraryForm</Display>
-  <Edit>DocumentLibraryForm</Edit>
-  <New>DocumentLibraryForm</New>
-</FormTemplates>
+<b:Sources xmlns:b="http://schemas.openxmlformats.org/officeDocument/2006/bibliography" xmlns="http://schemas.openxmlformats.org/officeDocument/2006/bibliography" SelectedStyle="\APASixthEditionOfficeOnline.xsl" StyleName="APA" Version="6"/>
 </file>
 
 <file path=customXml/itemProps1.xml><?xml version="1.0" encoding="utf-8"?>
-<ds:datastoreItem xmlns:ds="http://schemas.openxmlformats.org/officeDocument/2006/customXml" ds:itemID="{E0BB6427-4419-4C21-A0DF-4471F23995B6}">
+<ds:datastoreItem xmlns:ds="http://schemas.openxmlformats.org/officeDocument/2006/customXml" ds:itemID="{E8FDF9F9-0BC5-4BD9-96CC-E3BC62E19A62}">
   <ds:schemaRefs>
-    <ds:schemaRef ds:uri="http://schemas.openxmlformats.org/officeDocument/2006/bibliography"/>
+    <ds:schemaRef ds:uri="http://schemas.microsoft.com/sharepoint/v3/contenttype/forms"/>
   </ds:schemaRefs>
 </ds:datastoreItem>
 </file>
 
 <file path=customXml/itemProps2.xml><?xml version="1.0" encoding="utf-8"?>
+<ds:datastoreItem xmlns:ds="http://schemas.openxmlformats.org/officeDocument/2006/customXml" ds:itemID="{FB1D83C0-C8CC-4C35-B0E6-D4B15A08C6B5}">
+  <ds:schemaRefs>
+    <ds:schemaRef ds:uri="http://schemas.microsoft.com/office/2006/metadata/properties"/>
+    <ds:schemaRef ds:uri="http://schemas.microsoft.com/office/infopath/2007/PartnerControls"/>
+    <ds:schemaRef ds:uri="9069f8e3-06b5-4841-af59-bd496f6fbcdc"/>
+    <ds:schemaRef ds:uri="ac4d9f64-92e6-40df-bbe5-cbf691cfe8ae"/>
+  </ds:schemaRefs>
+</ds:datastoreItem>
+</file>
+
+<file path=customXml/itemProps3.xml><?xml version="1.0" encoding="utf-8"?>
 <ds:datastoreItem xmlns:ds="http://schemas.openxmlformats.org/officeDocument/2006/customXml" ds:itemID="{D5874249-D0BB-47A2-ADCE-DE87B2259BE8}">
   <ds:schemaRefs>
     <ds:schemaRef ds:uri="http://schemas.microsoft.com/office/2006/metadata/contentType"/>
@@ -8138,21 +8257,10 @@
 </ds:datastoreItem>
 </file>
 
-<file path=customXml/itemProps3.xml><?xml version="1.0" encoding="utf-8"?>
-<ds:datastoreItem xmlns:ds="http://schemas.openxmlformats.org/officeDocument/2006/customXml" ds:itemID="{FB1D83C0-C8CC-4C35-B0E6-D4B15A08C6B5}">
+<file path=customXml/itemProps4.xml><?xml version="1.0" encoding="utf-8"?>
+<ds:datastoreItem xmlns:ds="http://schemas.openxmlformats.org/officeDocument/2006/customXml" ds:itemID="{E0BB6427-4419-4C21-A0DF-4471F23995B6}">
   <ds:schemaRefs>
-    <ds:schemaRef ds:uri="http://schemas.microsoft.com/office/2006/metadata/properties"/>
-    <ds:schemaRef ds:uri="http://schemas.microsoft.com/office/infopath/2007/PartnerControls"/>
-    <ds:schemaRef ds:uri="9069f8e3-06b5-4841-af59-bd496f6fbcdc"/>
-    <ds:schemaRef ds:uri="ac4d9f64-92e6-40df-bbe5-cbf691cfe8ae"/>
-  </ds:schemaRefs>
-</ds:datastoreItem>
-</file>
-
-<file path=customXml/itemProps4.xml><?xml version="1.0" encoding="utf-8"?>
-<ds:datastoreItem xmlns:ds="http://schemas.openxmlformats.org/officeDocument/2006/customXml" ds:itemID="{E8FDF9F9-0BC5-4BD9-96CC-E3BC62E19A62}">
-  <ds:schemaRefs>
-    <ds:schemaRef ds:uri="http://schemas.microsoft.com/sharepoint/v3/contenttype/forms"/>
+    <ds:schemaRef ds:uri="http://schemas.openxmlformats.org/officeDocument/2006/bibliography"/>
   </ds:schemaRefs>
 </ds:datastoreItem>
 </file>
</xml_diff>

<commit_message>
feat: expand document structure with additional sections and improve content clarity (prepare practical part chapters names)
</commit_message>
<xml_diff>
--- a/Barta_rocnikova_prace.docx
+++ b/Barta_rocnikova_prace.docx
@@ -277,6 +277,42 @@
           <w:szCs w:val="26"/>
         </w:rPr>
         <w:t xml:space="preserve"> Martin Votýpka</w:t>
+      </w:r>
+    </w:p>
+    <w:p>
+      <w:pPr>
+        <w:ind w:left="2832" w:firstLine="708"/>
+        <w:rPr>
+          <w:b/>
+          <w:bCs/>
+          <w:sz w:val="26"/>
+          <w:szCs w:val="26"/>
+        </w:rPr>
+      </w:pPr>
+      <w:r>
+        <w:rPr>
+          <w:sz w:val="26"/>
+          <w:szCs w:val="26"/>
+        </w:rPr>
+        <w:t>Oponent práce:</w:t>
+      </w:r>
+      <w:r>
+        <w:rPr>
+          <w:b/>
+          <w:bCs/>
+          <w:sz w:val="26"/>
+          <w:szCs w:val="26"/>
+        </w:rPr>
+        <w:t xml:space="preserve"> </w:t>
+      </w:r>
+      <w:r>
+        <w:rPr>
+          <w:b/>
+          <w:bCs/>
+          <w:sz w:val="26"/>
+          <w:szCs w:val="26"/>
+        </w:rPr>
+        <w:t>Pavel Pácl</w:t>
       </w:r>
     </w:p>
     <w:p>
@@ -298,31 +334,6 @@
           <w:docGrid w:linePitch="360"/>
         </w:sectPr>
       </w:pPr>
-      <w:r>
-        <w:rPr>
-          <w:sz w:val="26"/>
-          <w:szCs w:val="26"/>
-        </w:rPr>
-        <w:t>Oponent práce:</w:t>
-      </w:r>
-      <w:r>
-        <w:rPr>
-          <w:b/>
-          <w:bCs/>
-          <w:sz w:val="26"/>
-          <w:szCs w:val="26"/>
-        </w:rPr>
-        <w:t xml:space="preserve"> </w:t>
-      </w:r>
-      <w:r>
-        <w:rPr>
-          <w:b/>
-          <w:bCs/>
-          <w:sz w:val="26"/>
-          <w:szCs w:val="26"/>
-        </w:rPr>
-        <w:t>Pavel Pácl</w:t>
-      </w:r>
     </w:p>
     <w:p>
       <w:pPr>
@@ -1347,6 +1358,8 @@
       <w:bookmarkStart w:id="4" w:name="_Toc216425782"/>
       <w:bookmarkStart w:id="5" w:name="_Toc222315287"/>
       <w:bookmarkStart w:id="6" w:name="_Toc223513762"/>
+      <w:bookmarkStart w:id="7" w:name="_Toc226550175"/>
+      <w:bookmarkStart w:id="8" w:name="_Toc226556217"/>
       <w:r>
         <w:lastRenderedPageBreak/>
         <w:t>Prohlášení</w:t>
@@ -1358,6 +1371,8 @@
       <w:bookmarkEnd w:id="4"/>
       <w:bookmarkEnd w:id="5"/>
       <w:bookmarkEnd w:id="6"/>
+      <w:bookmarkEnd w:id="7"/>
+      <w:bookmarkEnd w:id="8"/>
       <w:r>
         <w:t xml:space="preserve"> </w:t>
       </w:r>
@@ -1685,44 +1700,31 @@
         </w:numPr>
         <w:ind w:left="720"/>
       </w:pPr>
-      <w:bookmarkStart w:id="7" w:name="_Toc183979915"/>
-      <w:bookmarkStart w:id="8" w:name="_Toc216425625"/>
-      <w:bookmarkStart w:id="9" w:name="_Toc216425783"/>
-      <w:bookmarkStart w:id="10" w:name="_Toc222315288"/>
-      <w:bookmarkStart w:id="11" w:name="_Toc223513763"/>
+      <w:bookmarkStart w:id="9" w:name="_Toc183979916"/>
+      <w:bookmarkStart w:id="10" w:name="_Toc216425626"/>
+      <w:bookmarkStart w:id="11" w:name="_Toc216425784"/>
+      <w:bookmarkStart w:id="12" w:name="_Toc222315289"/>
+      <w:bookmarkStart w:id="13" w:name="_Toc223513764"/>
+      <w:bookmarkStart w:id="14" w:name="_Toc226550176"/>
+      <w:bookmarkStart w:id="15" w:name="_Toc226556218"/>
       <w:r>
         <w:lastRenderedPageBreak/>
-        <w:t>Poděkování</w:t>
-      </w:r>
-      <w:bookmarkEnd w:id="7"/>
-      <w:bookmarkEnd w:id="8"/>
+        <w:t>Anotace</w:t>
+      </w:r>
       <w:bookmarkEnd w:id="9"/>
       <w:bookmarkEnd w:id="10"/>
       <w:bookmarkEnd w:id="11"/>
-    </w:p>
-    <w:p>
-      <w:r>
-        <w:t>Pokud poděkování psát nebudete, stránku odstraňte</w:t>
-      </w:r>
+      <w:bookmarkEnd w:id="12"/>
+      <w:bookmarkEnd w:id="13"/>
+      <w:bookmarkEnd w:id="14"/>
+      <w:bookmarkEnd w:id="15"/>
     </w:p>
     <w:p>
       <w:pPr>
         <w:spacing w:after="160" w:line="278" w:lineRule="auto"/>
         <w:jc w:val="left"/>
-        <w:rPr>
-          <w:b/>
-          <w:bCs/>
-          <w:sz w:val="26"/>
-          <w:szCs w:val="26"/>
-        </w:rPr>
-      </w:pPr>
-      <w:r>
-        <w:rPr>
-          <w:b/>
-          <w:bCs/>
-          <w:sz w:val="26"/>
-          <w:szCs w:val="26"/>
-        </w:rPr>
+      </w:pPr>
+      <w:r>
         <w:br w:type="page"/>
       </w:r>
     </w:p>
@@ -1735,20 +1737,24 @@
         </w:numPr>
         <w:ind w:left="720"/>
       </w:pPr>
-      <w:bookmarkStart w:id="12" w:name="_Toc183979916"/>
-      <w:bookmarkStart w:id="13" w:name="_Toc216425626"/>
-      <w:bookmarkStart w:id="14" w:name="_Toc216425784"/>
-      <w:bookmarkStart w:id="15" w:name="_Toc222315289"/>
-      <w:bookmarkStart w:id="16" w:name="_Toc223513764"/>
+      <w:bookmarkStart w:id="16" w:name="_Toc183979917"/>
+      <w:bookmarkStart w:id="17" w:name="_Toc216425627"/>
+      <w:bookmarkStart w:id="18" w:name="_Toc216425785"/>
+      <w:bookmarkStart w:id="19" w:name="_Toc222315290"/>
+      <w:bookmarkStart w:id="20" w:name="_Toc223513765"/>
+      <w:bookmarkStart w:id="21" w:name="_Toc226550177"/>
+      <w:bookmarkStart w:id="22" w:name="_Toc226556219"/>
       <w:r>
         <w:lastRenderedPageBreak/>
-        <w:t>Anotace</w:t>
-      </w:r>
-      <w:bookmarkEnd w:id="12"/>
-      <w:bookmarkEnd w:id="13"/>
-      <w:bookmarkEnd w:id="14"/>
-      <w:bookmarkEnd w:id="15"/>
+        <w:t>Klíčová slova</w:t>
+      </w:r>
       <w:bookmarkEnd w:id="16"/>
+      <w:bookmarkEnd w:id="17"/>
+      <w:bookmarkEnd w:id="18"/>
+      <w:bookmarkEnd w:id="19"/>
+      <w:bookmarkEnd w:id="20"/>
+      <w:bookmarkEnd w:id="21"/>
+      <w:bookmarkEnd w:id="22"/>
     </w:p>
     <w:p>
       <w:pPr>
@@ -1768,53 +1774,24 @@
         </w:numPr>
         <w:ind w:left="720"/>
       </w:pPr>
-      <w:bookmarkStart w:id="17" w:name="_Toc183979917"/>
-      <w:bookmarkStart w:id="18" w:name="_Toc216425627"/>
-      <w:bookmarkStart w:id="19" w:name="_Toc216425785"/>
-      <w:bookmarkStart w:id="20" w:name="_Toc222315290"/>
-      <w:bookmarkStart w:id="21" w:name="_Toc223513765"/>
-      <w:r>
-        <w:lastRenderedPageBreak/>
-        <w:t>Klíčová slova</w:t>
-      </w:r>
-      <w:bookmarkEnd w:id="17"/>
-      <w:bookmarkEnd w:id="18"/>
-      <w:bookmarkEnd w:id="19"/>
-      <w:bookmarkEnd w:id="20"/>
-      <w:bookmarkEnd w:id="21"/>
-    </w:p>
-    <w:p>
-      <w:pPr>
-        <w:spacing w:after="160" w:line="278" w:lineRule="auto"/>
-        <w:jc w:val="left"/>
-      </w:pPr>
-      <w:r>
-        <w:br w:type="page"/>
-      </w:r>
-    </w:p>
-    <w:p>
-      <w:pPr>
-        <w:pStyle w:val="Nadpis1"/>
-        <w:numPr>
-          <w:ilvl w:val="0"/>
-          <w:numId w:val="0"/>
-        </w:numPr>
-        <w:ind w:left="720"/>
-      </w:pPr>
-      <w:bookmarkStart w:id="22" w:name="_Toc183979918"/>
-      <w:bookmarkStart w:id="23" w:name="_Toc216425628"/>
-      <w:bookmarkStart w:id="24" w:name="_Toc216425786"/>
-      <w:bookmarkStart w:id="25" w:name="_Toc222315291"/>
-      <w:bookmarkStart w:id="26" w:name="_Toc223513766"/>
+      <w:bookmarkStart w:id="23" w:name="_Toc183979918"/>
+      <w:bookmarkStart w:id="24" w:name="_Toc216425628"/>
+      <w:bookmarkStart w:id="25" w:name="_Toc216425786"/>
+      <w:bookmarkStart w:id="26" w:name="_Toc222315291"/>
+      <w:bookmarkStart w:id="27" w:name="_Toc223513766"/>
+      <w:bookmarkStart w:id="28" w:name="_Toc226550178"/>
+      <w:bookmarkStart w:id="29" w:name="_Toc226556220"/>
       <w:r>
         <w:lastRenderedPageBreak/>
         <w:t>Obsah</w:t>
       </w:r>
-      <w:bookmarkEnd w:id="22"/>
       <w:bookmarkEnd w:id="23"/>
       <w:bookmarkEnd w:id="24"/>
       <w:bookmarkEnd w:id="25"/>
       <w:bookmarkEnd w:id="26"/>
+      <w:bookmarkEnd w:id="27"/>
+      <w:bookmarkEnd w:id="28"/>
+      <w:bookmarkEnd w:id="29"/>
     </w:p>
     <w:sdt>
       <w:sdtPr>
@@ -1853,7 +1830,7 @@
           <w:r>
             <w:fldChar w:fldCharType="separate"/>
           </w:r>
-          <w:hyperlink w:anchor="_Toc223513767" w:history="1">
+          <w:hyperlink w:anchor="_Toc226556221" w:history="1">
             <w:r>
               <w:rPr>
                 <w:rStyle w:val="Hypertextovodkaz"/>
@@ -1880,7 +1857,7 @@
                 <w:noProof/>
                 <w:webHidden/>
               </w:rPr>
-              <w:instrText xml:space="preserve"> PAGEREF _Toc223513767 \h </w:instrText>
+              <w:instrText xml:space="preserve"> PAGEREF _Toc226556221 \h </w:instrText>
             </w:r>
             <w:r>
               <w:rPr>
@@ -1915,7 +1892,7 @@
           <w:pPr>
             <w:pStyle w:val="Obsah1"/>
             <w:tabs>
-              <w:tab w:val="left" w:pos="480"/>
+              <w:tab w:val="left" w:pos="440"/>
               <w:tab w:val="right" w:leader="dot" w:pos="9628"/>
             </w:tabs>
             <w:rPr>
@@ -1925,7 +1902,7 @@
               <w:lang w:eastAsia="cs-CZ"/>
             </w:rPr>
           </w:pPr>
-          <w:hyperlink w:anchor="_Toc223513768" w:history="1">
+          <w:hyperlink w:anchor="_Toc226556222" w:history="1">
             <w:r>
               <w:rPr>
                 <w:rStyle w:val="Hypertextovodkaz"/>
@@ -1968,7 +1945,7 @@
                 <w:noProof/>
                 <w:webHidden/>
               </w:rPr>
-              <w:instrText xml:space="preserve"> PAGEREF _Toc223513768 \h </w:instrText>
+              <w:instrText xml:space="preserve"> PAGEREF _Toc226556222 \h </w:instrText>
             </w:r>
             <w:r>
               <w:rPr>
@@ -2013,7 +1990,7 @@
               <w:lang w:eastAsia="cs-CZ"/>
             </w:rPr>
           </w:pPr>
-          <w:hyperlink w:anchor="_Toc223513769" w:history="1">
+          <w:hyperlink w:anchor="_Toc226556223" w:history="1">
             <w:r>
               <w:rPr>
                 <w:rStyle w:val="Hypertextovodkaz"/>
@@ -2056,7 +2033,359 @@
                 <w:noProof/>
                 <w:webHidden/>
               </w:rPr>
-              <w:instrText xml:space="preserve"> PAGEREF _Toc223513769 \h </w:instrText>
+              <w:instrText xml:space="preserve"> PAGEREF _Toc226556223 \h </w:instrText>
+            </w:r>
+            <w:r>
+              <w:rPr>
+                <w:noProof/>
+                <w:webHidden/>
+              </w:rPr>
+            </w:r>
+            <w:r>
+              <w:rPr>
+                <w:noProof/>
+                <w:webHidden/>
+              </w:rPr>
+              <w:fldChar w:fldCharType="separate"/>
+            </w:r>
+            <w:r>
+              <w:rPr>
+                <w:noProof/>
+                <w:webHidden/>
+              </w:rPr>
+              <w:t>11</w:t>
+            </w:r>
+            <w:r>
+              <w:rPr>
+                <w:noProof/>
+                <w:webHidden/>
+              </w:rPr>
+              <w:fldChar w:fldCharType="end"/>
+            </w:r>
+          </w:hyperlink>
+        </w:p>
+        <w:p>
+          <w:pPr>
+            <w:pStyle w:val="Obsah3"/>
+            <w:tabs>
+              <w:tab w:val="left" w:pos="1200"/>
+              <w:tab w:val="right" w:leader="dot" w:pos="9628"/>
+            </w:tabs>
+            <w:rPr>
+              <w:rFonts w:asciiTheme="minorHAnsi" w:eastAsiaTheme="minorEastAsia" w:hAnsiTheme="minorHAnsi"/>
+              <w:noProof/>
+              <w:sz w:val="24"/>
+              <w:lang w:eastAsia="cs-CZ"/>
+            </w:rPr>
+          </w:pPr>
+          <w:hyperlink w:anchor="_Toc226556224" w:history="1">
+            <w:r>
+              <w:rPr>
+                <w:rStyle w:val="Hypertextovodkaz"/>
+                <w:noProof/>
+              </w:rPr>
+              <w:t>1.1.1.</w:t>
+            </w:r>
+            <w:r>
+              <w:rPr>
+                <w:rFonts w:asciiTheme="minorHAnsi" w:eastAsiaTheme="minorEastAsia" w:hAnsiTheme="minorHAnsi"/>
+                <w:noProof/>
+                <w:sz w:val="24"/>
+                <w:lang w:eastAsia="cs-CZ"/>
+              </w:rPr>
+              <w:tab/>
+            </w:r>
+            <w:r>
+              <w:rPr>
+                <w:rStyle w:val="Hypertextovodkaz"/>
+                <w:noProof/>
+              </w:rPr>
+              <w:t>Školní zkušenost</w:t>
+            </w:r>
+            <w:r>
+              <w:rPr>
+                <w:noProof/>
+                <w:webHidden/>
+              </w:rPr>
+              <w:tab/>
+            </w:r>
+            <w:r>
+              <w:rPr>
+                <w:noProof/>
+                <w:webHidden/>
+              </w:rPr>
+              <w:fldChar w:fldCharType="begin"/>
+            </w:r>
+            <w:r>
+              <w:rPr>
+                <w:noProof/>
+                <w:webHidden/>
+              </w:rPr>
+              <w:instrText xml:space="preserve"> PAGEREF _Toc226556224 \h </w:instrText>
+            </w:r>
+            <w:r>
+              <w:rPr>
+                <w:noProof/>
+                <w:webHidden/>
+              </w:rPr>
+            </w:r>
+            <w:r>
+              <w:rPr>
+                <w:noProof/>
+                <w:webHidden/>
+              </w:rPr>
+              <w:fldChar w:fldCharType="separate"/>
+            </w:r>
+            <w:r>
+              <w:rPr>
+                <w:noProof/>
+                <w:webHidden/>
+              </w:rPr>
+              <w:t>11</w:t>
+            </w:r>
+            <w:r>
+              <w:rPr>
+                <w:noProof/>
+                <w:webHidden/>
+              </w:rPr>
+              <w:fldChar w:fldCharType="end"/>
+            </w:r>
+          </w:hyperlink>
+        </w:p>
+        <w:p>
+          <w:pPr>
+            <w:pStyle w:val="Obsah3"/>
+            <w:tabs>
+              <w:tab w:val="left" w:pos="1200"/>
+              <w:tab w:val="right" w:leader="dot" w:pos="9628"/>
+            </w:tabs>
+            <w:rPr>
+              <w:rFonts w:asciiTheme="minorHAnsi" w:eastAsiaTheme="minorEastAsia" w:hAnsiTheme="minorHAnsi"/>
+              <w:noProof/>
+              <w:sz w:val="24"/>
+              <w:lang w:eastAsia="cs-CZ"/>
+            </w:rPr>
+          </w:pPr>
+          <w:hyperlink w:anchor="_Toc226556225" w:history="1">
+            <w:r>
+              <w:rPr>
+                <w:rStyle w:val="Hypertextovodkaz"/>
+                <w:noProof/>
+              </w:rPr>
+              <w:t>1.1.2.</w:t>
+            </w:r>
+            <w:r>
+              <w:rPr>
+                <w:rFonts w:asciiTheme="minorHAnsi" w:eastAsiaTheme="minorEastAsia" w:hAnsiTheme="minorHAnsi"/>
+                <w:noProof/>
+                <w:sz w:val="24"/>
+                <w:lang w:eastAsia="cs-CZ"/>
+              </w:rPr>
+              <w:tab/>
+            </w:r>
+            <w:r>
+              <w:rPr>
+                <w:rStyle w:val="Hypertextovodkaz"/>
+                <w:noProof/>
+              </w:rPr>
+              <w:t>Integrovaný terminál</w:t>
+            </w:r>
+            <w:r>
+              <w:rPr>
+                <w:noProof/>
+                <w:webHidden/>
+              </w:rPr>
+              <w:tab/>
+            </w:r>
+            <w:r>
+              <w:rPr>
+                <w:noProof/>
+                <w:webHidden/>
+              </w:rPr>
+              <w:fldChar w:fldCharType="begin"/>
+            </w:r>
+            <w:r>
+              <w:rPr>
+                <w:noProof/>
+                <w:webHidden/>
+              </w:rPr>
+              <w:instrText xml:space="preserve"> PAGEREF _Toc226556225 \h </w:instrText>
+            </w:r>
+            <w:r>
+              <w:rPr>
+                <w:noProof/>
+                <w:webHidden/>
+              </w:rPr>
+            </w:r>
+            <w:r>
+              <w:rPr>
+                <w:noProof/>
+                <w:webHidden/>
+              </w:rPr>
+              <w:fldChar w:fldCharType="separate"/>
+            </w:r>
+            <w:r>
+              <w:rPr>
+                <w:noProof/>
+                <w:webHidden/>
+              </w:rPr>
+              <w:t>11</w:t>
+            </w:r>
+            <w:r>
+              <w:rPr>
+                <w:noProof/>
+                <w:webHidden/>
+              </w:rPr>
+              <w:fldChar w:fldCharType="end"/>
+            </w:r>
+          </w:hyperlink>
+        </w:p>
+        <w:p>
+          <w:pPr>
+            <w:pStyle w:val="Obsah3"/>
+            <w:tabs>
+              <w:tab w:val="left" w:pos="1200"/>
+              <w:tab w:val="right" w:leader="dot" w:pos="9628"/>
+            </w:tabs>
+            <w:rPr>
+              <w:rFonts w:asciiTheme="minorHAnsi" w:eastAsiaTheme="minorEastAsia" w:hAnsiTheme="minorHAnsi"/>
+              <w:noProof/>
+              <w:sz w:val="24"/>
+              <w:lang w:eastAsia="cs-CZ"/>
+            </w:rPr>
+          </w:pPr>
+          <w:hyperlink w:anchor="_Toc226556226" w:history="1">
+            <w:r>
+              <w:rPr>
+                <w:rStyle w:val="Hypertextovodkaz"/>
+                <w:noProof/>
+              </w:rPr>
+              <w:t>1.1.3.</w:t>
+            </w:r>
+            <w:r>
+              <w:rPr>
+                <w:rFonts w:asciiTheme="minorHAnsi" w:eastAsiaTheme="minorEastAsia" w:hAnsiTheme="minorHAnsi"/>
+                <w:noProof/>
+                <w:sz w:val="24"/>
+                <w:lang w:eastAsia="cs-CZ"/>
+              </w:rPr>
+              <w:tab/>
+            </w:r>
+            <w:r>
+              <w:rPr>
+                <w:rStyle w:val="Hypertextovodkaz"/>
+                <w:noProof/>
+              </w:rPr>
+              <w:t>Rozšíření prostředí</w:t>
+            </w:r>
+            <w:r>
+              <w:rPr>
+                <w:noProof/>
+                <w:webHidden/>
+              </w:rPr>
+              <w:tab/>
+            </w:r>
+            <w:r>
+              <w:rPr>
+                <w:noProof/>
+                <w:webHidden/>
+              </w:rPr>
+              <w:fldChar w:fldCharType="begin"/>
+            </w:r>
+            <w:r>
+              <w:rPr>
+                <w:noProof/>
+                <w:webHidden/>
+              </w:rPr>
+              <w:instrText xml:space="preserve"> PAGEREF _Toc226556226 \h </w:instrText>
+            </w:r>
+            <w:r>
+              <w:rPr>
+                <w:noProof/>
+                <w:webHidden/>
+              </w:rPr>
+            </w:r>
+            <w:r>
+              <w:rPr>
+                <w:noProof/>
+                <w:webHidden/>
+              </w:rPr>
+              <w:fldChar w:fldCharType="separate"/>
+            </w:r>
+            <w:r>
+              <w:rPr>
+                <w:noProof/>
+                <w:webHidden/>
+              </w:rPr>
+              <w:t>11</w:t>
+            </w:r>
+            <w:r>
+              <w:rPr>
+                <w:noProof/>
+                <w:webHidden/>
+              </w:rPr>
+              <w:fldChar w:fldCharType="end"/>
+            </w:r>
+          </w:hyperlink>
+        </w:p>
+        <w:p>
+          <w:pPr>
+            <w:pStyle w:val="Obsah3"/>
+            <w:tabs>
+              <w:tab w:val="left" w:pos="1200"/>
+              <w:tab w:val="right" w:leader="dot" w:pos="9628"/>
+            </w:tabs>
+            <w:rPr>
+              <w:rFonts w:asciiTheme="minorHAnsi" w:eastAsiaTheme="minorEastAsia" w:hAnsiTheme="minorHAnsi"/>
+              <w:noProof/>
+              <w:sz w:val="24"/>
+              <w:lang w:eastAsia="cs-CZ"/>
+            </w:rPr>
+          </w:pPr>
+          <w:hyperlink w:anchor="_Toc226556227" w:history="1">
+            <w:r>
+              <w:rPr>
+                <w:rStyle w:val="Hypertextovodkaz"/>
+                <w:noProof/>
+              </w:rPr>
+              <w:t>1.1.4.</w:t>
+            </w:r>
+            <w:r>
+              <w:rPr>
+                <w:rFonts w:asciiTheme="minorHAnsi" w:eastAsiaTheme="minorEastAsia" w:hAnsiTheme="minorHAnsi"/>
+                <w:noProof/>
+                <w:sz w:val="24"/>
+                <w:lang w:eastAsia="cs-CZ"/>
+              </w:rPr>
+              <w:tab/>
+            </w:r>
+            <w:r>
+              <w:rPr>
+                <w:rStyle w:val="Hypertextovodkaz"/>
+                <w:noProof/>
+              </w:rPr>
+              <w:t>Git podpora</w:t>
+            </w:r>
+            <w:r>
+              <w:rPr>
+                <w:noProof/>
+                <w:webHidden/>
+              </w:rPr>
+              <w:tab/>
+            </w:r>
+            <w:r>
+              <w:rPr>
+                <w:noProof/>
+                <w:webHidden/>
+              </w:rPr>
+              <w:fldChar w:fldCharType="begin"/>
+            </w:r>
+            <w:r>
+              <w:rPr>
+                <w:noProof/>
+                <w:webHidden/>
+              </w:rPr>
+              <w:instrText xml:space="preserve"> PAGEREF _Toc226556227 \h </w:instrText>
             </w:r>
             <w:r>
               <w:rPr>
@@ -2101,7 +2430,7 @@
               <w:lang w:eastAsia="cs-CZ"/>
             </w:rPr>
           </w:pPr>
-          <w:hyperlink w:anchor="_Toc223513770" w:history="1">
+          <w:hyperlink w:anchor="_Toc226556228" w:history="1">
             <w:r>
               <w:rPr>
                 <w:rStyle w:val="Hypertextovodkaz"/>
@@ -2144,7 +2473,7 @@
                 <w:noProof/>
                 <w:webHidden/>
               </w:rPr>
-              <w:instrText xml:space="preserve"> PAGEREF _Toc223513770 \h </w:instrText>
+              <w:instrText xml:space="preserve"> PAGEREF _Toc226556228 \h </w:instrText>
             </w:r>
             <w:r>
               <w:rPr>
@@ -2165,6 +2494,358 @@
                 <w:webHidden/>
               </w:rPr>
               <w:t>11</w:t>
+            </w:r>
+            <w:r>
+              <w:rPr>
+                <w:noProof/>
+                <w:webHidden/>
+              </w:rPr>
+              <w:fldChar w:fldCharType="end"/>
+            </w:r>
+          </w:hyperlink>
+        </w:p>
+        <w:p>
+          <w:pPr>
+            <w:pStyle w:val="Obsah3"/>
+            <w:tabs>
+              <w:tab w:val="left" w:pos="1200"/>
+              <w:tab w:val="right" w:leader="dot" w:pos="9628"/>
+            </w:tabs>
+            <w:rPr>
+              <w:rFonts w:asciiTheme="minorHAnsi" w:eastAsiaTheme="minorEastAsia" w:hAnsiTheme="minorHAnsi"/>
+              <w:noProof/>
+              <w:sz w:val="24"/>
+              <w:lang w:eastAsia="cs-CZ"/>
+            </w:rPr>
+          </w:pPr>
+          <w:hyperlink w:anchor="_Toc226556229" w:history="1">
+            <w:r>
+              <w:rPr>
+                <w:rStyle w:val="Hypertextovodkaz"/>
+                <w:noProof/>
+              </w:rPr>
+              <w:t>1.2.1.</w:t>
+            </w:r>
+            <w:r>
+              <w:rPr>
+                <w:rFonts w:asciiTheme="minorHAnsi" w:eastAsiaTheme="minorEastAsia" w:hAnsiTheme="minorHAnsi"/>
+                <w:noProof/>
+                <w:sz w:val="24"/>
+                <w:lang w:eastAsia="cs-CZ"/>
+              </w:rPr>
+              <w:tab/>
+            </w:r>
+            <w:r>
+              <w:rPr>
+                <w:rStyle w:val="Hypertextovodkaz"/>
+                <w:noProof/>
+              </w:rPr>
+              <w:t>TypeScript</w:t>
+            </w:r>
+            <w:r>
+              <w:rPr>
+                <w:noProof/>
+                <w:webHidden/>
+              </w:rPr>
+              <w:tab/>
+            </w:r>
+            <w:r>
+              <w:rPr>
+                <w:noProof/>
+                <w:webHidden/>
+              </w:rPr>
+              <w:fldChar w:fldCharType="begin"/>
+            </w:r>
+            <w:r>
+              <w:rPr>
+                <w:noProof/>
+                <w:webHidden/>
+              </w:rPr>
+              <w:instrText xml:space="preserve"> PAGEREF _Toc226556229 \h </w:instrText>
+            </w:r>
+            <w:r>
+              <w:rPr>
+                <w:noProof/>
+                <w:webHidden/>
+              </w:rPr>
+            </w:r>
+            <w:r>
+              <w:rPr>
+                <w:noProof/>
+                <w:webHidden/>
+              </w:rPr>
+              <w:fldChar w:fldCharType="separate"/>
+            </w:r>
+            <w:r>
+              <w:rPr>
+                <w:noProof/>
+                <w:webHidden/>
+              </w:rPr>
+              <w:t>12</w:t>
+            </w:r>
+            <w:r>
+              <w:rPr>
+                <w:noProof/>
+                <w:webHidden/>
+              </w:rPr>
+              <w:fldChar w:fldCharType="end"/>
+            </w:r>
+          </w:hyperlink>
+        </w:p>
+        <w:p>
+          <w:pPr>
+            <w:pStyle w:val="Obsah3"/>
+            <w:tabs>
+              <w:tab w:val="left" w:pos="1200"/>
+              <w:tab w:val="right" w:leader="dot" w:pos="9628"/>
+            </w:tabs>
+            <w:rPr>
+              <w:rFonts w:asciiTheme="minorHAnsi" w:eastAsiaTheme="minorEastAsia" w:hAnsiTheme="minorHAnsi"/>
+              <w:noProof/>
+              <w:sz w:val="24"/>
+              <w:lang w:eastAsia="cs-CZ"/>
+            </w:rPr>
+          </w:pPr>
+          <w:hyperlink w:anchor="_Toc226556230" w:history="1">
+            <w:r>
+              <w:rPr>
+                <w:rStyle w:val="Hypertextovodkaz"/>
+                <w:noProof/>
+              </w:rPr>
+              <w:t>1.2.2.</w:t>
+            </w:r>
+            <w:r>
+              <w:rPr>
+                <w:rFonts w:asciiTheme="minorHAnsi" w:eastAsiaTheme="minorEastAsia" w:hAnsiTheme="minorHAnsi"/>
+                <w:noProof/>
+                <w:sz w:val="24"/>
+                <w:lang w:eastAsia="cs-CZ"/>
+              </w:rPr>
+              <w:tab/>
+            </w:r>
+            <w:r>
+              <w:rPr>
+                <w:rStyle w:val="Hypertextovodkaz"/>
+                <w:noProof/>
+              </w:rPr>
+              <w:t>Komponentová architektura</w:t>
+            </w:r>
+            <w:r>
+              <w:rPr>
+                <w:noProof/>
+                <w:webHidden/>
+              </w:rPr>
+              <w:tab/>
+            </w:r>
+            <w:r>
+              <w:rPr>
+                <w:noProof/>
+                <w:webHidden/>
+              </w:rPr>
+              <w:fldChar w:fldCharType="begin"/>
+            </w:r>
+            <w:r>
+              <w:rPr>
+                <w:noProof/>
+                <w:webHidden/>
+              </w:rPr>
+              <w:instrText xml:space="preserve"> PAGEREF _Toc226556230 \h </w:instrText>
+            </w:r>
+            <w:r>
+              <w:rPr>
+                <w:noProof/>
+                <w:webHidden/>
+              </w:rPr>
+            </w:r>
+            <w:r>
+              <w:rPr>
+                <w:noProof/>
+                <w:webHidden/>
+              </w:rPr>
+              <w:fldChar w:fldCharType="separate"/>
+            </w:r>
+            <w:r>
+              <w:rPr>
+                <w:noProof/>
+                <w:webHidden/>
+              </w:rPr>
+              <w:t>12</w:t>
+            </w:r>
+            <w:r>
+              <w:rPr>
+                <w:noProof/>
+                <w:webHidden/>
+              </w:rPr>
+              <w:fldChar w:fldCharType="end"/>
+            </w:r>
+          </w:hyperlink>
+        </w:p>
+        <w:p>
+          <w:pPr>
+            <w:pStyle w:val="Obsah3"/>
+            <w:tabs>
+              <w:tab w:val="left" w:pos="1200"/>
+              <w:tab w:val="right" w:leader="dot" w:pos="9628"/>
+            </w:tabs>
+            <w:rPr>
+              <w:rFonts w:asciiTheme="minorHAnsi" w:eastAsiaTheme="minorEastAsia" w:hAnsiTheme="minorHAnsi"/>
+              <w:noProof/>
+              <w:sz w:val="24"/>
+              <w:lang w:eastAsia="cs-CZ"/>
+            </w:rPr>
+          </w:pPr>
+          <w:hyperlink w:anchor="_Toc226556231" w:history="1">
+            <w:r>
+              <w:rPr>
+                <w:rStyle w:val="Hypertextovodkaz"/>
+                <w:noProof/>
+              </w:rPr>
+              <w:t>1.2.3.</w:t>
+            </w:r>
+            <w:r>
+              <w:rPr>
+                <w:rFonts w:asciiTheme="minorHAnsi" w:eastAsiaTheme="minorEastAsia" w:hAnsiTheme="minorHAnsi"/>
+                <w:noProof/>
+                <w:sz w:val="24"/>
+                <w:lang w:eastAsia="cs-CZ"/>
+              </w:rPr>
+              <w:tab/>
+            </w:r>
+            <w:r>
+              <w:rPr>
+                <w:rStyle w:val="Hypertextovodkaz"/>
+                <w:noProof/>
+              </w:rPr>
+              <w:t>Services &amp; Dependency Injection</w:t>
+            </w:r>
+            <w:r>
+              <w:rPr>
+                <w:noProof/>
+                <w:webHidden/>
+              </w:rPr>
+              <w:tab/>
+            </w:r>
+            <w:r>
+              <w:rPr>
+                <w:noProof/>
+                <w:webHidden/>
+              </w:rPr>
+              <w:fldChar w:fldCharType="begin"/>
+            </w:r>
+            <w:r>
+              <w:rPr>
+                <w:noProof/>
+                <w:webHidden/>
+              </w:rPr>
+              <w:instrText xml:space="preserve"> PAGEREF _Toc226556231 \h </w:instrText>
+            </w:r>
+            <w:r>
+              <w:rPr>
+                <w:noProof/>
+                <w:webHidden/>
+              </w:rPr>
+            </w:r>
+            <w:r>
+              <w:rPr>
+                <w:noProof/>
+                <w:webHidden/>
+              </w:rPr>
+              <w:fldChar w:fldCharType="separate"/>
+            </w:r>
+            <w:r>
+              <w:rPr>
+                <w:noProof/>
+                <w:webHidden/>
+              </w:rPr>
+              <w:t>12</w:t>
+            </w:r>
+            <w:r>
+              <w:rPr>
+                <w:noProof/>
+                <w:webHidden/>
+              </w:rPr>
+              <w:fldChar w:fldCharType="end"/>
+            </w:r>
+          </w:hyperlink>
+        </w:p>
+        <w:p>
+          <w:pPr>
+            <w:pStyle w:val="Obsah3"/>
+            <w:tabs>
+              <w:tab w:val="left" w:pos="1200"/>
+              <w:tab w:val="right" w:leader="dot" w:pos="9628"/>
+            </w:tabs>
+            <w:rPr>
+              <w:rFonts w:asciiTheme="minorHAnsi" w:eastAsiaTheme="minorEastAsia" w:hAnsiTheme="minorHAnsi"/>
+              <w:noProof/>
+              <w:sz w:val="24"/>
+              <w:lang w:eastAsia="cs-CZ"/>
+            </w:rPr>
+          </w:pPr>
+          <w:hyperlink w:anchor="_Toc226556232" w:history="1">
+            <w:r>
+              <w:rPr>
+                <w:rStyle w:val="Hypertextovodkaz"/>
+                <w:noProof/>
+              </w:rPr>
+              <w:t>1.2.4.</w:t>
+            </w:r>
+            <w:r>
+              <w:rPr>
+                <w:rFonts w:asciiTheme="minorHAnsi" w:eastAsiaTheme="minorEastAsia" w:hAnsiTheme="minorHAnsi"/>
+                <w:noProof/>
+                <w:sz w:val="24"/>
+                <w:lang w:eastAsia="cs-CZ"/>
+              </w:rPr>
+              <w:tab/>
+            </w:r>
+            <w:r>
+              <w:rPr>
+                <w:rStyle w:val="Hypertextovodkaz"/>
+                <w:noProof/>
+              </w:rPr>
+              <w:t>Angular CLI</w:t>
+            </w:r>
+            <w:r>
+              <w:rPr>
+                <w:noProof/>
+                <w:webHidden/>
+              </w:rPr>
+              <w:tab/>
+            </w:r>
+            <w:r>
+              <w:rPr>
+                <w:noProof/>
+                <w:webHidden/>
+              </w:rPr>
+              <w:fldChar w:fldCharType="begin"/>
+            </w:r>
+            <w:r>
+              <w:rPr>
+                <w:noProof/>
+                <w:webHidden/>
+              </w:rPr>
+              <w:instrText xml:space="preserve"> PAGEREF _Toc226556232 \h </w:instrText>
+            </w:r>
+            <w:r>
+              <w:rPr>
+                <w:noProof/>
+                <w:webHidden/>
+              </w:rPr>
+            </w:r>
+            <w:r>
+              <w:rPr>
+                <w:noProof/>
+                <w:webHidden/>
+              </w:rPr>
+              <w:fldChar w:fldCharType="separate"/>
+            </w:r>
+            <w:r>
+              <w:rPr>
+                <w:noProof/>
+                <w:webHidden/>
+              </w:rPr>
+              <w:t>12</w:t>
             </w:r>
             <w:r>
               <w:rPr>
@@ -2189,7 +2870,7 @@
               <w:lang w:eastAsia="cs-CZ"/>
             </w:rPr>
           </w:pPr>
-          <w:hyperlink w:anchor="_Toc223513771" w:history="1">
+          <w:hyperlink w:anchor="_Toc226556233" w:history="1">
             <w:r>
               <w:rPr>
                 <w:rStyle w:val="Hypertextovodkaz"/>
@@ -2232,7 +2913,7 @@
                 <w:noProof/>
                 <w:webHidden/>
               </w:rPr>
-              <w:instrText xml:space="preserve"> PAGEREF _Toc223513771 \h </w:instrText>
+              <w:instrText xml:space="preserve"> PAGEREF _Toc226556233 \h </w:instrText>
             </w:r>
             <w:r>
               <w:rPr>
@@ -2252,7 +2933,183 @@
                 <w:noProof/>
                 <w:webHidden/>
               </w:rPr>
-              <w:t>11</w:t>
+              <w:t>12</w:t>
+            </w:r>
+            <w:r>
+              <w:rPr>
+                <w:noProof/>
+                <w:webHidden/>
+              </w:rPr>
+              <w:fldChar w:fldCharType="end"/>
+            </w:r>
+          </w:hyperlink>
+        </w:p>
+        <w:p>
+          <w:pPr>
+            <w:pStyle w:val="Obsah3"/>
+            <w:tabs>
+              <w:tab w:val="left" w:pos="1200"/>
+              <w:tab w:val="right" w:leader="dot" w:pos="9628"/>
+            </w:tabs>
+            <w:rPr>
+              <w:rFonts w:asciiTheme="minorHAnsi" w:eastAsiaTheme="minorEastAsia" w:hAnsiTheme="minorHAnsi"/>
+              <w:noProof/>
+              <w:sz w:val="24"/>
+              <w:lang w:eastAsia="cs-CZ"/>
+            </w:rPr>
+          </w:pPr>
+          <w:hyperlink w:anchor="_Toc226556234" w:history="1">
+            <w:r>
+              <w:rPr>
+                <w:rStyle w:val="Hypertextovodkaz"/>
+                <w:noProof/>
+              </w:rPr>
+              <w:t>1.3.1.</w:t>
+            </w:r>
+            <w:r>
+              <w:rPr>
+                <w:rFonts w:asciiTheme="minorHAnsi" w:eastAsiaTheme="minorEastAsia" w:hAnsiTheme="minorHAnsi"/>
+                <w:noProof/>
+                <w:sz w:val="24"/>
+                <w:lang w:eastAsia="cs-CZ"/>
+              </w:rPr>
+              <w:tab/>
+            </w:r>
+            <w:r>
+              <w:rPr>
+                <w:rStyle w:val="Hypertextovodkaz"/>
+                <w:noProof/>
+              </w:rPr>
+              <w:t>Karty a panely</w:t>
+            </w:r>
+            <w:r>
+              <w:rPr>
+                <w:noProof/>
+                <w:webHidden/>
+              </w:rPr>
+              <w:tab/>
+            </w:r>
+            <w:r>
+              <w:rPr>
+                <w:noProof/>
+                <w:webHidden/>
+              </w:rPr>
+              <w:fldChar w:fldCharType="begin"/>
+            </w:r>
+            <w:r>
+              <w:rPr>
+                <w:noProof/>
+                <w:webHidden/>
+              </w:rPr>
+              <w:instrText xml:space="preserve"> PAGEREF _Toc226556234 \h </w:instrText>
+            </w:r>
+            <w:r>
+              <w:rPr>
+                <w:noProof/>
+                <w:webHidden/>
+              </w:rPr>
+            </w:r>
+            <w:r>
+              <w:rPr>
+                <w:noProof/>
+                <w:webHidden/>
+              </w:rPr>
+              <w:fldChar w:fldCharType="separate"/>
+            </w:r>
+            <w:r>
+              <w:rPr>
+                <w:noProof/>
+                <w:webHidden/>
+              </w:rPr>
+              <w:t>12</w:t>
+            </w:r>
+            <w:r>
+              <w:rPr>
+                <w:noProof/>
+                <w:webHidden/>
+              </w:rPr>
+              <w:fldChar w:fldCharType="end"/>
+            </w:r>
+          </w:hyperlink>
+        </w:p>
+        <w:p>
+          <w:pPr>
+            <w:pStyle w:val="Obsah3"/>
+            <w:tabs>
+              <w:tab w:val="left" w:pos="1200"/>
+              <w:tab w:val="right" w:leader="dot" w:pos="9628"/>
+            </w:tabs>
+            <w:rPr>
+              <w:rFonts w:asciiTheme="minorHAnsi" w:eastAsiaTheme="minorEastAsia" w:hAnsiTheme="minorHAnsi"/>
+              <w:noProof/>
+              <w:sz w:val="24"/>
+              <w:lang w:eastAsia="cs-CZ"/>
+            </w:rPr>
+          </w:pPr>
+          <w:hyperlink w:anchor="_Toc226556235" w:history="1">
+            <w:r>
+              <w:rPr>
+                <w:rStyle w:val="Hypertextovodkaz"/>
+                <w:noProof/>
+              </w:rPr>
+              <w:t>1.3.2.</w:t>
+            </w:r>
+            <w:r>
+              <w:rPr>
+                <w:rFonts w:asciiTheme="minorHAnsi" w:eastAsiaTheme="minorEastAsia" w:hAnsiTheme="minorHAnsi"/>
+                <w:noProof/>
+                <w:sz w:val="24"/>
+                <w:lang w:eastAsia="cs-CZ"/>
+              </w:rPr>
+              <w:tab/>
+            </w:r>
+            <w:r>
+              <w:rPr>
+                <w:rStyle w:val="Hypertextovodkaz"/>
+                <w:noProof/>
+              </w:rPr>
+              <w:t>Formulářové prvky a ikony</w:t>
+            </w:r>
+            <w:r>
+              <w:rPr>
+                <w:noProof/>
+                <w:webHidden/>
+              </w:rPr>
+              <w:tab/>
+            </w:r>
+            <w:r>
+              <w:rPr>
+                <w:noProof/>
+                <w:webHidden/>
+              </w:rPr>
+              <w:fldChar w:fldCharType="begin"/>
+            </w:r>
+            <w:r>
+              <w:rPr>
+                <w:noProof/>
+                <w:webHidden/>
+              </w:rPr>
+              <w:instrText xml:space="preserve"> PAGEREF _Toc226556235 \h </w:instrText>
+            </w:r>
+            <w:r>
+              <w:rPr>
+                <w:noProof/>
+                <w:webHidden/>
+              </w:rPr>
+            </w:r>
+            <w:r>
+              <w:rPr>
+                <w:noProof/>
+                <w:webHidden/>
+              </w:rPr>
+              <w:fldChar w:fldCharType="separate"/>
+            </w:r>
+            <w:r>
+              <w:rPr>
+                <w:noProof/>
+                <w:webHidden/>
+              </w:rPr>
+              <w:t>12</w:t>
             </w:r>
             <w:r>
               <w:rPr>
@@ -2277,7 +3134,7 @@
               <w:lang w:eastAsia="cs-CZ"/>
             </w:rPr>
           </w:pPr>
-          <w:hyperlink w:anchor="_Toc223513772" w:history="1">
+          <w:hyperlink w:anchor="_Toc226556236" w:history="1">
             <w:r>
               <w:rPr>
                 <w:rStyle w:val="Hypertextovodkaz"/>
@@ -2320,7 +3177,7 @@
                 <w:noProof/>
                 <w:webHidden/>
               </w:rPr>
-              <w:instrText xml:space="preserve"> PAGEREF _Toc223513772 \h </w:instrText>
+              <w:instrText xml:space="preserve"> PAGEREF _Toc226556236 \h </w:instrText>
             </w:r>
             <w:r>
               <w:rPr>
@@ -2340,7 +3197,7 @@
                 <w:noProof/>
                 <w:webHidden/>
               </w:rPr>
-              <w:t>11</w:t>
+              <w:t>13</w:t>
             </w:r>
             <w:r>
               <w:rPr>
@@ -2353,9 +3210,9 @@
         </w:p>
         <w:p>
           <w:pPr>
-            <w:pStyle w:val="Obsah1"/>
+            <w:pStyle w:val="Obsah3"/>
             <w:tabs>
-              <w:tab w:val="left" w:pos="480"/>
+              <w:tab w:val="left" w:pos="1200"/>
               <w:tab w:val="right" w:leader="dot" w:pos="9628"/>
             </w:tabs>
             <w:rPr>
@@ -2365,13 +3222,13 @@
               <w:lang w:eastAsia="cs-CZ"/>
             </w:rPr>
           </w:pPr>
-          <w:hyperlink w:anchor="_Toc223513773" w:history="1">
+          <w:hyperlink w:anchor="_Toc226556237" w:history="1">
             <w:r>
               <w:rPr>
                 <w:rStyle w:val="Hypertextovodkaz"/>
                 <w:noProof/>
               </w:rPr>
-              <w:t>2.</w:t>
+              <w:t>1.4.1.</w:t>
             </w:r>
             <w:r>
               <w:rPr>
@@ -2387,7 +3244,7 @@
                 <w:rStyle w:val="Hypertextovodkaz"/>
                 <w:noProof/>
               </w:rPr>
-              <w:t>Praktická část</w:t>
+              <w:t>Variables</w:t>
             </w:r>
             <w:r>
               <w:rPr>
@@ -2408,7 +3265,7 @@
                 <w:noProof/>
                 <w:webHidden/>
               </w:rPr>
-              <w:instrText xml:space="preserve"> PAGEREF _Toc223513773 \h </w:instrText>
+              <w:instrText xml:space="preserve"> PAGEREF _Toc226556237 \h </w:instrText>
             </w:r>
             <w:r>
               <w:rPr>
@@ -2428,7 +3285,183 @@
                 <w:noProof/>
                 <w:webHidden/>
               </w:rPr>
-              <w:t>12</w:t>
+              <w:t>13</w:t>
+            </w:r>
+            <w:r>
+              <w:rPr>
+                <w:noProof/>
+                <w:webHidden/>
+              </w:rPr>
+              <w:fldChar w:fldCharType="end"/>
+            </w:r>
+          </w:hyperlink>
+        </w:p>
+        <w:p>
+          <w:pPr>
+            <w:pStyle w:val="Obsah3"/>
+            <w:tabs>
+              <w:tab w:val="left" w:pos="1200"/>
+              <w:tab w:val="right" w:leader="dot" w:pos="9628"/>
+            </w:tabs>
+            <w:rPr>
+              <w:rFonts w:asciiTheme="minorHAnsi" w:eastAsiaTheme="minorEastAsia" w:hAnsiTheme="minorHAnsi"/>
+              <w:noProof/>
+              <w:sz w:val="24"/>
+              <w:lang w:eastAsia="cs-CZ"/>
+            </w:rPr>
+          </w:pPr>
+          <w:hyperlink w:anchor="_Toc226556238" w:history="1">
+            <w:r>
+              <w:rPr>
+                <w:rStyle w:val="Hypertextovodkaz"/>
+                <w:noProof/>
+              </w:rPr>
+              <w:t>1.4.2.</w:t>
+            </w:r>
+            <w:r>
+              <w:rPr>
+                <w:rFonts w:asciiTheme="minorHAnsi" w:eastAsiaTheme="minorEastAsia" w:hAnsiTheme="minorHAnsi"/>
+                <w:noProof/>
+                <w:sz w:val="24"/>
+                <w:lang w:eastAsia="cs-CZ"/>
+              </w:rPr>
+              <w:tab/>
+            </w:r>
+            <w:r>
+              <w:rPr>
+                <w:rStyle w:val="Hypertextovodkaz"/>
+                <w:noProof/>
+              </w:rPr>
+              <w:t>Nesting</w:t>
+            </w:r>
+            <w:r>
+              <w:rPr>
+                <w:noProof/>
+                <w:webHidden/>
+              </w:rPr>
+              <w:tab/>
+            </w:r>
+            <w:r>
+              <w:rPr>
+                <w:noProof/>
+                <w:webHidden/>
+              </w:rPr>
+              <w:fldChar w:fldCharType="begin"/>
+            </w:r>
+            <w:r>
+              <w:rPr>
+                <w:noProof/>
+                <w:webHidden/>
+              </w:rPr>
+              <w:instrText xml:space="preserve"> PAGEREF _Toc226556238 \h </w:instrText>
+            </w:r>
+            <w:r>
+              <w:rPr>
+                <w:noProof/>
+                <w:webHidden/>
+              </w:rPr>
+            </w:r>
+            <w:r>
+              <w:rPr>
+                <w:noProof/>
+                <w:webHidden/>
+              </w:rPr>
+              <w:fldChar w:fldCharType="separate"/>
+            </w:r>
+            <w:r>
+              <w:rPr>
+                <w:noProof/>
+                <w:webHidden/>
+              </w:rPr>
+              <w:t>13</w:t>
+            </w:r>
+            <w:r>
+              <w:rPr>
+                <w:noProof/>
+                <w:webHidden/>
+              </w:rPr>
+              <w:fldChar w:fldCharType="end"/>
+            </w:r>
+          </w:hyperlink>
+        </w:p>
+        <w:p>
+          <w:pPr>
+            <w:pStyle w:val="Obsah3"/>
+            <w:tabs>
+              <w:tab w:val="left" w:pos="1200"/>
+              <w:tab w:val="right" w:leader="dot" w:pos="9628"/>
+            </w:tabs>
+            <w:rPr>
+              <w:rFonts w:asciiTheme="minorHAnsi" w:eastAsiaTheme="minorEastAsia" w:hAnsiTheme="minorHAnsi"/>
+              <w:noProof/>
+              <w:sz w:val="24"/>
+              <w:lang w:eastAsia="cs-CZ"/>
+            </w:rPr>
+          </w:pPr>
+          <w:hyperlink w:anchor="_Toc226556239" w:history="1">
+            <w:r>
+              <w:rPr>
+                <w:rStyle w:val="Hypertextovodkaz"/>
+                <w:noProof/>
+              </w:rPr>
+              <w:t>1.4.3.</w:t>
+            </w:r>
+            <w:r>
+              <w:rPr>
+                <w:rFonts w:asciiTheme="minorHAnsi" w:eastAsiaTheme="minorEastAsia" w:hAnsiTheme="minorHAnsi"/>
+                <w:noProof/>
+                <w:sz w:val="24"/>
+                <w:lang w:eastAsia="cs-CZ"/>
+              </w:rPr>
+              <w:tab/>
+            </w:r>
+            <w:r>
+              <w:rPr>
+                <w:rStyle w:val="Hypertextovodkaz"/>
+                <w:noProof/>
+              </w:rPr>
+              <w:t>Mixiny</w:t>
+            </w:r>
+            <w:r>
+              <w:rPr>
+                <w:noProof/>
+                <w:webHidden/>
+              </w:rPr>
+              <w:tab/>
+            </w:r>
+            <w:r>
+              <w:rPr>
+                <w:noProof/>
+                <w:webHidden/>
+              </w:rPr>
+              <w:fldChar w:fldCharType="begin"/>
+            </w:r>
+            <w:r>
+              <w:rPr>
+                <w:noProof/>
+                <w:webHidden/>
+              </w:rPr>
+              <w:instrText xml:space="preserve"> PAGEREF _Toc226556239 \h </w:instrText>
+            </w:r>
+            <w:r>
+              <w:rPr>
+                <w:noProof/>
+                <w:webHidden/>
+              </w:rPr>
+            </w:r>
+            <w:r>
+              <w:rPr>
+                <w:noProof/>
+                <w:webHidden/>
+              </w:rPr>
+              <w:fldChar w:fldCharType="separate"/>
+            </w:r>
+            <w:r>
+              <w:rPr>
+                <w:noProof/>
+                <w:webHidden/>
+              </w:rPr>
+              <w:t>13</w:t>
             </w:r>
             <w:r>
               <w:rPr>
@@ -2453,13 +3486,13 @@
               <w:lang w:eastAsia="cs-CZ"/>
             </w:rPr>
           </w:pPr>
-          <w:hyperlink w:anchor="_Toc223513774" w:history="1">
+          <w:hyperlink w:anchor="_Toc226556240" w:history="1">
             <w:r>
               <w:rPr>
                 <w:rStyle w:val="Hypertextovodkaz"/>
                 <w:noProof/>
               </w:rPr>
-              <w:t>2.1.</w:t>
+              <w:t>1.5.</w:t>
             </w:r>
             <w:r>
               <w:rPr>
@@ -2475,7 +3508,7 @@
                 <w:rStyle w:val="Hypertextovodkaz"/>
                 <w:noProof/>
               </w:rPr>
-              <w:t>Začátek vývoje</w:t>
+              <w:t>Netlify</w:t>
             </w:r>
             <w:r>
               <w:rPr>
@@ -2496,7 +3529,7 @@
                 <w:noProof/>
                 <w:webHidden/>
               </w:rPr>
-              <w:instrText xml:space="preserve"> PAGEREF _Toc223513774 \h </w:instrText>
+              <w:instrText xml:space="preserve"> PAGEREF _Toc226556240 \h </w:instrText>
             </w:r>
             <w:r>
               <w:rPr>
@@ -2516,7 +3549,95 @@
                 <w:noProof/>
                 <w:webHidden/>
               </w:rPr>
-              <w:t>12</w:t>
+              <w:t>13</w:t>
+            </w:r>
+            <w:r>
+              <w:rPr>
+                <w:noProof/>
+                <w:webHidden/>
+              </w:rPr>
+              <w:fldChar w:fldCharType="end"/>
+            </w:r>
+          </w:hyperlink>
+        </w:p>
+        <w:p>
+          <w:pPr>
+            <w:pStyle w:val="Obsah1"/>
+            <w:tabs>
+              <w:tab w:val="left" w:pos="440"/>
+              <w:tab w:val="right" w:leader="dot" w:pos="9628"/>
+            </w:tabs>
+            <w:rPr>
+              <w:rFonts w:asciiTheme="minorHAnsi" w:eastAsiaTheme="minorEastAsia" w:hAnsiTheme="minorHAnsi"/>
+              <w:noProof/>
+              <w:sz w:val="24"/>
+              <w:lang w:eastAsia="cs-CZ"/>
+            </w:rPr>
+          </w:pPr>
+          <w:hyperlink w:anchor="_Toc226556241" w:history="1">
+            <w:r>
+              <w:rPr>
+                <w:rStyle w:val="Hypertextovodkaz"/>
+                <w:noProof/>
+              </w:rPr>
+              <w:t>2.</w:t>
+            </w:r>
+            <w:r>
+              <w:rPr>
+                <w:rFonts w:asciiTheme="minorHAnsi" w:eastAsiaTheme="minorEastAsia" w:hAnsiTheme="minorHAnsi"/>
+                <w:noProof/>
+                <w:sz w:val="24"/>
+                <w:lang w:eastAsia="cs-CZ"/>
+              </w:rPr>
+              <w:tab/>
+            </w:r>
+            <w:r>
+              <w:rPr>
+                <w:rStyle w:val="Hypertextovodkaz"/>
+                <w:noProof/>
+              </w:rPr>
+              <w:t>Praktická část</w:t>
+            </w:r>
+            <w:r>
+              <w:rPr>
+                <w:noProof/>
+                <w:webHidden/>
+              </w:rPr>
+              <w:tab/>
+            </w:r>
+            <w:r>
+              <w:rPr>
+                <w:noProof/>
+                <w:webHidden/>
+              </w:rPr>
+              <w:fldChar w:fldCharType="begin"/>
+            </w:r>
+            <w:r>
+              <w:rPr>
+                <w:noProof/>
+                <w:webHidden/>
+              </w:rPr>
+              <w:instrText xml:space="preserve"> PAGEREF _Toc226556241 \h </w:instrText>
+            </w:r>
+            <w:r>
+              <w:rPr>
+                <w:noProof/>
+                <w:webHidden/>
+              </w:rPr>
+            </w:r>
+            <w:r>
+              <w:rPr>
+                <w:noProof/>
+                <w:webHidden/>
+              </w:rPr>
+              <w:fldChar w:fldCharType="separate"/>
+            </w:r>
+            <w:r>
+              <w:rPr>
+                <w:noProof/>
+                <w:webHidden/>
+              </w:rPr>
+              <w:t>14</w:t>
             </w:r>
             <w:r>
               <w:rPr>
@@ -2541,13 +3662,13 @@
               <w:lang w:eastAsia="cs-CZ"/>
             </w:rPr>
           </w:pPr>
-          <w:hyperlink w:anchor="_Toc223513775" w:history="1">
+          <w:hyperlink w:anchor="_Toc226556242" w:history="1">
             <w:r>
               <w:rPr>
                 <w:rStyle w:val="Hypertextovodkaz"/>
                 <w:noProof/>
               </w:rPr>
-              <w:t>2.2.</w:t>
+              <w:t>2.1.</w:t>
             </w:r>
             <w:r>
               <w:rPr>
@@ -2563,7 +3684,7 @@
                 <w:rStyle w:val="Hypertextovodkaz"/>
                 <w:noProof/>
               </w:rPr>
-              <w:t>Problémy při vývoji</w:t>
+              <w:t>Příprava repositáře</w:t>
             </w:r>
             <w:r>
               <w:rPr>
@@ -2584,7 +3705,7 @@
                 <w:noProof/>
                 <w:webHidden/>
               </w:rPr>
-              <w:instrText xml:space="preserve"> PAGEREF _Toc223513775 \h </w:instrText>
+              <w:instrText xml:space="preserve"> PAGEREF _Toc226556242 \h </w:instrText>
             </w:r>
             <w:r>
               <w:rPr>
@@ -2604,7 +3725,7 @@
                 <w:noProof/>
                 <w:webHidden/>
               </w:rPr>
-              <w:t>12</w:t>
+              <w:t>14</w:t>
             </w:r>
             <w:r>
               <w:rPr>
@@ -2629,13 +3750,13 @@
               <w:lang w:eastAsia="cs-CZ"/>
             </w:rPr>
           </w:pPr>
-          <w:hyperlink w:anchor="_Toc223513776" w:history="1">
+          <w:hyperlink w:anchor="_Toc226556243" w:history="1">
             <w:r>
               <w:rPr>
                 <w:rStyle w:val="Hypertextovodkaz"/>
                 <w:noProof/>
               </w:rPr>
-              <w:t>2.3.</w:t>
+              <w:t>2.2.</w:t>
             </w:r>
             <w:r>
               <w:rPr>
@@ -2651,7 +3772,7 @@
                 <w:rStyle w:val="Hypertextovodkaz"/>
                 <w:noProof/>
               </w:rPr>
-              <w:t>Občasné využití AI</w:t>
+              <w:t>První kroky před vývojem</w:t>
             </w:r>
             <w:r>
               <w:rPr>
@@ -2672,7 +3793,7 @@
                 <w:noProof/>
                 <w:webHidden/>
               </w:rPr>
-              <w:instrText xml:space="preserve"> PAGEREF _Toc223513776 \h </w:instrText>
+              <w:instrText xml:space="preserve"> PAGEREF _Toc226556243 \h </w:instrText>
             </w:r>
             <w:r>
               <w:rPr>
@@ -2692,7 +3813,7 @@
                 <w:noProof/>
                 <w:webHidden/>
               </w:rPr>
-              <w:t>12</w:t>
+              <w:t>14</w:t>
             </w:r>
             <w:r>
               <w:rPr>
@@ -2717,13 +3838,13 @@
               <w:lang w:eastAsia="cs-CZ"/>
             </w:rPr>
           </w:pPr>
-          <w:hyperlink w:anchor="_Toc223513777" w:history="1">
+          <w:hyperlink w:anchor="_Toc226556244" w:history="1">
             <w:r>
               <w:rPr>
                 <w:rStyle w:val="Hypertextovodkaz"/>
                 <w:noProof/>
               </w:rPr>
-              <w:t>2.4.</w:t>
+              <w:t>2.3.</w:t>
             </w:r>
             <w:r>
               <w:rPr>
@@ -2739,6 +3860,622 @@
                 <w:rStyle w:val="Hypertextovodkaz"/>
                 <w:noProof/>
               </w:rPr>
+              <w:t>Modelovaní dat a služby</w:t>
+            </w:r>
+            <w:r>
+              <w:rPr>
+                <w:noProof/>
+                <w:webHidden/>
+              </w:rPr>
+              <w:tab/>
+            </w:r>
+            <w:r>
+              <w:rPr>
+                <w:noProof/>
+                <w:webHidden/>
+              </w:rPr>
+              <w:fldChar w:fldCharType="begin"/>
+            </w:r>
+            <w:r>
+              <w:rPr>
+                <w:noProof/>
+                <w:webHidden/>
+              </w:rPr>
+              <w:instrText xml:space="preserve"> PAGEREF _Toc226556244 \h </w:instrText>
+            </w:r>
+            <w:r>
+              <w:rPr>
+                <w:noProof/>
+                <w:webHidden/>
+              </w:rPr>
+            </w:r>
+            <w:r>
+              <w:rPr>
+                <w:noProof/>
+                <w:webHidden/>
+              </w:rPr>
+              <w:fldChar w:fldCharType="separate"/>
+            </w:r>
+            <w:r>
+              <w:rPr>
+                <w:noProof/>
+                <w:webHidden/>
+              </w:rPr>
+              <w:t>14</w:t>
+            </w:r>
+            <w:r>
+              <w:rPr>
+                <w:noProof/>
+                <w:webHidden/>
+              </w:rPr>
+              <w:fldChar w:fldCharType="end"/>
+            </w:r>
+          </w:hyperlink>
+        </w:p>
+        <w:p>
+          <w:pPr>
+            <w:pStyle w:val="Obsah2"/>
+            <w:tabs>
+              <w:tab w:val="left" w:pos="960"/>
+              <w:tab w:val="right" w:leader="dot" w:pos="9628"/>
+            </w:tabs>
+            <w:rPr>
+              <w:rFonts w:asciiTheme="minorHAnsi" w:eastAsiaTheme="minorEastAsia" w:hAnsiTheme="minorHAnsi"/>
+              <w:noProof/>
+              <w:sz w:val="24"/>
+              <w:lang w:eastAsia="cs-CZ"/>
+            </w:rPr>
+          </w:pPr>
+          <w:hyperlink w:anchor="_Toc226556245" w:history="1">
+            <w:r>
+              <w:rPr>
+                <w:rStyle w:val="Hypertextovodkaz"/>
+                <w:noProof/>
+              </w:rPr>
+              <w:t>2.4.</w:t>
+            </w:r>
+            <w:r>
+              <w:rPr>
+                <w:rFonts w:asciiTheme="minorHAnsi" w:eastAsiaTheme="minorEastAsia" w:hAnsiTheme="minorHAnsi"/>
+                <w:noProof/>
+                <w:sz w:val="24"/>
+                <w:lang w:eastAsia="cs-CZ"/>
+              </w:rPr>
+              <w:tab/>
+            </w:r>
+            <w:r>
+              <w:rPr>
+                <w:rStyle w:val="Hypertextovodkaz"/>
+                <w:noProof/>
+              </w:rPr>
+              <w:t>Hlavní UI a navigace</w:t>
+            </w:r>
+            <w:r>
+              <w:rPr>
+                <w:noProof/>
+                <w:webHidden/>
+              </w:rPr>
+              <w:tab/>
+            </w:r>
+            <w:r>
+              <w:rPr>
+                <w:noProof/>
+                <w:webHidden/>
+              </w:rPr>
+              <w:fldChar w:fldCharType="begin"/>
+            </w:r>
+            <w:r>
+              <w:rPr>
+                <w:noProof/>
+                <w:webHidden/>
+              </w:rPr>
+              <w:instrText xml:space="preserve"> PAGEREF _Toc226556245 \h </w:instrText>
+            </w:r>
+            <w:r>
+              <w:rPr>
+                <w:noProof/>
+                <w:webHidden/>
+              </w:rPr>
+            </w:r>
+            <w:r>
+              <w:rPr>
+                <w:noProof/>
+                <w:webHidden/>
+              </w:rPr>
+              <w:fldChar w:fldCharType="separate"/>
+            </w:r>
+            <w:r>
+              <w:rPr>
+                <w:noProof/>
+                <w:webHidden/>
+              </w:rPr>
+              <w:t>14</w:t>
+            </w:r>
+            <w:r>
+              <w:rPr>
+                <w:noProof/>
+                <w:webHidden/>
+              </w:rPr>
+              <w:fldChar w:fldCharType="end"/>
+            </w:r>
+          </w:hyperlink>
+        </w:p>
+        <w:p>
+          <w:pPr>
+            <w:pStyle w:val="Obsah2"/>
+            <w:tabs>
+              <w:tab w:val="left" w:pos="960"/>
+              <w:tab w:val="right" w:leader="dot" w:pos="9628"/>
+            </w:tabs>
+            <w:rPr>
+              <w:rFonts w:asciiTheme="minorHAnsi" w:eastAsiaTheme="minorEastAsia" w:hAnsiTheme="minorHAnsi"/>
+              <w:noProof/>
+              <w:sz w:val="24"/>
+              <w:lang w:eastAsia="cs-CZ"/>
+            </w:rPr>
+          </w:pPr>
+          <w:hyperlink w:anchor="_Toc226556246" w:history="1">
+            <w:r>
+              <w:rPr>
+                <w:rStyle w:val="Hypertextovodkaz"/>
+                <w:noProof/>
+              </w:rPr>
+              <w:t>2.5.</w:t>
+            </w:r>
+            <w:r>
+              <w:rPr>
+                <w:rFonts w:asciiTheme="minorHAnsi" w:eastAsiaTheme="minorEastAsia" w:hAnsiTheme="minorHAnsi"/>
+                <w:noProof/>
+                <w:sz w:val="24"/>
+                <w:lang w:eastAsia="cs-CZ"/>
+              </w:rPr>
+              <w:tab/>
+            </w:r>
+            <w:r>
+              <w:rPr>
+                <w:rStyle w:val="Hypertextovodkaz"/>
+                <w:noProof/>
+              </w:rPr>
+              <w:t>Formulář pro vytváření nových návyků</w:t>
+            </w:r>
+            <w:r>
+              <w:rPr>
+                <w:noProof/>
+                <w:webHidden/>
+              </w:rPr>
+              <w:tab/>
+            </w:r>
+            <w:r>
+              <w:rPr>
+                <w:noProof/>
+                <w:webHidden/>
+              </w:rPr>
+              <w:fldChar w:fldCharType="begin"/>
+            </w:r>
+            <w:r>
+              <w:rPr>
+                <w:noProof/>
+                <w:webHidden/>
+              </w:rPr>
+              <w:instrText xml:space="preserve"> PAGEREF _Toc226556246 \h </w:instrText>
+            </w:r>
+            <w:r>
+              <w:rPr>
+                <w:noProof/>
+                <w:webHidden/>
+              </w:rPr>
+            </w:r>
+            <w:r>
+              <w:rPr>
+                <w:noProof/>
+                <w:webHidden/>
+              </w:rPr>
+              <w:fldChar w:fldCharType="separate"/>
+            </w:r>
+            <w:r>
+              <w:rPr>
+                <w:noProof/>
+                <w:webHidden/>
+              </w:rPr>
+              <w:t>14</w:t>
+            </w:r>
+            <w:r>
+              <w:rPr>
+                <w:noProof/>
+                <w:webHidden/>
+              </w:rPr>
+              <w:fldChar w:fldCharType="end"/>
+            </w:r>
+          </w:hyperlink>
+        </w:p>
+        <w:p>
+          <w:pPr>
+            <w:pStyle w:val="Obsah2"/>
+            <w:tabs>
+              <w:tab w:val="left" w:pos="960"/>
+              <w:tab w:val="right" w:leader="dot" w:pos="9628"/>
+            </w:tabs>
+            <w:rPr>
+              <w:rFonts w:asciiTheme="minorHAnsi" w:eastAsiaTheme="minorEastAsia" w:hAnsiTheme="minorHAnsi"/>
+              <w:noProof/>
+              <w:sz w:val="24"/>
+              <w:lang w:eastAsia="cs-CZ"/>
+            </w:rPr>
+          </w:pPr>
+          <w:hyperlink w:anchor="_Toc226556247" w:history="1">
+            <w:r>
+              <w:rPr>
+                <w:rStyle w:val="Hypertextovodkaz"/>
+                <w:noProof/>
+              </w:rPr>
+              <w:t>2.6.</w:t>
+            </w:r>
+            <w:r>
+              <w:rPr>
+                <w:rFonts w:asciiTheme="minorHAnsi" w:eastAsiaTheme="minorEastAsia" w:hAnsiTheme="minorHAnsi"/>
+                <w:noProof/>
+                <w:sz w:val="24"/>
+                <w:lang w:eastAsia="cs-CZ"/>
+              </w:rPr>
+              <w:tab/>
+            </w:r>
+            <w:r>
+              <w:rPr>
+                <w:rStyle w:val="Hypertextovodkaz"/>
+                <w:noProof/>
+              </w:rPr>
+              <w:t>Seznamy návyků</w:t>
+            </w:r>
+            <w:r>
+              <w:rPr>
+                <w:noProof/>
+                <w:webHidden/>
+              </w:rPr>
+              <w:tab/>
+            </w:r>
+            <w:r>
+              <w:rPr>
+                <w:noProof/>
+                <w:webHidden/>
+              </w:rPr>
+              <w:fldChar w:fldCharType="begin"/>
+            </w:r>
+            <w:r>
+              <w:rPr>
+                <w:noProof/>
+                <w:webHidden/>
+              </w:rPr>
+              <w:instrText xml:space="preserve"> PAGEREF _Toc226556247 \h </w:instrText>
+            </w:r>
+            <w:r>
+              <w:rPr>
+                <w:noProof/>
+                <w:webHidden/>
+              </w:rPr>
+            </w:r>
+            <w:r>
+              <w:rPr>
+                <w:noProof/>
+                <w:webHidden/>
+              </w:rPr>
+              <w:fldChar w:fldCharType="separate"/>
+            </w:r>
+            <w:r>
+              <w:rPr>
+                <w:noProof/>
+                <w:webHidden/>
+              </w:rPr>
+              <w:t>14</w:t>
+            </w:r>
+            <w:r>
+              <w:rPr>
+                <w:noProof/>
+                <w:webHidden/>
+              </w:rPr>
+              <w:fldChar w:fldCharType="end"/>
+            </w:r>
+          </w:hyperlink>
+        </w:p>
+        <w:p>
+          <w:pPr>
+            <w:pStyle w:val="Obsah2"/>
+            <w:tabs>
+              <w:tab w:val="left" w:pos="960"/>
+              <w:tab w:val="right" w:leader="dot" w:pos="9628"/>
+            </w:tabs>
+            <w:rPr>
+              <w:rFonts w:asciiTheme="minorHAnsi" w:eastAsiaTheme="minorEastAsia" w:hAnsiTheme="minorHAnsi"/>
+              <w:noProof/>
+              <w:sz w:val="24"/>
+              <w:lang w:eastAsia="cs-CZ"/>
+            </w:rPr>
+          </w:pPr>
+          <w:hyperlink w:anchor="_Toc226556248" w:history="1">
+            <w:r>
+              <w:rPr>
+                <w:rStyle w:val="Hypertextovodkaz"/>
+                <w:noProof/>
+              </w:rPr>
+              <w:t>2.7.</w:t>
+            </w:r>
+            <w:r>
+              <w:rPr>
+                <w:rFonts w:asciiTheme="minorHAnsi" w:eastAsiaTheme="minorEastAsia" w:hAnsiTheme="minorHAnsi"/>
+                <w:noProof/>
+                <w:sz w:val="24"/>
+                <w:lang w:eastAsia="cs-CZ"/>
+              </w:rPr>
+              <w:tab/>
+            </w:r>
+            <w:r>
+              <w:rPr>
+                <w:rStyle w:val="Hypertextovodkaz"/>
+                <w:noProof/>
+              </w:rPr>
+              <w:t>Vizualizace plnění návyku</w:t>
+            </w:r>
+            <w:r>
+              <w:rPr>
+                <w:noProof/>
+                <w:webHidden/>
+              </w:rPr>
+              <w:tab/>
+            </w:r>
+            <w:r>
+              <w:rPr>
+                <w:noProof/>
+                <w:webHidden/>
+              </w:rPr>
+              <w:fldChar w:fldCharType="begin"/>
+            </w:r>
+            <w:r>
+              <w:rPr>
+                <w:noProof/>
+                <w:webHidden/>
+              </w:rPr>
+              <w:instrText xml:space="preserve"> PAGEREF _Toc226556248 \h </w:instrText>
+            </w:r>
+            <w:r>
+              <w:rPr>
+                <w:noProof/>
+                <w:webHidden/>
+              </w:rPr>
+            </w:r>
+            <w:r>
+              <w:rPr>
+                <w:noProof/>
+                <w:webHidden/>
+              </w:rPr>
+              <w:fldChar w:fldCharType="separate"/>
+            </w:r>
+            <w:r>
+              <w:rPr>
+                <w:noProof/>
+                <w:webHidden/>
+              </w:rPr>
+              <w:t>14</w:t>
+            </w:r>
+            <w:r>
+              <w:rPr>
+                <w:noProof/>
+                <w:webHidden/>
+              </w:rPr>
+              <w:fldChar w:fldCharType="end"/>
+            </w:r>
+          </w:hyperlink>
+        </w:p>
+        <w:p>
+          <w:pPr>
+            <w:pStyle w:val="Obsah2"/>
+            <w:tabs>
+              <w:tab w:val="left" w:pos="960"/>
+              <w:tab w:val="right" w:leader="dot" w:pos="9628"/>
+            </w:tabs>
+            <w:rPr>
+              <w:rFonts w:asciiTheme="minorHAnsi" w:eastAsiaTheme="minorEastAsia" w:hAnsiTheme="minorHAnsi"/>
+              <w:noProof/>
+              <w:sz w:val="24"/>
+              <w:lang w:eastAsia="cs-CZ"/>
+            </w:rPr>
+          </w:pPr>
+          <w:hyperlink w:anchor="_Toc226556249" w:history="1">
+            <w:r>
+              <w:rPr>
+                <w:rStyle w:val="Hypertextovodkaz"/>
+                <w:noProof/>
+              </w:rPr>
+              <w:t>2.8.</w:t>
+            </w:r>
+            <w:r>
+              <w:rPr>
+                <w:rFonts w:asciiTheme="minorHAnsi" w:eastAsiaTheme="minorEastAsia" w:hAnsiTheme="minorHAnsi"/>
+                <w:noProof/>
+                <w:sz w:val="24"/>
+                <w:lang w:eastAsia="cs-CZ"/>
+              </w:rPr>
+              <w:tab/>
+            </w:r>
+            <w:r>
+              <w:rPr>
+                <w:rStyle w:val="Hypertextovodkaz"/>
+                <w:noProof/>
+              </w:rPr>
+              <w:t>Styling a responzivita aplikace</w:t>
+            </w:r>
+            <w:r>
+              <w:rPr>
+                <w:noProof/>
+                <w:webHidden/>
+              </w:rPr>
+              <w:tab/>
+            </w:r>
+            <w:r>
+              <w:rPr>
+                <w:noProof/>
+                <w:webHidden/>
+              </w:rPr>
+              <w:fldChar w:fldCharType="begin"/>
+            </w:r>
+            <w:r>
+              <w:rPr>
+                <w:noProof/>
+                <w:webHidden/>
+              </w:rPr>
+              <w:instrText xml:space="preserve"> PAGEREF _Toc226556249 \h </w:instrText>
+            </w:r>
+            <w:r>
+              <w:rPr>
+                <w:noProof/>
+                <w:webHidden/>
+              </w:rPr>
+            </w:r>
+            <w:r>
+              <w:rPr>
+                <w:noProof/>
+                <w:webHidden/>
+              </w:rPr>
+              <w:fldChar w:fldCharType="separate"/>
+            </w:r>
+            <w:r>
+              <w:rPr>
+                <w:noProof/>
+                <w:webHidden/>
+              </w:rPr>
+              <w:t>14</w:t>
+            </w:r>
+            <w:r>
+              <w:rPr>
+                <w:noProof/>
+                <w:webHidden/>
+              </w:rPr>
+              <w:fldChar w:fldCharType="end"/>
+            </w:r>
+          </w:hyperlink>
+        </w:p>
+        <w:p>
+          <w:pPr>
+            <w:pStyle w:val="Obsah2"/>
+            <w:tabs>
+              <w:tab w:val="left" w:pos="960"/>
+              <w:tab w:val="right" w:leader="dot" w:pos="9628"/>
+            </w:tabs>
+            <w:rPr>
+              <w:rFonts w:asciiTheme="minorHAnsi" w:eastAsiaTheme="minorEastAsia" w:hAnsiTheme="minorHAnsi"/>
+              <w:noProof/>
+              <w:sz w:val="24"/>
+              <w:lang w:eastAsia="cs-CZ"/>
+            </w:rPr>
+          </w:pPr>
+          <w:hyperlink w:anchor="_Toc226556250" w:history="1">
+            <w:r>
+              <w:rPr>
+                <w:rStyle w:val="Hypertextovodkaz"/>
+                <w:noProof/>
+              </w:rPr>
+              <w:t>2.9.</w:t>
+            </w:r>
+            <w:r>
+              <w:rPr>
+                <w:rFonts w:asciiTheme="minorHAnsi" w:eastAsiaTheme="minorEastAsia" w:hAnsiTheme="minorHAnsi"/>
+                <w:noProof/>
+                <w:sz w:val="24"/>
+                <w:lang w:eastAsia="cs-CZ"/>
+              </w:rPr>
+              <w:tab/>
+            </w:r>
+            <w:r>
+              <w:rPr>
+                <w:rStyle w:val="Hypertextovodkaz"/>
+                <w:noProof/>
+              </w:rPr>
+              <w:t>Optimalizace</w:t>
+            </w:r>
+            <w:r>
+              <w:rPr>
+                <w:noProof/>
+                <w:webHidden/>
+              </w:rPr>
+              <w:tab/>
+            </w:r>
+            <w:r>
+              <w:rPr>
+                <w:noProof/>
+                <w:webHidden/>
+              </w:rPr>
+              <w:fldChar w:fldCharType="begin"/>
+            </w:r>
+            <w:r>
+              <w:rPr>
+                <w:noProof/>
+                <w:webHidden/>
+              </w:rPr>
+              <w:instrText xml:space="preserve"> PAGEREF _Toc226556250 \h </w:instrText>
+            </w:r>
+            <w:r>
+              <w:rPr>
+                <w:noProof/>
+                <w:webHidden/>
+              </w:rPr>
+            </w:r>
+            <w:r>
+              <w:rPr>
+                <w:noProof/>
+                <w:webHidden/>
+              </w:rPr>
+              <w:fldChar w:fldCharType="separate"/>
+            </w:r>
+            <w:r>
+              <w:rPr>
+                <w:noProof/>
+                <w:webHidden/>
+              </w:rPr>
+              <w:t>14</w:t>
+            </w:r>
+            <w:r>
+              <w:rPr>
+                <w:noProof/>
+                <w:webHidden/>
+              </w:rPr>
+              <w:fldChar w:fldCharType="end"/>
+            </w:r>
+          </w:hyperlink>
+        </w:p>
+        <w:p>
+          <w:pPr>
+            <w:pStyle w:val="Obsah2"/>
+            <w:tabs>
+              <w:tab w:val="left" w:pos="960"/>
+              <w:tab w:val="right" w:leader="dot" w:pos="9628"/>
+            </w:tabs>
+            <w:rPr>
+              <w:rFonts w:asciiTheme="minorHAnsi" w:eastAsiaTheme="minorEastAsia" w:hAnsiTheme="minorHAnsi"/>
+              <w:noProof/>
+              <w:sz w:val="24"/>
+              <w:lang w:eastAsia="cs-CZ"/>
+            </w:rPr>
+          </w:pPr>
+          <w:hyperlink w:anchor="_Toc226556251" w:history="1">
+            <w:r>
+              <w:rPr>
+                <w:rStyle w:val="Hypertextovodkaz"/>
+                <w:noProof/>
+              </w:rPr>
+              <w:t>2.10.</w:t>
+            </w:r>
+            <w:r>
+              <w:rPr>
+                <w:rFonts w:asciiTheme="minorHAnsi" w:eastAsiaTheme="minorEastAsia" w:hAnsiTheme="minorHAnsi"/>
+                <w:noProof/>
+                <w:sz w:val="24"/>
+                <w:lang w:eastAsia="cs-CZ"/>
+              </w:rPr>
+              <w:tab/>
+            </w:r>
+            <w:r>
+              <w:rPr>
+                <w:rStyle w:val="Hypertextovodkaz"/>
+                <w:noProof/>
+              </w:rPr>
               <w:t>Zkušenosti nabrané z této práce</w:t>
             </w:r>
             <w:r>
@@ -2760,7 +4497,7 @@
                 <w:noProof/>
                 <w:webHidden/>
               </w:rPr>
-              <w:instrText xml:space="preserve"> PAGEREF _Toc223513777 \h </w:instrText>
+              <w:instrText xml:space="preserve"> PAGEREF _Toc226556251 \h </w:instrText>
             </w:r>
             <w:r>
               <w:rPr>
@@ -2780,7 +4517,7 @@
                 <w:noProof/>
                 <w:webHidden/>
               </w:rPr>
-              <w:t>12</w:t>
+              <w:t>14</w:t>
             </w:r>
             <w:r>
               <w:rPr>
@@ -2804,7 +4541,7 @@
               <w:lang w:eastAsia="cs-CZ"/>
             </w:rPr>
           </w:pPr>
-          <w:hyperlink w:anchor="_Toc223513778" w:history="1">
+          <w:hyperlink w:anchor="_Toc226556252" w:history="1">
             <w:r>
               <w:rPr>
                 <w:rStyle w:val="Hypertextovodkaz"/>
@@ -2831,7 +4568,7 @@
                 <w:noProof/>
                 <w:webHidden/>
               </w:rPr>
-              <w:instrText xml:space="preserve"> PAGEREF _Toc223513778 \h </w:instrText>
+              <w:instrText xml:space="preserve"> PAGEREF _Toc226556252 \h </w:instrText>
             </w:r>
             <w:r>
               <w:rPr>
@@ -2851,7 +4588,7 @@
                 <w:noProof/>
                 <w:webHidden/>
               </w:rPr>
-              <w:t>13</w:t>
+              <w:t>15</w:t>
             </w:r>
             <w:r>
               <w:rPr>
@@ -2861,6 +4598,375 @@
               <w:fldChar w:fldCharType="end"/>
             </w:r>
           </w:hyperlink>
+        </w:p>
+        <w:p>
+          <w:pPr>
+            <w:pStyle w:val="Obsah1"/>
+            <w:tabs>
+              <w:tab w:val="right" w:leader="dot" w:pos="9628"/>
+            </w:tabs>
+            <w:rPr>
+              <w:rFonts w:asciiTheme="minorHAnsi" w:eastAsiaTheme="minorEastAsia" w:hAnsiTheme="minorHAnsi"/>
+              <w:noProof/>
+              <w:sz w:val="24"/>
+              <w:lang w:eastAsia="cs-CZ"/>
+            </w:rPr>
+          </w:pPr>
+          <w:hyperlink w:anchor="_Toc226556253" w:history="1">
+            <w:r>
+              <w:rPr>
+                <w:rStyle w:val="Hypertextovodkaz"/>
+                <w:noProof/>
+              </w:rPr>
+              <w:t>Použitá literatura</w:t>
+            </w:r>
+            <w:r>
+              <w:rPr>
+                <w:noProof/>
+                <w:webHidden/>
+              </w:rPr>
+              <w:tab/>
+            </w:r>
+            <w:r>
+              <w:rPr>
+                <w:noProof/>
+                <w:webHidden/>
+              </w:rPr>
+              <w:fldChar w:fldCharType="begin"/>
+            </w:r>
+            <w:r>
+              <w:rPr>
+                <w:noProof/>
+                <w:webHidden/>
+              </w:rPr>
+              <w:instrText xml:space="preserve"> PAGEREF _Toc226556253 \h </w:instrText>
+            </w:r>
+            <w:r>
+              <w:rPr>
+                <w:noProof/>
+                <w:webHidden/>
+              </w:rPr>
+            </w:r>
+            <w:r>
+              <w:rPr>
+                <w:noProof/>
+                <w:webHidden/>
+              </w:rPr>
+              <w:fldChar w:fldCharType="separate"/>
+            </w:r>
+            <w:r>
+              <w:rPr>
+                <w:noProof/>
+                <w:webHidden/>
+              </w:rPr>
+              <w:t>16</w:t>
+            </w:r>
+            <w:r>
+              <w:rPr>
+                <w:noProof/>
+                <w:webHidden/>
+              </w:rPr>
+              <w:fldChar w:fldCharType="end"/>
+            </w:r>
+          </w:hyperlink>
+        </w:p>
+        <w:p>
+          <w:pPr>
+            <w:pStyle w:val="Obsah1"/>
+            <w:tabs>
+              <w:tab w:val="right" w:leader="dot" w:pos="9628"/>
+            </w:tabs>
+            <w:rPr>
+              <w:rFonts w:asciiTheme="minorHAnsi" w:eastAsiaTheme="minorEastAsia" w:hAnsiTheme="minorHAnsi"/>
+              <w:noProof/>
+              <w:sz w:val="24"/>
+              <w:lang w:eastAsia="cs-CZ"/>
+            </w:rPr>
+          </w:pPr>
+          <w:hyperlink w:anchor="_Toc226556254" w:history="1">
+            <w:r>
+              <w:rPr>
+                <w:rStyle w:val="Hypertextovodkaz"/>
+                <w:noProof/>
+              </w:rPr>
+              <w:t>Seznam obrázků</w:t>
+            </w:r>
+            <w:r>
+              <w:rPr>
+                <w:noProof/>
+                <w:webHidden/>
+              </w:rPr>
+              <w:tab/>
+            </w:r>
+            <w:r>
+              <w:rPr>
+                <w:noProof/>
+                <w:webHidden/>
+              </w:rPr>
+              <w:fldChar w:fldCharType="begin"/>
+            </w:r>
+            <w:r>
+              <w:rPr>
+                <w:noProof/>
+                <w:webHidden/>
+              </w:rPr>
+              <w:instrText xml:space="preserve"> PAGEREF _Toc226556254 \h </w:instrText>
+            </w:r>
+            <w:r>
+              <w:rPr>
+                <w:noProof/>
+                <w:webHidden/>
+              </w:rPr>
+            </w:r>
+            <w:r>
+              <w:rPr>
+                <w:noProof/>
+                <w:webHidden/>
+              </w:rPr>
+              <w:fldChar w:fldCharType="separate"/>
+            </w:r>
+            <w:r>
+              <w:rPr>
+                <w:noProof/>
+                <w:webHidden/>
+              </w:rPr>
+              <w:t>17</w:t>
+            </w:r>
+            <w:r>
+              <w:rPr>
+                <w:noProof/>
+                <w:webHidden/>
+              </w:rPr>
+              <w:fldChar w:fldCharType="end"/>
+            </w:r>
+          </w:hyperlink>
+        </w:p>
+        <w:p>
+          <w:pPr>
+            <w:pStyle w:val="Obsah1"/>
+            <w:tabs>
+              <w:tab w:val="right" w:leader="dot" w:pos="9628"/>
+            </w:tabs>
+            <w:rPr>
+              <w:rFonts w:asciiTheme="minorHAnsi" w:eastAsiaTheme="minorEastAsia" w:hAnsiTheme="minorHAnsi"/>
+              <w:noProof/>
+              <w:sz w:val="24"/>
+              <w:lang w:eastAsia="cs-CZ"/>
+            </w:rPr>
+          </w:pPr>
+          <w:hyperlink w:anchor="_Toc226556255" w:history="1">
+            <w:r>
+              <w:rPr>
+                <w:rStyle w:val="Hypertextovodkaz"/>
+                <w:noProof/>
+              </w:rPr>
+              <w:t>Seznam tabulek</w:t>
+            </w:r>
+            <w:r>
+              <w:rPr>
+                <w:noProof/>
+                <w:webHidden/>
+              </w:rPr>
+              <w:tab/>
+            </w:r>
+            <w:r>
+              <w:rPr>
+                <w:noProof/>
+                <w:webHidden/>
+              </w:rPr>
+              <w:fldChar w:fldCharType="begin"/>
+            </w:r>
+            <w:r>
+              <w:rPr>
+                <w:noProof/>
+                <w:webHidden/>
+              </w:rPr>
+              <w:instrText xml:space="preserve"> PAGEREF _Toc226556255 \h </w:instrText>
+            </w:r>
+            <w:r>
+              <w:rPr>
+                <w:noProof/>
+                <w:webHidden/>
+              </w:rPr>
+            </w:r>
+            <w:r>
+              <w:rPr>
+                <w:noProof/>
+                <w:webHidden/>
+              </w:rPr>
+              <w:fldChar w:fldCharType="separate"/>
+            </w:r>
+            <w:r>
+              <w:rPr>
+                <w:noProof/>
+                <w:webHidden/>
+              </w:rPr>
+              <w:t>18</w:t>
+            </w:r>
+            <w:r>
+              <w:rPr>
+                <w:noProof/>
+                <w:webHidden/>
+              </w:rPr>
+              <w:fldChar w:fldCharType="end"/>
+            </w:r>
+          </w:hyperlink>
+        </w:p>
+        <w:p>
+          <w:pPr>
+            <w:pStyle w:val="Obsah1"/>
+            <w:tabs>
+              <w:tab w:val="right" w:leader="dot" w:pos="9628"/>
+            </w:tabs>
+            <w:rPr>
+              <w:rFonts w:asciiTheme="minorHAnsi" w:eastAsiaTheme="minorEastAsia" w:hAnsiTheme="minorHAnsi"/>
+              <w:noProof/>
+              <w:sz w:val="24"/>
+              <w:lang w:eastAsia="cs-CZ"/>
+            </w:rPr>
+          </w:pPr>
+          <w:hyperlink w:anchor="_Toc226556256" w:history="1">
+            <w:r>
+              <w:rPr>
+                <w:rStyle w:val="Hypertextovodkaz"/>
+                <w:noProof/>
+              </w:rPr>
+              <w:t>Seznam příloh</w:t>
+            </w:r>
+            <w:r>
+              <w:rPr>
+                <w:noProof/>
+                <w:webHidden/>
+              </w:rPr>
+              <w:tab/>
+            </w:r>
+            <w:r>
+              <w:rPr>
+                <w:noProof/>
+                <w:webHidden/>
+              </w:rPr>
+              <w:fldChar w:fldCharType="begin"/>
+            </w:r>
+            <w:r>
+              <w:rPr>
+                <w:noProof/>
+                <w:webHidden/>
+              </w:rPr>
+              <w:instrText xml:space="preserve"> PAGEREF _Toc226556256 \h </w:instrText>
+            </w:r>
+            <w:r>
+              <w:rPr>
+                <w:noProof/>
+                <w:webHidden/>
+              </w:rPr>
+            </w:r>
+            <w:r>
+              <w:rPr>
+                <w:noProof/>
+                <w:webHidden/>
+              </w:rPr>
+              <w:fldChar w:fldCharType="separate"/>
+            </w:r>
+            <w:r>
+              <w:rPr>
+                <w:noProof/>
+                <w:webHidden/>
+              </w:rPr>
+              <w:t>19</w:t>
+            </w:r>
+            <w:r>
+              <w:rPr>
+                <w:noProof/>
+                <w:webHidden/>
+              </w:rPr>
+              <w:fldChar w:fldCharType="end"/>
+            </w:r>
+          </w:hyperlink>
+        </w:p>
+        <w:p>
+          <w:pPr>
+            <w:pStyle w:val="Obsah1"/>
+            <w:tabs>
+              <w:tab w:val="right" w:leader="dot" w:pos="9628"/>
+            </w:tabs>
+            <w:rPr>
+              <w:rFonts w:asciiTheme="minorHAnsi" w:eastAsiaTheme="minorEastAsia" w:hAnsiTheme="minorHAnsi"/>
+              <w:noProof/>
+              <w:sz w:val="24"/>
+              <w:lang w:eastAsia="cs-CZ"/>
+            </w:rPr>
+          </w:pPr>
+          <w:hyperlink w:anchor="_Toc226556257" w:history="1">
+            <w:r>
+              <w:rPr>
+                <w:rStyle w:val="Hypertextovodkaz"/>
+                <w:noProof/>
+              </w:rPr>
+              <w:t>Přílohy</w:t>
+            </w:r>
+            <w:r>
+              <w:rPr>
+                <w:noProof/>
+                <w:webHidden/>
+              </w:rPr>
+              <w:tab/>
+            </w:r>
+            <w:r>
+              <w:rPr>
+                <w:noProof/>
+                <w:webHidden/>
+              </w:rPr>
+              <w:fldChar w:fldCharType="begin"/>
+            </w:r>
+            <w:r>
+              <w:rPr>
+                <w:noProof/>
+                <w:webHidden/>
+              </w:rPr>
+              <w:instrText xml:space="preserve"> PAGEREF _Toc226556257 \h </w:instrText>
+            </w:r>
+            <w:r>
+              <w:rPr>
+                <w:noProof/>
+                <w:webHidden/>
+              </w:rPr>
+            </w:r>
+            <w:r>
+              <w:rPr>
+                <w:noProof/>
+                <w:webHidden/>
+              </w:rPr>
+              <w:fldChar w:fldCharType="separate"/>
+            </w:r>
+            <w:r>
+              <w:rPr>
+                <w:noProof/>
+                <w:webHidden/>
+              </w:rPr>
+              <w:t>20</w:t>
+            </w:r>
+            <w:r>
+              <w:rPr>
+                <w:noProof/>
+                <w:webHidden/>
+              </w:rPr>
+              <w:fldChar w:fldCharType="end"/>
+            </w:r>
+          </w:hyperlink>
+        </w:p>
+        <w:p>
+          <w:pPr>
+            <w:pStyle w:val="Obsah1"/>
+            <w:tabs>
+              <w:tab w:val="right" w:leader="dot" w:pos="9628"/>
+            </w:tabs>
+            <w:rPr>
+              <w:rFonts w:asciiTheme="minorHAnsi" w:eastAsiaTheme="minorEastAsia" w:hAnsiTheme="minorHAnsi"/>
+              <w:noProof/>
+              <w:sz w:val="24"/>
+              <w:lang w:eastAsia="cs-CZ"/>
+            </w:rPr>
+          </w:pPr>
           <w:r>
             <w:rPr>
               <w:b/>
@@ -2889,25 +4995,28 @@
         </w:numPr>
         <w:ind w:left="720"/>
       </w:pPr>
-      <w:bookmarkStart w:id="27" w:name="_Toc223513767"/>
+      <w:bookmarkStart w:id="30" w:name="_Toc226556221"/>
       <w:r>
         <w:lastRenderedPageBreak/>
         <w:t>Úvod</w:t>
       </w:r>
-      <w:bookmarkEnd w:id="27"/>
-    </w:p>
-    <w:p>
-      <w:r>
-        <w:t>V této zrychlené a zvláštní době, která si ráda vyžaduje vysoké nároky od každého z</w:t>
-      </w:r>
-      <w:r>
-        <w:t> </w:t>
-      </w:r>
-      <w:r>
-        <w:t>nás</w:t>
-      </w:r>
-      <w:r>
-        <w:t>, hlavně na produktivitu a sebekázeň, se budování a tvarování návyků stává čím dál více aktuálním a důležitým tématem. Schopnost efektivního řízení své každodenní rutiny a eliminace nežádoucích zlozvyků je považována za jeden z klíčových pilířů osobního rozvoje a klidu. S neustále rostoucí digitalizací se přirozeně navyšuje i poptávka po nástrojích a aplikacích, které tento zdánlivě jednoduchý proces usnadňují a pomáhá ho dělat přehlednějším než kdy dřív.</w:t>
+      <w:bookmarkEnd w:id="30"/>
+    </w:p>
+    <w:p>
+      <w:r>
+        <w:t>V této zrychlené a zvláštní době, která si vyžaduje</w:t>
+      </w:r>
+      <w:r>
+        <w:t xml:space="preserve"> někdy až moc</w:t>
+      </w:r>
+      <w:r>
+        <w:t xml:space="preserve"> vysoké nároky od</w:t>
+      </w:r>
+      <w:r>
+        <w:t xml:space="preserve"> každého z nás</w:t>
+      </w:r>
+      <w:r>
+        <w:t>, se budování a tvarování návyků stává čím dál více aktuálním a důležitým tématem. Schopnost efektivního řízení své každodenní rutiny a eliminace nežádoucích zlozvyků je považována za jeden z klíčových pilířů osobního rozvoje a klidu. S neustále rostoucí digitalizací se přirozeně navyšuje i poptávka po nástrojích a aplikacích, které tento zdánlivě jednoduchý proces usnadňují a pomáhá ho dělat přehlednějším než kdy dřív.</w:t>
       </w:r>
     </w:p>
     <w:p>
@@ -2949,7 +5058,19 @@
         <w:t>Habit-Tracker</w:t>
       </w:r>
       <w:r>
-        <w:t xml:space="preserve"> aplikace, architekturou jednotlivých komponent a logikou ukládání dat pro uživatele. </w:t>
+        <w:t xml:space="preserve"> aplikace, architekturou jednotlivých komponent a logikou </w:t>
+      </w:r>
+      <w:r>
+        <w:t>„</w:t>
+      </w:r>
+      <w:r>
+        <w:t>ukládání</w:t>
+      </w:r>
+      <w:r>
+        <w:t>“</w:t>
+      </w:r>
+      <w:r>
+        <w:t xml:space="preserve"> dat pro uživatele. </w:t>
       </w:r>
     </w:p>
     <w:p>
@@ -2965,7 +5086,7 @@
       <w:pPr>
         <w:pStyle w:val="Nadpis1"/>
       </w:pPr>
-      <w:bookmarkStart w:id="28" w:name="_Toc223513768"/>
+      <w:bookmarkStart w:id="31" w:name="_Toc226556222"/>
       <w:r>
         <w:lastRenderedPageBreak/>
         <w:t>Teoretická čás</w:t>
@@ -2973,7 +5094,7 @@
       <w:r>
         <w:t>t</w:t>
       </w:r>
-      <w:bookmarkEnd w:id="28"/>
+      <w:bookmarkEnd w:id="31"/>
     </w:p>
     <w:p>
       <w:r>
@@ -2990,11 +5111,11 @@
       <w:pPr>
         <w:pStyle w:val="Nadpis2"/>
       </w:pPr>
-      <w:bookmarkStart w:id="29" w:name="_Toc223513769"/>
+      <w:bookmarkStart w:id="32" w:name="_Toc226556223"/>
       <w:r>
         <w:t>Visual Studio Code</w:t>
       </w:r>
-      <w:bookmarkEnd w:id="29"/>
+      <w:bookmarkEnd w:id="32"/>
     </w:p>
     <w:p>
       <w:r>
@@ -3029,9 +5150,11 @@
       <w:pPr>
         <w:pStyle w:val="Nadpis3"/>
       </w:pPr>
+      <w:bookmarkStart w:id="33" w:name="_Toc226556224"/>
       <w:r>
         <w:t>Školní zkušenost</w:t>
       </w:r>
+      <w:bookmarkEnd w:id="33"/>
     </w:p>
     <w:p>
       <w:r>
@@ -3066,9 +5189,11 @@
       <w:pPr>
         <w:pStyle w:val="Nadpis3"/>
       </w:pPr>
+      <w:bookmarkStart w:id="34" w:name="_Toc226556225"/>
       <w:r>
         <w:t>Integrovaný terminál</w:t>
       </w:r>
+      <w:bookmarkEnd w:id="34"/>
     </w:p>
     <w:p>
       <w:r>
@@ -3109,12 +5234,14 @@
       <w:pPr>
         <w:pStyle w:val="Nadpis3"/>
       </w:pPr>
+      <w:bookmarkStart w:id="35" w:name="_Toc226556226"/>
       <w:r>
         <w:t>Rozšíření</w:t>
       </w:r>
       <w:r>
         <w:t xml:space="preserve"> prostředí</w:t>
       </w:r>
+      <w:bookmarkEnd w:id="35"/>
     </w:p>
     <w:p>
       <w:r>
@@ -3140,9 +5267,11 @@
       <w:pPr>
         <w:pStyle w:val="Nadpis3"/>
       </w:pPr>
+      <w:bookmarkStart w:id="36" w:name="_Toc226556227"/>
       <w:r>
         <w:t>Git podpora</w:t>
       </w:r>
+      <w:bookmarkEnd w:id="36"/>
     </w:p>
     <w:p>
       <w:r>
@@ -3162,16 +5291,16 @@
       <w:pPr>
         <w:pStyle w:val="Nadpis2"/>
       </w:pPr>
-      <w:bookmarkStart w:id="30" w:name="_Angular"/>
-      <w:bookmarkStart w:id="31" w:name="_Toc223513770"/>
-      <w:bookmarkEnd w:id="30"/>
+      <w:bookmarkStart w:id="37" w:name="_Angular"/>
+      <w:bookmarkStart w:id="38" w:name="_Toc226556228"/>
+      <w:bookmarkEnd w:id="37"/>
       <w:r>
         <w:t>Angula</w:t>
       </w:r>
       <w:r>
         <w:t>r</w:t>
       </w:r>
-      <w:bookmarkEnd w:id="31"/>
+      <w:bookmarkEnd w:id="38"/>
     </w:p>
     <w:p>
       <w:r>
@@ -3206,10 +5335,12 @@
       <w:pPr>
         <w:pStyle w:val="Nadpis3"/>
       </w:pPr>
+      <w:bookmarkStart w:id="39" w:name="_Toc226556229"/>
       <w:r>
         <w:lastRenderedPageBreak/>
         <w:t>TypeScript</w:t>
       </w:r>
+      <w:bookmarkEnd w:id="39"/>
     </w:p>
     <w:p>
       <w:r>
@@ -3226,9 +5357,11 @@
       <w:pPr>
         <w:pStyle w:val="Nadpis3"/>
       </w:pPr>
+      <w:bookmarkStart w:id="40" w:name="_Toc226556230"/>
       <w:r>
         <w:t>Komponentová architektura</w:t>
       </w:r>
+      <w:bookmarkEnd w:id="40"/>
     </w:p>
     <w:p>
       <w:r>
@@ -3248,9 +5381,11 @@
       <w:pPr>
         <w:pStyle w:val="Nadpis3"/>
       </w:pPr>
+      <w:bookmarkStart w:id="41" w:name="_Toc226556231"/>
       <w:r>
         <w:t>Services &amp; Dependency Injection</w:t>
       </w:r>
+      <w:bookmarkEnd w:id="41"/>
     </w:p>
     <w:p>
       <w:r>
@@ -3270,9 +5405,11 @@
       <w:pPr>
         <w:pStyle w:val="Nadpis3"/>
       </w:pPr>
+      <w:bookmarkStart w:id="42" w:name="_Toc226556232"/>
       <w:r>
         <w:t>Angular CLI</w:t>
       </w:r>
+      <w:bookmarkEnd w:id="42"/>
     </w:p>
     <w:p>
       <w:r>
@@ -3289,38 +5426,32 @@
       <w:pPr>
         <w:pStyle w:val="Nadpis2"/>
       </w:pPr>
-      <w:bookmarkStart w:id="32" w:name="_Toc223513771"/>
+      <w:bookmarkStart w:id="43" w:name="_Toc226556233"/>
       <w:r>
         <w:t>Angular Material</w:t>
       </w:r>
-      <w:bookmarkEnd w:id="32"/>
+      <w:bookmarkEnd w:id="43"/>
     </w:p>
     <w:p>
       <w:r>
         <w:t xml:space="preserve">Pro co nejlepší zajištění profesionálního vzhledu a velmi vysoké úrovně uživatelské přívětivosti, používám v projektu integrovanou knihovnu Angular Material. Angular Material je oficiální sada komponent, které byly navrhnuty podle principu Material Designu od společnosti Google. Tento systém zajistí konzistenci z vizuální stránky napříč celým </w:t>
       </w:r>
       <w:r>
-        <w:t>Habit-</w:t>
-      </w:r>
-      <w:proofErr w:type="spellStart"/>
-      <w:r>
-        <w:t>Tracker</w:t>
-      </w:r>
-      <w:r>
-        <w:t>em</w:t>
-      </w:r>
-      <w:proofErr w:type="spellEnd"/>
-      <w:r>
-        <w:t>.</w:t>
+        <w:t>Habit-Tracker</w:t>
+      </w:r>
+      <w:r>
+        <w:t>em.</w:t>
       </w:r>
     </w:p>
     <w:p>
       <w:pPr>
         <w:pStyle w:val="Nadpis3"/>
       </w:pPr>
+      <w:bookmarkStart w:id="44" w:name="_Toc226556234"/>
       <w:r>
         <w:t>Karty a panely</w:t>
       </w:r>
+      <w:bookmarkEnd w:id="44"/>
     </w:p>
     <w:p>
       <w:r>
@@ -3337,9 +5468,11 @@
       <w:pPr>
         <w:pStyle w:val="Nadpis3"/>
       </w:pPr>
+      <w:bookmarkStart w:id="45" w:name="_Toc226556235"/>
       <w:r>
         <w:t>Formulářové prvky a ikony</w:t>
       </w:r>
+      <w:bookmarkEnd w:id="45"/>
     </w:p>
     <w:p>
       <w:r>
@@ -3377,7 +5510,7 @@
       <w:pPr>
         <w:pStyle w:val="Nadpis2"/>
       </w:pPr>
-      <w:bookmarkStart w:id="33" w:name="_Toc223513772"/>
+      <w:bookmarkStart w:id="46" w:name="_Toc226556236"/>
       <w:r>
         <w:lastRenderedPageBreak/>
         <w:t>Sass CSS</w:t>
@@ -3391,7 +5524,7 @@
       <w:r>
         <w:t>)</w:t>
       </w:r>
-      <w:bookmarkEnd w:id="33"/>
+      <w:bookmarkEnd w:id="46"/>
     </w:p>
     <w:p>
       <w:r>
@@ -3441,9 +5574,11 @@
       <w:pPr>
         <w:pStyle w:val="Nadpis3"/>
       </w:pPr>
+      <w:bookmarkStart w:id="47" w:name="_Toc226556237"/>
       <w:r>
         <w:t>Variables</w:t>
       </w:r>
+      <w:bookmarkEnd w:id="47"/>
     </w:p>
     <w:p>
       <w:r>
@@ -3454,9 +5589,11 @@
       <w:pPr>
         <w:pStyle w:val="Nadpis3"/>
       </w:pPr>
+      <w:bookmarkStart w:id="48" w:name="_Toc226556238"/>
       <w:r>
         <w:t>Nesting</w:t>
       </w:r>
+      <w:bookmarkEnd w:id="48"/>
     </w:p>
     <w:p>
       <w:r>
@@ -3467,19 +5604,19 @@
       <w:pPr>
         <w:pStyle w:val="Nadpis3"/>
       </w:pPr>
+      <w:bookmarkStart w:id="49" w:name="_Toc226556239"/>
       <w:r>
         <w:t>Mixiny</w:t>
       </w:r>
+      <w:bookmarkEnd w:id="49"/>
     </w:p>
     <w:p>
       <w:r>
         <w:t xml:space="preserve">Když se někde v kódu objevují opakování stejných vizuálních efektů a píšeme aplikaci s SCSS, pomohou v zabránění tohoto problému Mixiny. Šablony, které jsou implementované na místa, kde se tyto vizuální efekty </w:t>
       </w:r>
-      <w:proofErr w:type="gramStart"/>
-      <w:r>
-        <w:t>objevují  V</w:t>
-      </w:r>
-      <w:proofErr w:type="gramEnd"/>
+      <w:r>
+        <w:t>objevují V</w:t>
+      </w:r>
       <w:r>
         <w:t> </w:t>
       </w:r>
@@ -3487,24 +5624,56 @@
         <w:t>Habit-Tracker</w:t>
       </w:r>
       <w:r>
-        <w:t>u tyto šablony aplikujeme po příkladě pro definici stínů karet s návyky (box-</w:t>
+        <w:t>u tyto šablony aplikujeme po příkladě pro definici stínů karet s návyky (box-shadow) nebo dále třeba pro nastavení responzivních bodů (media queries). Tento způsob nám zajistí naprostou vizuální konzistenci napříč celým Habit Trackem bez žádné nutnosti vícenásobného kopírování stejných bloků kódu.</w:t>
+      </w:r>
+    </w:p>
+    <w:p>
+      <w:pPr>
+        <w:pStyle w:val="Nadpis2"/>
+      </w:pPr>
+      <w:bookmarkStart w:id="50" w:name="_Toc226556240"/>
+      <w:r>
+        <w:t>Netlify</w:t>
+      </w:r>
+      <w:bookmarkEnd w:id="50"/>
+    </w:p>
+    <w:p>
+      <w:r>
+        <w:t>V minulosti mě vždycky zajímalo, jak bych mohl dostat své aplikace na web. Protože tohle není moje první single-</w:t>
       </w:r>
       <w:proofErr w:type="spellStart"/>
       <w:r>
-        <w:t>shadow</w:t>
+        <w:t>page</w:t>
       </w:r>
       <w:proofErr w:type="spellEnd"/>
       <w:r>
-        <w:t xml:space="preserve">) nebo dále třeba pro nastavení responzivních bodů (media </w:t>
+        <w:t xml:space="preserve"> aplikace, kterou jsem kdy dělal, </w:t>
+      </w:r>
+      <w:r>
+        <w:t>zjistil jsem</w:t>
+      </w:r>
+      <w:r>
+        <w:t>, že webová stránka Netlify mi</w:t>
+      </w:r>
+      <w:r>
+        <w:t xml:space="preserve"> s tímto problémem</w:t>
+      </w:r>
+      <w:r>
+        <w:t xml:space="preserve"> zadarmo a velice jednoduše pomůže</w:t>
+      </w:r>
+      <w:r>
+        <w:t xml:space="preserve">. Existuje možnost přidání databáze v Netlify, ale jelikož moje projekty jako třeba Habit-Tracker databázi nevyužívají, tato vymoženost nebude </w:t>
       </w:r>
       <w:proofErr w:type="spellStart"/>
       <w:r>
-        <w:t>queries</w:t>
+        <w:t>nutna</w:t>
       </w:r>
       <w:proofErr w:type="spellEnd"/>
       <w:r>
-        <w:t>). Tento způsob nám zajistí naprostou vizuální konzistenci napříč celým Habit Trackem bez žádné nutnosti vícenásobného kopírování stejných bloků kódu.</w:t>
-      </w:r>
+        <w:t xml:space="preserve"> řešit.</w:t>
+      </w:r>
+    </w:p>
+    <w:p>
       <w:r>
         <w:br w:type="page"/>
       </w:r>
@@ -3513,7 +5682,7 @@
       <w:pPr>
         <w:pStyle w:val="Nadpis1"/>
       </w:pPr>
-      <w:bookmarkStart w:id="34" w:name="_Toc223513773"/>
+      <w:bookmarkStart w:id="51" w:name="_Toc226556241"/>
       <w:r>
         <w:lastRenderedPageBreak/>
         <w:t>Praktická</w:t>
@@ -3521,7 +5690,7 @@
       <w:r>
         <w:t xml:space="preserve"> část</w:t>
       </w:r>
-      <w:bookmarkEnd w:id="34"/>
+      <w:bookmarkEnd w:id="51"/>
     </w:p>
     <w:p>
       <w:r>
@@ -3536,93 +5705,117 @@
       <w:r>
         <w:t>u.</w:t>
       </w:r>
+      <w:r>
+        <w:t xml:space="preserve"> Kapitoly této sekce budou věnovány jednotlivým částem vývoje</w:t>
+      </w:r>
     </w:p>
     <w:p>
       <w:pPr>
         <w:pStyle w:val="Nadpis2"/>
       </w:pPr>
-      <w:bookmarkStart w:id="35" w:name="_Toc223513774"/>
+      <w:bookmarkStart w:id="52" w:name="_Toc226556242"/>
       <w:r>
         <w:t xml:space="preserve">Příprava </w:t>
       </w:r>
-      <w:bookmarkEnd w:id="35"/>
       <w:r>
         <w:t>repositáře</w:t>
       </w:r>
+      <w:bookmarkEnd w:id="52"/>
+    </w:p>
+    <w:p>
+      <w:r>
+        <w:t xml:space="preserve">Úplně první věc, která byla nutná pro verzování Habit-Trackeru je prosté založení GitHub repositáře. Tento repositář se jmenuje úplně stejně jako </w:t>
+      </w:r>
     </w:p>
     <w:p>
       <w:pPr>
         <w:pStyle w:val="Nadpis2"/>
       </w:pPr>
+      <w:bookmarkStart w:id="53" w:name="_Toc226556243"/>
       <w:r>
         <w:t>První kroky před vývojem</w:t>
       </w:r>
+      <w:bookmarkEnd w:id="53"/>
     </w:p>
     <w:p>
       <w:pPr>
         <w:pStyle w:val="Nadpis2"/>
       </w:pPr>
+      <w:bookmarkStart w:id="54" w:name="_Toc226556244"/>
       <w:r>
         <w:t>Modelovaní dat a služby</w:t>
       </w:r>
+      <w:bookmarkEnd w:id="54"/>
     </w:p>
     <w:p>
       <w:pPr>
         <w:pStyle w:val="Nadpis2"/>
       </w:pPr>
+      <w:bookmarkStart w:id="55" w:name="_Toc226556245"/>
       <w:r>
         <w:t>Hlavní UI a navigace</w:t>
       </w:r>
+      <w:bookmarkEnd w:id="55"/>
     </w:p>
     <w:p>
       <w:pPr>
         <w:pStyle w:val="Nadpis2"/>
       </w:pPr>
+      <w:bookmarkStart w:id="56" w:name="_Toc226556246"/>
       <w:r>
         <w:t>Formulář pro vytváření nových návyků</w:t>
       </w:r>
+      <w:bookmarkEnd w:id="56"/>
     </w:p>
     <w:p>
       <w:pPr>
         <w:pStyle w:val="Nadpis2"/>
       </w:pPr>
+      <w:bookmarkStart w:id="57" w:name="_Toc226556247"/>
       <w:r>
         <w:t>Seznamy návyků</w:t>
       </w:r>
+      <w:bookmarkEnd w:id="57"/>
     </w:p>
     <w:p>
       <w:pPr>
         <w:pStyle w:val="Nadpis2"/>
       </w:pPr>
+      <w:bookmarkStart w:id="58" w:name="_Toc226556248"/>
       <w:r>
         <w:t>Vizualizace plnění návyku</w:t>
       </w:r>
+      <w:bookmarkEnd w:id="58"/>
     </w:p>
     <w:p>
       <w:pPr>
         <w:pStyle w:val="Nadpis2"/>
       </w:pPr>
+      <w:bookmarkStart w:id="59" w:name="_Toc226556249"/>
       <w:r>
         <w:t>Styling a responzivita aplikace</w:t>
       </w:r>
+      <w:bookmarkEnd w:id="59"/>
     </w:p>
     <w:p>
       <w:pPr>
         <w:pStyle w:val="Nadpis2"/>
       </w:pPr>
+      <w:bookmarkStart w:id="60" w:name="_Toc226556250"/>
       <w:r>
         <w:t>Optimalizace</w:t>
       </w:r>
+      <w:bookmarkEnd w:id="60"/>
     </w:p>
     <w:p>
       <w:pPr>
         <w:pStyle w:val="Nadpis2"/>
       </w:pPr>
-      <w:bookmarkStart w:id="36" w:name="_Toc223513777"/>
+      <w:bookmarkStart w:id="61" w:name="_Toc226556251"/>
       <w:r>
         <w:t>Zkušenosti nabrané z této práce</w:t>
       </w:r>
-      <w:bookmarkEnd w:id="36"/>
+      <w:bookmarkEnd w:id="61"/>
     </w:p>
     <w:p>
       <w:pPr>
@@ -3642,12 +5835,12 @@
         </w:numPr>
         <w:ind w:left="720"/>
       </w:pPr>
-      <w:bookmarkStart w:id="37" w:name="_Toc223513778"/>
+      <w:bookmarkStart w:id="62" w:name="_Toc226556252"/>
       <w:r>
         <w:lastRenderedPageBreak/>
         <w:t>Závěr</w:t>
       </w:r>
-      <w:bookmarkEnd w:id="37"/>
+      <w:bookmarkEnd w:id="62"/>
       <w:r>
         <w:br w:type="page"/>
       </w:r>
@@ -3661,14 +5854,16 @@
         </w:numPr>
         <w:ind w:left="720"/>
       </w:pPr>
-      <w:bookmarkStart w:id="38" w:name="_Toc222315302"/>
-      <w:bookmarkStart w:id="39" w:name="_Toc223513779"/>
+      <w:bookmarkStart w:id="63" w:name="_Toc222315302"/>
+      <w:bookmarkStart w:id="64" w:name="_Toc223513779"/>
+      <w:bookmarkStart w:id="65" w:name="_Toc226556253"/>
       <w:r>
         <w:lastRenderedPageBreak/>
         <w:t>Použitá literatura</w:t>
       </w:r>
-      <w:bookmarkEnd w:id="38"/>
-      <w:bookmarkEnd w:id="39"/>
+      <w:bookmarkEnd w:id="63"/>
+      <w:bookmarkEnd w:id="64"/>
+      <w:bookmarkEnd w:id="65"/>
     </w:p>
     <w:p>
       <w:pPr>
@@ -3712,14 +5907,16 @@
         </w:numPr>
         <w:ind w:left="720"/>
       </w:pPr>
-      <w:bookmarkStart w:id="40" w:name="_Toc222315303"/>
-      <w:bookmarkStart w:id="41" w:name="_Toc223513780"/>
+      <w:bookmarkStart w:id="66" w:name="_Toc222315303"/>
+      <w:bookmarkStart w:id="67" w:name="_Toc223513780"/>
+      <w:bookmarkStart w:id="68" w:name="_Toc226556254"/>
       <w:r>
         <w:lastRenderedPageBreak/>
         <w:t>Seznam obrázků</w:t>
       </w:r>
-      <w:bookmarkEnd w:id="40"/>
-      <w:bookmarkEnd w:id="41"/>
+      <w:bookmarkEnd w:id="66"/>
+      <w:bookmarkEnd w:id="67"/>
+      <w:bookmarkEnd w:id="68"/>
     </w:p>
     <w:p>
       <w:pPr>
@@ -3739,14 +5936,16 @@
         </w:numPr>
         <w:ind w:left="720"/>
       </w:pPr>
-      <w:bookmarkStart w:id="42" w:name="_Toc222315304"/>
-      <w:bookmarkStart w:id="43" w:name="_Toc223513781"/>
+      <w:bookmarkStart w:id="69" w:name="_Toc222315304"/>
+      <w:bookmarkStart w:id="70" w:name="_Toc223513781"/>
+      <w:bookmarkStart w:id="71" w:name="_Toc226556255"/>
       <w:r>
         <w:lastRenderedPageBreak/>
         <w:t>Seznam tabulek</w:t>
       </w:r>
-      <w:bookmarkEnd w:id="42"/>
-      <w:bookmarkEnd w:id="43"/>
+      <w:bookmarkEnd w:id="69"/>
+      <w:bookmarkEnd w:id="70"/>
+      <w:bookmarkEnd w:id="71"/>
     </w:p>
     <w:p>
       <w:pPr>
@@ -3766,14 +5965,16 @@
         </w:numPr>
         <w:ind w:left="720"/>
       </w:pPr>
-      <w:bookmarkStart w:id="44" w:name="_Toc222315305"/>
-      <w:bookmarkStart w:id="45" w:name="_Toc223513782"/>
+      <w:bookmarkStart w:id="72" w:name="_Toc222315305"/>
+      <w:bookmarkStart w:id="73" w:name="_Toc223513782"/>
+      <w:bookmarkStart w:id="74" w:name="_Toc226556256"/>
       <w:r>
         <w:lastRenderedPageBreak/>
         <w:t>Seznam příloh</w:t>
       </w:r>
-      <w:bookmarkEnd w:id="44"/>
-      <w:bookmarkEnd w:id="45"/>
+      <w:bookmarkEnd w:id="72"/>
+      <w:bookmarkEnd w:id="73"/>
+      <w:bookmarkEnd w:id="74"/>
     </w:p>
     <w:p>
       <w:r>
@@ -3825,14 +6026,16 @@
         </w:numPr>
         <w:ind w:left="720"/>
       </w:pPr>
-      <w:bookmarkStart w:id="46" w:name="_Toc222315306"/>
-      <w:bookmarkStart w:id="47" w:name="_Toc223513783"/>
+      <w:bookmarkStart w:id="75" w:name="_Toc222315306"/>
+      <w:bookmarkStart w:id="76" w:name="_Toc223513783"/>
+      <w:bookmarkStart w:id="77" w:name="_Toc226556257"/>
       <w:r>
         <w:lastRenderedPageBreak/>
         <w:t>Přílohy</w:t>
       </w:r>
-      <w:bookmarkEnd w:id="46"/>
-      <w:bookmarkEnd w:id="47"/>
+      <w:bookmarkEnd w:id="75"/>
+      <w:bookmarkEnd w:id="76"/>
+      <w:bookmarkEnd w:id="77"/>
     </w:p>
     <w:p>
       <w:r>
@@ -7708,6 +9911,19 @@
       <w:sz w:val="22"/>
     </w:rPr>
   </w:style>
+  <w:style w:type="paragraph" w:styleId="Obsah3">
+    <w:name w:val="toc 3"/>
+    <w:basedOn w:val="Normln"/>
+    <w:next w:val="Normln"/>
+    <w:autoRedefine/>
+    <w:uiPriority w:val="39"/>
+    <w:unhideWhenUsed/>
+    <w:rsid w:val="00AF422D"/>
+    <w:pPr>
+      <w:spacing w:after="100"/>
+      <w:ind w:left="440"/>
+    </w:pPr>
+  </w:style>
 </w:styles>
 </file>
 
@@ -8007,26 +10223,10 @@
 </file>
 
 <file path=customXml/item1.xml><?xml version="1.0" encoding="utf-8"?>
-<?mso-contentType ?>
-<FormTemplates xmlns="http://schemas.microsoft.com/sharepoint/v3/contenttype/forms">
-  <Display>DocumentLibraryForm</Display>
-  <Edit>DocumentLibraryForm</Edit>
-  <New>DocumentLibraryForm</New>
-</FormTemplates>
+<b:Sources xmlns:b="http://schemas.openxmlformats.org/officeDocument/2006/bibliography" xmlns="http://schemas.openxmlformats.org/officeDocument/2006/bibliography" SelectedStyle="\APASixthEditionOfficeOnline.xsl" StyleName="APA" Version="6"/>
 </file>
 
 <file path=customXml/item2.xml><?xml version="1.0" encoding="utf-8"?>
-<p:properties xmlns:p="http://schemas.microsoft.com/office/2006/metadata/properties" xmlns:xsi="http://www.w3.org/2001/XMLSchema-instance" xmlns:pc="http://schemas.microsoft.com/office/infopath/2007/PartnerControls">
-  <documentManagement>
-    <TaxCatchAll xmlns="9069f8e3-06b5-4841-af59-bd496f6fbcdc" xsi:nil="true"/>
-    <lcf76f155ced4ddcb4097134ff3c332f xmlns="ac4d9f64-92e6-40df-bbe5-cbf691cfe8ae">
-      <Terms xmlns="http://schemas.microsoft.com/office/infopath/2007/PartnerControls"/>
-    </lcf76f155ced4ddcb4097134ff3c332f>
-  </documentManagement>
-</p:properties>
-</file>
-
-<file path=customXml/item3.xml><?xml version="1.0" encoding="utf-8"?>
 <ct:contentTypeSchema xmlns:ct="http://schemas.microsoft.com/office/2006/metadata/contentType" xmlns:ma="http://schemas.microsoft.com/office/2006/metadata/properties/metaAttributes" ct:_="" ma:_="" ma:contentTypeName="Dokument" ma:contentTypeID="0x0101007AC253A931DA3842A9467F19871E2C1B" ma:contentTypeVersion="10" ma:contentTypeDescription="Vytvoří nový dokument" ma:contentTypeScope="" ma:versionID="9dbcdc17d608927f05e31a50324249a7">
   <xsd:schema xmlns:xsd="http://www.w3.org/2001/XMLSchema" xmlns:xs="http://www.w3.org/2001/XMLSchema" xmlns:p="http://schemas.microsoft.com/office/2006/metadata/properties" xmlns:ns2="ac4d9f64-92e6-40df-bbe5-cbf691cfe8ae" xmlns:ns3="9069f8e3-06b5-4841-af59-bd496f6fbcdc" targetNamespace="http://schemas.microsoft.com/office/2006/metadata/properties" ma:root="true" ma:fieldsID="fb3d1d1e590abe5f5a4ef74e9b43408f" ns2:_="" ns3:_="">
     <xsd:import namespace="ac4d9f64-92e6-40df-bbe5-cbf691cfe8ae"/>
@@ -8215,30 +10415,35 @@
 </ct:contentTypeSchema>
 </file>
 
+<file path=customXml/item3.xml><?xml version="1.0" encoding="utf-8"?>
+<p:properties xmlns:p="http://schemas.microsoft.com/office/2006/metadata/properties" xmlns:xsi="http://www.w3.org/2001/XMLSchema-instance" xmlns:pc="http://schemas.microsoft.com/office/infopath/2007/PartnerControls">
+  <documentManagement>
+    <TaxCatchAll xmlns="9069f8e3-06b5-4841-af59-bd496f6fbcdc" xsi:nil="true"/>
+    <lcf76f155ced4ddcb4097134ff3c332f xmlns="ac4d9f64-92e6-40df-bbe5-cbf691cfe8ae">
+      <Terms xmlns="http://schemas.microsoft.com/office/infopath/2007/PartnerControls"/>
+    </lcf76f155ced4ddcb4097134ff3c332f>
+  </documentManagement>
+</p:properties>
+</file>
+
 <file path=customXml/item4.xml><?xml version="1.0" encoding="utf-8"?>
-<b:Sources xmlns:b="http://schemas.openxmlformats.org/officeDocument/2006/bibliography" xmlns="http://schemas.openxmlformats.org/officeDocument/2006/bibliography" SelectedStyle="\APASixthEditionOfficeOnline.xsl" StyleName="APA" Version="6"/>
+<?mso-contentType ?>
+<FormTemplates xmlns="http://schemas.microsoft.com/sharepoint/v3/contenttype/forms">
+  <Display>DocumentLibraryForm</Display>
+  <Edit>DocumentLibraryForm</Edit>
+  <New>DocumentLibraryForm</New>
+</FormTemplates>
 </file>
 
 <file path=customXml/itemProps1.xml><?xml version="1.0" encoding="utf-8"?>
-<ds:datastoreItem xmlns:ds="http://schemas.openxmlformats.org/officeDocument/2006/customXml" ds:itemID="{E8FDF9F9-0BC5-4BD9-96CC-E3BC62E19A62}">
+<ds:datastoreItem xmlns:ds="http://schemas.openxmlformats.org/officeDocument/2006/customXml" ds:itemID="{E0BB6427-4419-4C21-A0DF-4471F23995B6}">
   <ds:schemaRefs>
-    <ds:schemaRef ds:uri="http://schemas.microsoft.com/sharepoint/v3/contenttype/forms"/>
+    <ds:schemaRef ds:uri="http://schemas.openxmlformats.org/officeDocument/2006/bibliography"/>
   </ds:schemaRefs>
 </ds:datastoreItem>
 </file>
 
 <file path=customXml/itemProps2.xml><?xml version="1.0" encoding="utf-8"?>
-<ds:datastoreItem xmlns:ds="http://schemas.openxmlformats.org/officeDocument/2006/customXml" ds:itemID="{FB1D83C0-C8CC-4C35-B0E6-D4B15A08C6B5}">
-  <ds:schemaRefs>
-    <ds:schemaRef ds:uri="http://schemas.microsoft.com/office/2006/metadata/properties"/>
-    <ds:schemaRef ds:uri="http://schemas.microsoft.com/office/infopath/2007/PartnerControls"/>
-    <ds:schemaRef ds:uri="9069f8e3-06b5-4841-af59-bd496f6fbcdc"/>
-    <ds:schemaRef ds:uri="ac4d9f64-92e6-40df-bbe5-cbf691cfe8ae"/>
-  </ds:schemaRefs>
-</ds:datastoreItem>
-</file>
-
-<file path=customXml/itemProps3.xml><?xml version="1.0" encoding="utf-8"?>
 <ds:datastoreItem xmlns:ds="http://schemas.openxmlformats.org/officeDocument/2006/customXml" ds:itemID="{D5874249-D0BB-47A2-ADCE-DE87B2259BE8}">
   <ds:schemaRefs>
     <ds:schemaRef ds:uri="http://schemas.microsoft.com/office/2006/metadata/contentType"/>
@@ -8257,10 +10462,21 @@
 </ds:datastoreItem>
 </file>
 
+<file path=customXml/itemProps3.xml><?xml version="1.0" encoding="utf-8"?>
+<ds:datastoreItem xmlns:ds="http://schemas.openxmlformats.org/officeDocument/2006/customXml" ds:itemID="{FB1D83C0-C8CC-4C35-B0E6-D4B15A08C6B5}">
+  <ds:schemaRefs>
+    <ds:schemaRef ds:uri="http://schemas.microsoft.com/office/2006/metadata/properties"/>
+    <ds:schemaRef ds:uri="http://schemas.microsoft.com/office/infopath/2007/PartnerControls"/>
+    <ds:schemaRef ds:uri="9069f8e3-06b5-4841-af59-bd496f6fbcdc"/>
+    <ds:schemaRef ds:uri="ac4d9f64-92e6-40df-bbe5-cbf691cfe8ae"/>
+  </ds:schemaRefs>
+</ds:datastoreItem>
+</file>
+
 <file path=customXml/itemProps4.xml><?xml version="1.0" encoding="utf-8"?>
-<ds:datastoreItem xmlns:ds="http://schemas.openxmlformats.org/officeDocument/2006/customXml" ds:itemID="{E0BB6427-4419-4C21-A0DF-4471F23995B6}">
+<ds:datastoreItem xmlns:ds="http://schemas.openxmlformats.org/officeDocument/2006/customXml" ds:itemID="{E8FDF9F9-0BC5-4BD9-96CC-E3BC62E19A62}">
   <ds:schemaRefs>
-    <ds:schemaRef ds:uri="http://schemas.openxmlformats.org/officeDocument/2006/bibliography"/>
+    <ds:schemaRef ds:uri="http://schemas.microsoft.com/sharepoint/v3/contenttype/forms"/>
   </ds:schemaRefs>
 </ds:datastoreItem>
 </file>
</xml_diff>

<commit_message>
feat: enhance habit form validation and error handling, improve UI for habit display, and update empty state messaging
</commit_message>
<xml_diff>
--- a/Barta_rocnikova_prace.docx
+++ b/Barta_rocnikova_prace.docx
@@ -5639,21 +5639,37 @@
     </w:p>
     <w:p>
       <w:r>
-        <w:t>V minulosti mě vždycky zajímalo, jak bych mohl dostat své aplikace na web. Protože tohle není moje první single-</w:t>
-      </w:r>
-      <w:proofErr w:type="spellStart"/>
-      <w:r>
-        <w:t>page</w:t>
-      </w:r>
-      <w:proofErr w:type="spellEnd"/>
-      <w:r>
-        <w:t xml:space="preserve"> aplikace, kterou jsem kdy dělal, </w:t>
+        <w:t>V</w:t>
+      </w:r>
+      <w:r>
+        <w:t> </w:t>
+      </w:r>
+      <w:r>
+        <w:t>minulosti</w:t>
+      </w:r>
+      <w:r>
+        <w:t>, když jsme ve škole začínali s vývojem webových aplikacích přes JS</w:t>
+      </w:r>
+      <w:r>
+        <w:t xml:space="preserve"> mě vždycky zajímalo, jak bych mohl dostat své aplikace na web. Protože tohle není moje první single-page aplikace, kterou jsem </w:t>
+      </w:r>
+      <w:r>
+        <w:t>u</w:t>
+      </w:r>
+      <w:r>
+        <w:t xml:space="preserve">dělal, </w:t>
       </w:r>
       <w:r>
         <w:t>zjistil jsem</w:t>
       </w:r>
       <w:r>
-        <w:t>, že webová stránka Netlify mi</w:t>
+        <w:t>, že webová s</w:t>
+      </w:r>
+      <w:r>
+        <w:t>tránka a zároveň služba</w:t>
+      </w:r>
+      <w:r>
+        <w:t xml:space="preserve"> Netlify mi</w:t>
       </w:r>
       <w:r>
         <w:t xml:space="preserve"> s tímto problémem</w:t>
@@ -5662,15 +5678,25 @@
         <w:t xml:space="preserve"> zadarmo a velice jednoduše pomůže</w:t>
       </w:r>
       <w:r>
-        <w:t xml:space="preserve">. Existuje možnost přidání databáze v Netlify, ale jelikož moje projekty jako třeba Habit-Tracker databázi nevyužívají, tato vymoženost nebude </w:t>
-      </w:r>
-      <w:proofErr w:type="spellStart"/>
-      <w:r>
-        <w:t>nutna</w:t>
-      </w:r>
-      <w:proofErr w:type="spellEnd"/>
-      <w:r>
-        <w:t xml:space="preserve"> řešit.</w:t>
+        <w:t xml:space="preserve">. Existuje možnost přidání databáze v Netlify, ale jelikož moje projekty jako třeba </w:t>
+      </w:r>
+      <w:r>
+        <w:t xml:space="preserve">tento </w:t>
+      </w:r>
+      <w:r>
+        <w:t>Habit-Tracker databázi nevyužívají, t</w:t>
+      </w:r>
+      <w:r>
+        <w:t>uto možnost jsem ještě zatím ani sám ne</w:t>
+      </w:r>
+      <w:r>
+        <w:t>řeši</w:t>
+      </w:r>
+      <w:r>
+        <w:t>l</w:t>
+      </w:r>
+      <w:r>
+        <w:t>.</w:t>
       </w:r>
     </w:p>
     <w:p>
@@ -5708,32 +5734,25 @@
       <w:r>
         <w:t xml:space="preserve"> Kapitoly této sekce budou věnovány jednotlivým částem vývoje</w:t>
       </w:r>
+      <w:bookmarkStart w:id="52" w:name="_Toc226556244"/>
     </w:p>
     <w:p>
       <w:pPr>
         <w:pStyle w:val="Nadpis2"/>
       </w:pPr>
-      <w:bookmarkStart w:id="52" w:name="_Toc226556242"/>
-      <w:r>
-        <w:t xml:space="preserve">Příprava </w:t>
-      </w:r>
-      <w:r>
-        <w:t>repositáře</w:t>
+      <w:r>
+        <w:t>Modelovaní dat a služby</w:t>
       </w:r>
       <w:bookmarkEnd w:id="52"/>
     </w:p>
-    <w:p>
-      <w:r>
-        <w:t xml:space="preserve">Úplně první věc, která byla nutná pro verzování Habit-Trackeru je prosté založení GitHub repositáře. Tento repositář se jmenuje úplně stejně jako </w:t>
-      </w:r>
-    </w:p>
+    <w:p/>
     <w:p>
       <w:pPr>
         <w:pStyle w:val="Nadpis2"/>
       </w:pPr>
-      <w:bookmarkStart w:id="53" w:name="_Toc226556243"/>
-      <w:r>
-        <w:t>První kroky před vývojem</w:t>
+      <w:bookmarkStart w:id="53" w:name="_Toc226556245"/>
+      <w:r>
+        <w:t>Hlavní UI a navigace</w:t>
       </w:r>
       <w:bookmarkEnd w:id="53"/>
     </w:p>
@@ -5741,9 +5760,9 @@
       <w:pPr>
         <w:pStyle w:val="Nadpis2"/>
       </w:pPr>
-      <w:bookmarkStart w:id="54" w:name="_Toc226556244"/>
-      <w:r>
-        <w:t>Modelovaní dat a služby</w:t>
+      <w:bookmarkStart w:id="54" w:name="_Toc226556246"/>
+      <w:r>
+        <w:t>Formulář pro vytváření nových návyků</w:t>
       </w:r>
       <w:bookmarkEnd w:id="54"/>
     </w:p>
@@ -5751,9 +5770,9 @@
       <w:pPr>
         <w:pStyle w:val="Nadpis2"/>
       </w:pPr>
-      <w:bookmarkStart w:id="55" w:name="_Toc226556245"/>
-      <w:r>
-        <w:t>Hlavní UI a navigace</w:t>
+      <w:bookmarkStart w:id="55" w:name="_Toc226556247"/>
+      <w:r>
+        <w:t>Seznamy návyků</w:t>
       </w:r>
       <w:bookmarkEnd w:id="55"/>
     </w:p>
@@ -5761,9 +5780,9 @@
       <w:pPr>
         <w:pStyle w:val="Nadpis2"/>
       </w:pPr>
-      <w:bookmarkStart w:id="56" w:name="_Toc226556246"/>
-      <w:r>
-        <w:t>Formulář pro vytváření nových návyků</w:t>
+      <w:bookmarkStart w:id="56" w:name="_Toc226556248"/>
+      <w:r>
+        <w:t>Vizualizace plnění návyku</w:t>
       </w:r>
       <w:bookmarkEnd w:id="56"/>
     </w:p>
@@ -5771,9 +5790,9 @@
       <w:pPr>
         <w:pStyle w:val="Nadpis2"/>
       </w:pPr>
-      <w:bookmarkStart w:id="57" w:name="_Toc226556247"/>
-      <w:r>
-        <w:t>Seznamy návyků</w:t>
+      <w:bookmarkStart w:id="57" w:name="_Toc226556249"/>
+      <w:r>
+        <w:t>Styling a responzivita aplikace</w:t>
       </w:r>
       <w:bookmarkEnd w:id="57"/>
     </w:p>
@@ -5781,9 +5800,9 @@
       <w:pPr>
         <w:pStyle w:val="Nadpis2"/>
       </w:pPr>
-      <w:bookmarkStart w:id="58" w:name="_Toc226556248"/>
-      <w:r>
-        <w:t>Vizualizace plnění návyku</w:t>
+      <w:bookmarkStart w:id="58" w:name="_Toc226556250"/>
+      <w:r>
+        <w:t>Optimalizace</w:t>
       </w:r>
       <w:bookmarkEnd w:id="58"/>
     </w:p>
@@ -5791,31 +5810,11 @@
       <w:pPr>
         <w:pStyle w:val="Nadpis2"/>
       </w:pPr>
-      <w:bookmarkStart w:id="59" w:name="_Toc226556249"/>
-      <w:r>
-        <w:t>Styling a responzivita aplikace</w:t>
+      <w:bookmarkStart w:id="59" w:name="_Toc226556251"/>
+      <w:r>
+        <w:t>Zkušenosti nabrané z této práce</w:t>
       </w:r>
       <w:bookmarkEnd w:id="59"/>
-    </w:p>
-    <w:p>
-      <w:pPr>
-        <w:pStyle w:val="Nadpis2"/>
-      </w:pPr>
-      <w:bookmarkStart w:id="60" w:name="_Toc226556250"/>
-      <w:r>
-        <w:t>Optimalizace</w:t>
-      </w:r>
-      <w:bookmarkEnd w:id="60"/>
-    </w:p>
-    <w:p>
-      <w:pPr>
-        <w:pStyle w:val="Nadpis2"/>
-      </w:pPr>
-      <w:bookmarkStart w:id="61" w:name="_Toc226556251"/>
-      <w:r>
-        <w:t>Zkušenosti nabrané z této práce</w:t>
-      </w:r>
-      <w:bookmarkEnd w:id="61"/>
     </w:p>
     <w:p>
       <w:pPr>
@@ -5835,12 +5834,12 @@
         </w:numPr>
         <w:ind w:left="720"/>
       </w:pPr>
-      <w:bookmarkStart w:id="62" w:name="_Toc226556252"/>
+      <w:bookmarkStart w:id="60" w:name="_Toc226556252"/>
       <w:r>
         <w:lastRenderedPageBreak/>
         <w:t>Závěr</w:t>
       </w:r>
-      <w:bookmarkEnd w:id="62"/>
+      <w:bookmarkEnd w:id="60"/>
       <w:r>
         <w:br w:type="page"/>
       </w:r>
@@ -5854,16 +5853,16 @@
         </w:numPr>
         <w:ind w:left="720"/>
       </w:pPr>
-      <w:bookmarkStart w:id="63" w:name="_Toc222315302"/>
-      <w:bookmarkStart w:id="64" w:name="_Toc223513779"/>
-      <w:bookmarkStart w:id="65" w:name="_Toc226556253"/>
+      <w:bookmarkStart w:id="61" w:name="_Toc222315302"/>
+      <w:bookmarkStart w:id="62" w:name="_Toc223513779"/>
+      <w:bookmarkStart w:id="63" w:name="_Toc226556253"/>
       <w:r>
         <w:lastRenderedPageBreak/>
         <w:t>Použitá literatura</w:t>
       </w:r>
+      <w:bookmarkEnd w:id="61"/>
+      <w:bookmarkEnd w:id="62"/>
       <w:bookmarkEnd w:id="63"/>
-      <w:bookmarkEnd w:id="64"/>
-      <w:bookmarkEnd w:id="65"/>
     </w:p>
     <w:p>
       <w:pPr>
@@ -5907,16 +5906,16 @@
         </w:numPr>
         <w:ind w:left="720"/>
       </w:pPr>
-      <w:bookmarkStart w:id="66" w:name="_Toc222315303"/>
-      <w:bookmarkStart w:id="67" w:name="_Toc223513780"/>
-      <w:bookmarkStart w:id="68" w:name="_Toc226556254"/>
+      <w:bookmarkStart w:id="64" w:name="_Toc222315303"/>
+      <w:bookmarkStart w:id="65" w:name="_Toc223513780"/>
+      <w:bookmarkStart w:id="66" w:name="_Toc226556254"/>
       <w:r>
         <w:lastRenderedPageBreak/>
         <w:t>Seznam obrázků</w:t>
       </w:r>
+      <w:bookmarkEnd w:id="64"/>
+      <w:bookmarkEnd w:id="65"/>
       <w:bookmarkEnd w:id="66"/>
-      <w:bookmarkEnd w:id="67"/>
-      <w:bookmarkEnd w:id="68"/>
     </w:p>
     <w:p>
       <w:pPr>
@@ -5936,16 +5935,16 @@
         </w:numPr>
         <w:ind w:left="720"/>
       </w:pPr>
-      <w:bookmarkStart w:id="69" w:name="_Toc222315304"/>
-      <w:bookmarkStart w:id="70" w:name="_Toc223513781"/>
-      <w:bookmarkStart w:id="71" w:name="_Toc226556255"/>
+      <w:bookmarkStart w:id="67" w:name="_Toc222315304"/>
+      <w:bookmarkStart w:id="68" w:name="_Toc223513781"/>
+      <w:bookmarkStart w:id="69" w:name="_Toc226556255"/>
       <w:r>
         <w:lastRenderedPageBreak/>
         <w:t>Seznam tabulek</w:t>
       </w:r>
+      <w:bookmarkEnd w:id="67"/>
+      <w:bookmarkEnd w:id="68"/>
       <w:bookmarkEnd w:id="69"/>
-      <w:bookmarkEnd w:id="70"/>
-      <w:bookmarkEnd w:id="71"/>
     </w:p>
     <w:p>
       <w:pPr>
@@ -5965,16 +5964,16 @@
         </w:numPr>
         <w:ind w:left="720"/>
       </w:pPr>
-      <w:bookmarkStart w:id="72" w:name="_Toc222315305"/>
-      <w:bookmarkStart w:id="73" w:name="_Toc223513782"/>
-      <w:bookmarkStart w:id="74" w:name="_Toc226556256"/>
+      <w:bookmarkStart w:id="70" w:name="_Toc222315305"/>
+      <w:bookmarkStart w:id="71" w:name="_Toc223513782"/>
+      <w:bookmarkStart w:id="72" w:name="_Toc226556256"/>
       <w:r>
         <w:lastRenderedPageBreak/>
         <w:t>Seznam příloh</w:t>
       </w:r>
+      <w:bookmarkEnd w:id="70"/>
+      <w:bookmarkEnd w:id="71"/>
       <w:bookmarkEnd w:id="72"/>
-      <w:bookmarkEnd w:id="73"/>
-      <w:bookmarkEnd w:id="74"/>
     </w:p>
     <w:p>
       <w:r>
@@ -6026,16 +6025,16 @@
         </w:numPr>
         <w:ind w:left="720"/>
       </w:pPr>
-      <w:bookmarkStart w:id="75" w:name="_Toc222315306"/>
-      <w:bookmarkStart w:id="76" w:name="_Toc223513783"/>
-      <w:bookmarkStart w:id="77" w:name="_Toc226556257"/>
+      <w:bookmarkStart w:id="73" w:name="_Toc222315306"/>
+      <w:bookmarkStart w:id="74" w:name="_Toc223513783"/>
+      <w:bookmarkStart w:id="75" w:name="_Toc226556257"/>
       <w:r>
         <w:lastRenderedPageBreak/>
         <w:t>Přílohy</w:t>
       </w:r>
+      <w:bookmarkEnd w:id="73"/>
+      <w:bookmarkEnd w:id="74"/>
       <w:bookmarkEnd w:id="75"/>
-      <w:bookmarkEnd w:id="76"/>
-      <w:bookmarkEnd w:id="77"/>
     </w:p>
     <w:p>
       <w:r>
@@ -10223,10 +10222,26 @@
 </file>
 
 <file path=customXml/item1.xml><?xml version="1.0" encoding="utf-8"?>
-<b:Sources xmlns:b="http://schemas.openxmlformats.org/officeDocument/2006/bibliography" xmlns="http://schemas.openxmlformats.org/officeDocument/2006/bibliography" SelectedStyle="\APASixthEditionOfficeOnline.xsl" StyleName="APA" Version="6"/>
+<?mso-contentType ?>
+<FormTemplates xmlns="http://schemas.microsoft.com/sharepoint/v3/contenttype/forms">
+  <Display>DocumentLibraryForm</Display>
+  <Edit>DocumentLibraryForm</Edit>
+  <New>DocumentLibraryForm</New>
+</FormTemplates>
 </file>
 
 <file path=customXml/item2.xml><?xml version="1.0" encoding="utf-8"?>
+<p:properties xmlns:p="http://schemas.microsoft.com/office/2006/metadata/properties" xmlns:xsi="http://www.w3.org/2001/XMLSchema-instance" xmlns:pc="http://schemas.microsoft.com/office/infopath/2007/PartnerControls">
+  <documentManagement>
+    <TaxCatchAll xmlns="9069f8e3-06b5-4841-af59-bd496f6fbcdc" xsi:nil="true"/>
+    <lcf76f155ced4ddcb4097134ff3c332f xmlns="ac4d9f64-92e6-40df-bbe5-cbf691cfe8ae">
+      <Terms xmlns="http://schemas.microsoft.com/office/infopath/2007/PartnerControls"/>
+    </lcf76f155ced4ddcb4097134ff3c332f>
+  </documentManagement>
+</p:properties>
+</file>
+
+<file path=customXml/item3.xml><?xml version="1.0" encoding="utf-8"?>
 <ct:contentTypeSchema xmlns:ct="http://schemas.microsoft.com/office/2006/metadata/contentType" xmlns:ma="http://schemas.microsoft.com/office/2006/metadata/properties/metaAttributes" ct:_="" ma:_="" ma:contentTypeName="Dokument" ma:contentTypeID="0x0101007AC253A931DA3842A9467F19871E2C1B" ma:contentTypeVersion="10" ma:contentTypeDescription="Vytvoří nový dokument" ma:contentTypeScope="" ma:versionID="9dbcdc17d608927f05e31a50324249a7">
   <xsd:schema xmlns:xsd="http://www.w3.org/2001/XMLSchema" xmlns:xs="http://www.w3.org/2001/XMLSchema" xmlns:p="http://schemas.microsoft.com/office/2006/metadata/properties" xmlns:ns2="ac4d9f64-92e6-40df-bbe5-cbf691cfe8ae" xmlns:ns3="9069f8e3-06b5-4841-af59-bd496f6fbcdc" targetNamespace="http://schemas.microsoft.com/office/2006/metadata/properties" ma:root="true" ma:fieldsID="fb3d1d1e590abe5f5a4ef74e9b43408f" ns2:_="" ns3:_="">
     <xsd:import namespace="ac4d9f64-92e6-40df-bbe5-cbf691cfe8ae"/>
@@ -10415,35 +10430,30 @@
 </ct:contentTypeSchema>
 </file>
 
-<file path=customXml/item3.xml><?xml version="1.0" encoding="utf-8"?>
-<p:properties xmlns:p="http://schemas.microsoft.com/office/2006/metadata/properties" xmlns:xsi="http://www.w3.org/2001/XMLSchema-instance" xmlns:pc="http://schemas.microsoft.com/office/infopath/2007/PartnerControls">
-  <documentManagement>
-    <TaxCatchAll xmlns="9069f8e3-06b5-4841-af59-bd496f6fbcdc" xsi:nil="true"/>
-    <lcf76f155ced4ddcb4097134ff3c332f xmlns="ac4d9f64-92e6-40df-bbe5-cbf691cfe8ae">
-      <Terms xmlns="http://schemas.microsoft.com/office/infopath/2007/PartnerControls"/>
-    </lcf76f155ced4ddcb4097134ff3c332f>
-  </documentManagement>
-</p:properties>
-</file>
-
 <file path=customXml/item4.xml><?xml version="1.0" encoding="utf-8"?>
-<?mso-contentType ?>
-<FormTemplates xmlns="http://schemas.microsoft.com/sharepoint/v3/contenttype/forms">
-  <Display>DocumentLibraryForm</Display>
-  <Edit>DocumentLibraryForm</Edit>
-  <New>DocumentLibraryForm</New>
-</FormTemplates>
+<b:Sources xmlns:b="http://schemas.openxmlformats.org/officeDocument/2006/bibliography" xmlns="http://schemas.openxmlformats.org/officeDocument/2006/bibliography" SelectedStyle="\APASixthEditionOfficeOnline.xsl" StyleName="APA" Version="6"/>
 </file>
 
 <file path=customXml/itemProps1.xml><?xml version="1.0" encoding="utf-8"?>
-<ds:datastoreItem xmlns:ds="http://schemas.openxmlformats.org/officeDocument/2006/customXml" ds:itemID="{E0BB6427-4419-4C21-A0DF-4471F23995B6}">
+<ds:datastoreItem xmlns:ds="http://schemas.openxmlformats.org/officeDocument/2006/customXml" ds:itemID="{E8FDF9F9-0BC5-4BD9-96CC-E3BC62E19A62}">
   <ds:schemaRefs>
-    <ds:schemaRef ds:uri="http://schemas.openxmlformats.org/officeDocument/2006/bibliography"/>
+    <ds:schemaRef ds:uri="http://schemas.microsoft.com/sharepoint/v3/contenttype/forms"/>
   </ds:schemaRefs>
 </ds:datastoreItem>
 </file>
 
 <file path=customXml/itemProps2.xml><?xml version="1.0" encoding="utf-8"?>
+<ds:datastoreItem xmlns:ds="http://schemas.openxmlformats.org/officeDocument/2006/customXml" ds:itemID="{FB1D83C0-C8CC-4C35-B0E6-D4B15A08C6B5}">
+  <ds:schemaRefs>
+    <ds:schemaRef ds:uri="http://schemas.microsoft.com/office/2006/metadata/properties"/>
+    <ds:schemaRef ds:uri="http://schemas.microsoft.com/office/infopath/2007/PartnerControls"/>
+    <ds:schemaRef ds:uri="9069f8e3-06b5-4841-af59-bd496f6fbcdc"/>
+    <ds:schemaRef ds:uri="ac4d9f64-92e6-40df-bbe5-cbf691cfe8ae"/>
+  </ds:schemaRefs>
+</ds:datastoreItem>
+</file>
+
+<file path=customXml/itemProps3.xml><?xml version="1.0" encoding="utf-8"?>
 <ds:datastoreItem xmlns:ds="http://schemas.openxmlformats.org/officeDocument/2006/customXml" ds:itemID="{D5874249-D0BB-47A2-ADCE-DE87B2259BE8}">
   <ds:schemaRefs>
     <ds:schemaRef ds:uri="http://schemas.microsoft.com/office/2006/metadata/contentType"/>
@@ -10462,21 +10472,10 @@
 </ds:datastoreItem>
 </file>
 
-<file path=customXml/itemProps3.xml><?xml version="1.0" encoding="utf-8"?>
-<ds:datastoreItem xmlns:ds="http://schemas.openxmlformats.org/officeDocument/2006/customXml" ds:itemID="{FB1D83C0-C8CC-4C35-B0E6-D4B15A08C6B5}">
+<file path=customXml/itemProps4.xml><?xml version="1.0" encoding="utf-8"?>
+<ds:datastoreItem xmlns:ds="http://schemas.openxmlformats.org/officeDocument/2006/customXml" ds:itemID="{E0BB6427-4419-4C21-A0DF-4471F23995B6}">
   <ds:schemaRefs>
-    <ds:schemaRef ds:uri="http://schemas.microsoft.com/office/2006/metadata/properties"/>
-    <ds:schemaRef ds:uri="http://schemas.microsoft.com/office/infopath/2007/PartnerControls"/>
-    <ds:schemaRef ds:uri="9069f8e3-06b5-4841-af59-bd496f6fbcdc"/>
-    <ds:schemaRef ds:uri="ac4d9f64-92e6-40df-bbe5-cbf691cfe8ae"/>
-  </ds:schemaRefs>
-</ds:datastoreItem>
-</file>
-
-<file path=customXml/itemProps4.xml><?xml version="1.0" encoding="utf-8"?>
-<ds:datastoreItem xmlns:ds="http://schemas.openxmlformats.org/officeDocument/2006/customXml" ds:itemID="{E8FDF9F9-0BC5-4BD9-96CC-E3BC62E19A62}">
-  <ds:schemaRefs>
-    <ds:schemaRef ds:uri="http://schemas.microsoft.com/sharepoint/v3/contenttype/forms"/>
+    <ds:schemaRef ds:uri="http://schemas.openxmlformats.org/officeDocument/2006/bibliography"/>
   </ds:schemaRefs>
 </ds:datastoreItem>
 </file>
</xml_diff>

<commit_message>
feat: enhance documentation clarity and structure, improve descriptions of development tools and frameworks used in Habit-Tracker
</commit_message>
<xml_diff>
--- a/Barta_rocnikova_prace.docx
+++ b/Barta_rocnikova_prace.docx
@@ -5111,592 +5111,944 @@
       <w:pPr>
         <w:pStyle w:val="Nadpis2"/>
       </w:pPr>
-      <w:bookmarkStart w:id="32" w:name="_Toc226556223"/>
-      <w:r>
-        <w:t>Visual Studio Code</w:t>
-      </w:r>
-      <w:bookmarkEnd w:id="32"/>
-    </w:p>
-    <w:p>
-      <w:r>
-        <w:t>Pro vývoj této webové aplikace jsem si zvolil Visual Studio Code jako své vývojové prostředí</w:t>
+      <w:proofErr w:type="spellStart"/>
+      <w:r>
+        <w:t>Visual</w:t>
+      </w:r>
+      <w:proofErr w:type="spellEnd"/>
+      <w:r>
+        <w:t xml:space="preserve"> Studio </w:t>
+      </w:r>
+      <w:proofErr w:type="spellStart"/>
+      <w:r>
+        <w:t>Code</w:t>
+      </w:r>
+      <w:proofErr w:type="spellEnd"/>
+    </w:p>
+    <w:p>
+      <w:r>
+        <w:t xml:space="preserve">Pro vývoj této webové aplikace jsem zvolil </w:t>
+      </w:r>
+      <w:proofErr w:type="spellStart"/>
+      <w:r>
+        <w:t>Visual</w:t>
+      </w:r>
+      <w:proofErr w:type="spellEnd"/>
+      <w:r>
+        <w:t xml:space="preserve"> Studio </w:t>
+      </w:r>
+      <w:proofErr w:type="spellStart"/>
+      <w:r>
+        <w:t>Code</w:t>
+      </w:r>
+      <w:proofErr w:type="spellEnd"/>
+      <w:r>
+        <w:t xml:space="preserve"> jako své vývojové prostředí (IDE) od společnosti Microsoft. Považuji toto prostředí za svoje „standardní“ řešení, protože mi v něm jde práce nejrychleji a zároveň v něm mám všechno, co při vývoji potřebuji, na jednom místě.</w:t>
+      </w:r>
+    </w:p>
+    <w:p>
+      <w:pPr>
+        <w:pStyle w:val="Nadpis3"/>
+      </w:pPr>
+      <w:r>
+        <w:t>Školní zkušenost</w:t>
+      </w:r>
+    </w:p>
+    <w:p>
+      <w:r>
+        <w:t>Prvním</w:t>
+      </w:r>
+      <w:r>
+        <w:t xml:space="preserve"> z</w:t>
+      </w:r>
+      <w:r>
+        <w:t xml:space="preserve"> důvod</w:t>
+      </w:r>
+      <w:r>
+        <w:t>ů</w:t>
       </w:r>
       <w:r>
         <w:t xml:space="preserve"> </w:t>
       </w:r>
       <w:r>
-        <w:t>(IDE) od společnosti Microsoft. Považuji toto prostředí za sv</w:t>
-      </w:r>
-      <w:r>
-        <w:t xml:space="preserve">é standardní </w:t>
-      </w:r>
-      <w:r>
-        <w:t>z</w:t>
+        <w:t xml:space="preserve">pro vybrání </w:t>
+      </w:r>
+      <w:proofErr w:type="spellStart"/>
+      <w:r>
+        <w:t>Visual</w:t>
+      </w:r>
+      <w:proofErr w:type="spellEnd"/>
+      <w:r>
+        <w:t xml:space="preserve"> Studio Codu je</w:t>
+      </w:r>
+      <w:r>
+        <w:t xml:space="preserve">, že s jinými vývojovými nástroji nemám </w:t>
+      </w:r>
+      <w:r>
+        <w:t>až takové</w:t>
+      </w:r>
+      <w:r>
+        <w:t xml:space="preserve"> zkušenosti jako právě s </w:t>
+      </w:r>
+      <w:r>
+        <w:t>tímto</w:t>
+      </w:r>
+      <w:r>
+        <w:t xml:space="preserve">. Na naší škole se většina práce s kódem dělá právě v tomto </w:t>
+      </w:r>
+      <w:r>
+        <w:t>IDE</w:t>
+      </w:r>
+      <w:r>
+        <w:t xml:space="preserve">, takže jsem si postupně osvojil jeho ovládání, práci s projektem, </w:t>
+      </w:r>
+      <w:proofErr w:type="gramStart"/>
+      <w:r>
+        <w:t>ladění</w:t>
+      </w:r>
+      <w:proofErr w:type="gramEnd"/>
+      <w:r>
+        <w:t xml:space="preserve"> a hlavně i to, jak v něm pracovat „běžně“, aniž bych pořád musel hledat, kde </w:t>
+      </w:r>
+      <w:r>
+        <w:t>se jaká možnost nachází</w:t>
+      </w:r>
+      <w:r>
+        <w:t>. To u ročníkové práce pomáhá hodně, protože když se člověk soustředí hlavně na samotnou aplikaci, nechce ztrácet čas tím, že se učí nov</w:t>
+      </w:r>
+      <w:r>
+        <w:t xml:space="preserve">é IDE </w:t>
+      </w:r>
+      <w:r>
+        <w:t>nebo nové nastavení.</w:t>
+      </w:r>
+    </w:p>
+    <w:p>
+      <w:pPr>
+        <w:pStyle w:val="Nadpis3"/>
+      </w:pPr>
+      <w:r>
+        <w:t>Integrovaný terminál</w:t>
+      </w:r>
+    </w:p>
+    <w:p>
+      <w:r>
+        <w:t xml:space="preserve">Další důležitý důvod je integrovaný terminál. Angular při vývoji používá příkazovou řádku (CLI), protože přes ni se spouští vývojový server, vytvářejí se nové komponenty nebo se řeší různé úkony okolo projektu. Kdybych terminál neměl přímo v editoru, musel bych neustále přepínat mezi okny (mezi editorem a samostatným terminálem). Tím, že je terminál přímo </w:t>
+      </w:r>
+      <w:proofErr w:type="gramStart"/>
+      <w:r>
+        <w:t>v</w:t>
+      </w:r>
+      <w:proofErr w:type="gramEnd"/>
+      <w:r>
+        <w:t xml:space="preserve"> </w:t>
+      </w:r>
+      <w:proofErr w:type="spellStart"/>
+      <w:r>
+        <w:t>Visual</w:t>
+      </w:r>
+      <w:proofErr w:type="spellEnd"/>
+      <w:r>
+        <w:t xml:space="preserve"> Studio </w:t>
+      </w:r>
+      <w:proofErr w:type="spellStart"/>
+      <w:r>
+        <w:t>Code</w:t>
+      </w:r>
+      <w:proofErr w:type="spellEnd"/>
+      <w:r>
+        <w:t xml:space="preserve">, je celý </w:t>
+      </w:r>
+      <w:proofErr w:type="spellStart"/>
+      <w:r>
+        <w:t>workflow</w:t>
+      </w:r>
+      <w:proofErr w:type="spellEnd"/>
+      <w:r>
+        <w:t xml:space="preserve"> rychlejší a pohodlnější. Navíc se mi lépe drží pozornost na tom, co právě dělám v projektu.</w:t>
+      </w:r>
+    </w:p>
+    <w:p>
+      <w:pPr>
+        <w:pStyle w:val="Nadpis3"/>
+      </w:pPr>
+      <w:r>
+        <w:t>Rozšíření prostředí (</w:t>
+      </w:r>
+      <w:proofErr w:type="spellStart"/>
+      <w:r>
+        <w:t>Extensions</w:t>
+      </w:r>
+      <w:proofErr w:type="spellEnd"/>
+      <w:r>
+        <w:t>)</w:t>
+      </w:r>
+    </w:p>
+    <w:p>
+      <w:r>
+        <w:t xml:space="preserve">Poslední důvod, proč </w:t>
+      </w:r>
+      <w:proofErr w:type="spellStart"/>
+      <w:r>
+        <w:t>Visual</w:t>
+      </w:r>
+      <w:proofErr w:type="spellEnd"/>
+      <w:r>
+        <w:t xml:space="preserve"> Studio </w:t>
+      </w:r>
+      <w:proofErr w:type="spellStart"/>
+      <w:r>
+        <w:t>Code</w:t>
+      </w:r>
+      <w:proofErr w:type="spellEnd"/>
+      <w:r>
+        <w:t xml:space="preserve"> používám, jsou jeho rozšíření. Teoreticky by šlo vytvořit aplikaci i bez nich, ale </w:t>
+      </w:r>
+      <w:r>
+        <w:t>práce jako taková</w:t>
+      </w:r>
+      <w:r>
+        <w:t xml:space="preserve"> by </w:t>
+      </w:r>
+      <w:r>
+        <w:t>byla</w:t>
+      </w:r>
+      <w:r>
+        <w:t xml:space="preserve"> zbytečně těž</w:t>
+      </w:r>
+      <w:r>
+        <w:t>ší</w:t>
+      </w:r>
+      <w:r>
+        <w:t xml:space="preserve"> a </w:t>
+      </w:r>
+      <w:r>
+        <w:t>mnohem pomalejší</w:t>
+      </w:r>
+      <w:r>
+        <w:t xml:space="preserve">. </w:t>
+      </w:r>
+      <w:proofErr w:type="spellStart"/>
+      <w:r>
+        <w:t>Extensions</w:t>
+      </w:r>
+      <w:proofErr w:type="spellEnd"/>
+      <w:r>
+        <w:t xml:space="preserve"> mi hlavně pomáhají s</w:t>
+      </w:r>
+      <w:r>
+        <w:t>e</w:t>
+      </w:r>
+      <w:r>
+        <w:t xml:space="preserve"> psaním a úpravami kódu. U tohoto projektu jsem například ocenil Angular </w:t>
+      </w:r>
+      <w:proofErr w:type="spellStart"/>
+      <w:r>
+        <w:t>Language</w:t>
+      </w:r>
+      <w:proofErr w:type="spellEnd"/>
+      <w:r>
+        <w:t xml:space="preserve"> </w:t>
+      </w:r>
+      <w:proofErr w:type="spellStart"/>
+      <w:r>
+        <w:t>Service</w:t>
+      </w:r>
+      <w:proofErr w:type="spellEnd"/>
+      <w:r>
+        <w:t xml:space="preserve">, který poskytuje nápovědy a pomáhá s orientací v </w:t>
+      </w:r>
+      <w:proofErr w:type="spellStart"/>
+      <w:r>
+        <w:t>TypeScriptu</w:t>
+      </w:r>
+      <w:proofErr w:type="spellEnd"/>
+      <w:r>
+        <w:t xml:space="preserve"> a Angular struktuře. Další rozšíření používám kvůli formátování (typicky </w:t>
+      </w:r>
+      <w:proofErr w:type="spellStart"/>
+      <w:r>
+        <w:t>Prettier</w:t>
+      </w:r>
+      <w:proofErr w:type="spellEnd"/>
+      <w:r>
+        <w:t>), aby byl kód přehledný a sjednocený. Díky tomu nemusím řešit drobné mezery, odsazení nebo styl kódu pokaždé ručně a celý projekt vypadá konzistentně.</w:t>
+      </w:r>
+    </w:p>
+    <w:p>
+      <w:pPr>
+        <w:pStyle w:val="Nadpis3"/>
+      </w:pPr>
+      <w:r>
+        <w:t>Git podpora</w:t>
+      </w:r>
+    </w:p>
+    <w:p>
+      <w:r>
+        <w:t xml:space="preserve">V neposlední řadě je tu Git podpora přímo v editoru. U ročníkové práce je to dost důležité, protože </w:t>
+      </w:r>
+      <w:r>
+        <w:t>jsem</w:t>
+      </w:r>
+      <w:r>
+        <w:t xml:space="preserve"> průběžně experiment</w:t>
+      </w:r>
+      <w:r>
+        <w:t>oval</w:t>
+      </w:r>
+      <w:r>
+        <w:t xml:space="preserve"> – někdy něco napadne a zkusí to, někdy se něco nepovede nebo se narazí na problém. Kdybych neměl průběžné verze, tak by se mi hůř vracelo zpátky k předchozím změnám. </w:t>
+      </w:r>
+      <w:proofErr w:type="spellStart"/>
+      <w:r>
+        <w:t>Visual</w:t>
+      </w:r>
+      <w:proofErr w:type="spellEnd"/>
+      <w:r>
+        <w:t xml:space="preserve"> Studio </w:t>
+      </w:r>
+      <w:proofErr w:type="spellStart"/>
+      <w:r>
+        <w:t>Code</w:t>
+      </w:r>
+      <w:proofErr w:type="spellEnd"/>
+      <w:r>
+        <w:t xml:space="preserve"> mi umožňuje spravovat </w:t>
+      </w:r>
+      <w:proofErr w:type="spellStart"/>
+      <w:r>
+        <w:t>commity</w:t>
+      </w:r>
+      <w:proofErr w:type="spellEnd"/>
+      <w:r>
+        <w:t>, větve a kontrolovat historii změn jednoduše v rozhraní editoru, takže je všechno přehledné a není potřeba se pokaždé orientovat jen v příkazech v terminálu.</w:t>
+      </w:r>
+    </w:p>
+    <w:p>
+      <w:pPr>
+        <w:pStyle w:val="Nadpis2"/>
+      </w:pPr>
+      <w:r>
+        <w:lastRenderedPageBreak/>
+        <w:t>Angular</w:t>
+      </w:r>
+    </w:p>
+    <w:p>
+      <w:r>
+        <w:t xml:space="preserve">Každá aplikace potřebuje své „jádro“, tedy framework, který určuje strukturu celé práce. Jelikož je Habit-Tracker navržen jako Single Page </w:t>
+      </w:r>
+      <w:proofErr w:type="spellStart"/>
+      <w:r>
+        <w:t>Application</w:t>
+      </w:r>
+      <w:proofErr w:type="spellEnd"/>
+      <w:r>
+        <w:t xml:space="preserve">, nenapadlo mě nic, co by se k tomu hodilo lépe než Angular. Angular je framework přímo zaměřený na tvorbu moderních webových aplikací, kde se obsah aktualizuje bez klasického </w:t>
+      </w:r>
+      <w:proofErr w:type="spellStart"/>
+      <w:r>
+        <w:t>přenačítání</w:t>
+      </w:r>
+      <w:proofErr w:type="spellEnd"/>
+      <w:r>
+        <w:t xml:space="preserve"> celé stránky. V projektu jsem původně pracoval s verzí 20, ale v této ročníkové práci se budu věnovat novější verzi </w:t>
+      </w:r>
+      <w:proofErr w:type="spellStart"/>
+      <w:r>
+        <w:t>Angularu</w:t>
+      </w:r>
+      <w:proofErr w:type="spellEnd"/>
+      <w:r>
+        <w:t xml:space="preserve"> 21.2.0, kterou jsem během vývoje aktualizoval a používal.</w:t>
+      </w:r>
+    </w:p>
+    <w:p>
+      <w:r>
+        <w:t>Angular je pro tento projekt vhodný hlavně kvůli tomu, že má jasnou strukturu, dobré možnosti pro komponenty a také se dobře udržuje. U ročníkové práce je údržba dost důležitá, protože aplikace se většinou vyvíjí postupně a člověk se k věcem vrací v dalších fázích.</w:t>
+      </w:r>
+    </w:p>
+    <w:p>
+      <w:pPr>
+        <w:spacing w:after="160" w:line="278" w:lineRule="auto"/>
+        <w:rPr>
+          <w:b/>
+          <w:bCs/>
+        </w:rPr>
+      </w:pPr>
+      <w:proofErr w:type="spellStart"/>
+      <w:r>
+        <w:rPr>
+          <w:b/>
+          <w:bCs/>
+        </w:rPr>
+        <w:t>TypeScript</w:t>
+      </w:r>
+      <w:proofErr w:type="spellEnd"/>
+    </w:p>
+    <w:p>
+      <w:r>
+        <w:t xml:space="preserve">Habit-Tracker je napsaný v </w:t>
+      </w:r>
+      <w:proofErr w:type="spellStart"/>
+      <w:r>
+        <w:t>TypeScriptu</w:t>
+      </w:r>
+      <w:proofErr w:type="spellEnd"/>
+      <w:r>
+        <w:t xml:space="preserve">. </w:t>
+      </w:r>
+      <w:proofErr w:type="spellStart"/>
+      <w:r>
+        <w:t>TypeScript</w:t>
+      </w:r>
+      <w:proofErr w:type="spellEnd"/>
+      <w:r>
+        <w:t xml:space="preserve"> je jazyk, který rozšiřuje JavaScript o statické typování. Prakticky to znamená, že v kódu pracuji s definovanými typy a rozhraními. V projektu jsem například vytvořil rozhraní (</w:t>
+      </w:r>
+      <w:proofErr w:type="spellStart"/>
+      <w:r>
+        <w:t>interfaces</w:t>
+      </w:r>
+      <w:proofErr w:type="spellEnd"/>
+      <w:r>
+        <w:t>) pro objekty návyků, takže už dopředu je jasné, jaké vlastnosti návyk má (např. název, typ, případně další informace). Díky tomu se lépe odhalují chyby už během vývoje (ne až ve chvíli, kdy aplikace běží). Zároveň to zlepšuje čitelnost kódu, protože je hned vidět, jaká data aplikace očekává.</w:t>
+      </w:r>
+    </w:p>
+    <w:p>
+      <w:pPr>
+        <w:spacing w:after="160" w:line="278" w:lineRule="auto"/>
+        <w:rPr>
+          <w:b/>
+          <w:bCs/>
+        </w:rPr>
+      </w:pPr>
+      <w:r>
+        <w:rPr>
+          <w:b/>
+          <w:bCs/>
+        </w:rPr>
+        <w:t>Komponentová architektura</w:t>
+      </w:r>
+    </w:p>
+    <w:p>
+      <w:r>
+        <w:t>Celý Habit-Tracker jsem rozdělil na nezávislé a znovupoužitelné komponenty. Tento přístup považuji za jeden z největších důvodů, proč je Angular pro podobné projekty tak vhodný. Místo toho, aby byl celý kód „na jednom místě“, má každá část aplikace svůj vlastní komponentní soubor a vlastní logiku i šablonu.</w:t>
+      </w:r>
+      <w:r>
+        <w:br/>
+        <w:t>Například existuje komponenta pro seznam návyků, komponenta pro detailní zobrazení konkrétního návyku a také komponenty, které zajišťují přepínání mezi „dobrými“ a „špatnými“ návyky. Takové rozdělení usnadní údržbu, protože když se změní jen jedna část UI, většinou se nemusí sahat do celé aplikace. Do budoucna je to taky lepší, kdybych chtěl projekt rozšířit (třeba o další filtry, grafy nebo další stránky).</w:t>
+      </w:r>
+    </w:p>
+    <w:p>
+      <w:pPr>
+        <w:spacing w:after="160" w:line="278" w:lineRule="auto"/>
+        <w:rPr>
+          <w:b/>
+          <w:bCs/>
+        </w:rPr>
+      </w:pPr>
+      <w:proofErr w:type="spellStart"/>
+      <w:r>
+        <w:rPr>
+          <w:b/>
+          <w:bCs/>
+        </w:rPr>
+        <w:t>Services</w:t>
+      </w:r>
+      <w:proofErr w:type="spellEnd"/>
+      <w:r>
+        <w:rPr>
+          <w:b/>
+          <w:bCs/>
+        </w:rPr>
+        <w:t xml:space="preserve"> &amp; </w:t>
+      </w:r>
+      <w:proofErr w:type="spellStart"/>
+      <w:r>
+        <w:rPr>
+          <w:b/>
+          <w:bCs/>
+        </w:rPr>
+        <w:t>Dependency</w:t>
+      </w:r>
+      <w:proofErr w:type="spellEnd"/>
+      <w:r>
+        <w:rPr>
+          <w:b/>
+          <w:bCs/>
+        </w:rPr>
+        <w:t xml:space="preserve"> </w:t>
+      </w:r>
+      <w:proofErr w:type="spellStart"/>
+      <w:r>
+        <w:rPr>
+          <w:b/>
+          <w:bCs/>
+        </w:rPr>
+        <w:t>Injection</w:t>
+      </w:r>
+      <w:proofErr w:type="spellEnd"/>
+    </w:p>
+    <w:p>
+      <w:r>
+        <w:t xml:space="preserve">Pro práci s daty používám službu </w:t>
+      </w:r>
+      <w:proofErr w:type="spellStart"/>
+      <w:r>
+        <w:t>DataService</w:t>
+      </w:r>
+      <w:proofErr w:type="spellEnd"/>
+      <w:r>
+        <w:t>. Tato služba je v projektu zodpovědná za to, aby aplikace měla odkud brát data a kam je ukládat. V mém případě se data ukládají lokálně v prohlížeči (pomocí lokálního uložiště). Komponenty tak nemusejí řešit samotnou logiku ukládání – jen si řeknou, jaké data potřebují, a služba je poskytne.</w:t>
+      </w:r>
+      <w:r>
+        <w:br/>
+        <w:t xml:space="preserve">Angular k tomu přidává ještě systém </w:t>
+      </w:r>
+      <w:proofErr w:type="spellStart"/>
+      <w:r>
+        <w:t>Dependency</w:t>
+      </w:r>
+      <w:proofErr w:type="spellEnd"/>
+      <w:r>
+        <w:t xml:space="preserve"> </w:t>
+      </w:r>
+      <w:proofErr w:type="spellStart"/>
+      <w:r>
+        <w:t>Injection</w:t>
+      </w:r>
+      <w:proofErr w:type="spellEnd"/>
+      <w:r>
+        <w:t>. Výsledek je, že se logika (</w:t>
+      </w:r>
+      <w:proofErr w:type="spellStart"/>
+      <w:r>
+        <w:t>DataService</w:t>
+      </w:r>
+      <w:proofErr w:type="spellEnd"/>
+      <w:r>
+        <w:t xml:space="preserve">) lépe odděluje od uživatelského rozhraní (komponenty). Kód je potom </w:t>
+      </w:r>
+      <w:proofErr w:type="gramStart"/>
+      <w:r>
+        <w:t>přehlednější</w:t>
+      </w:r>
+      <w:proofErr w:type="gramEnd"/>
+      <w:r>
+        <w:t xml:space="preserve"> </w:t>
+      </w:r>
+      <w:r>
+        <w:t>a hlavně jednodušší na případné úpravy, protože změny v datové logice nezasáhnou tolik UI a naopak.</w:t>
+      </w:r>
+    </w:p>
+    <w:p>
+      <w:pPr>
+        <w:spacing w:after="160" w:line="278" w:lineRule="auto"/>
+        <w:rPr>
+          <w:b/>
+          <w:bCs/>
+        </w:rPr>
+      </w:pPr>
+      <w:r>
+        <w:rPr>
+          <w:b/>
+          <w:bCs/>
+        </w:rPr>
+        <w:t>Angular CLI</w:t>
+      </w:r>
+    </w:p>
+    <w:p>
+      <w:r>
+        <w:t>Při vývoji jsem hodně využíval Angular CLI. To je příkazový nástroj, který Angular poskytuje a který pomáhá zautomatizovat několik činností. Například se pomocí něj dají generovat nové komponenty, služby nebo další části projektu. Také se přes něj spouští vývojový server v</w:t>
       </w:r>
       <w:r>
         <w:t> </w:t>
       </w:r>
-      <w:r>
-        <w:t>několika</w:t>
+      <w:proofErr w:type="spellStart"/>
+      <w:r>
+        <w:t>localhost</w:t>
+      </w:r>
+      <w:r>
+        <w:t>u</w:t>
+      </w:r>
+      <w:proofErr w:type="spellEnd"/>
+      <w:r>
+        <w:t xml:space="preserve"> na </w:t>
+      </w:r>
+      <w:proofErr w:type="spellStart"/>
+      <w:r>
+        <w:t>protu</w:t>
+      </w:r>
+      <w:proofErr w:type="spellEnd"/>
+      <w:r>
+        <w:t xml:space="preserve"> 4200</w:t>
+      </w:r>
+      <w:r>
+        <w:t>.</w:t>
       </w:r>
       <w:r>
         <w:t xml:space="preserve"> </w:t>
       </w:r>
       <w:r>
-        <w:t>důvodů.</w:t>
-      </w:r>
-    </w:p>
-    <w:p>
-      <w:pPr>
-        <w:pStyle w:val="Nadpis3"/>
-      </w:pPr>
-      <w:bookmarkStart w:id="33" w:name="_Toc226556224"/>
-      <w:r>
-        <w:t>Školní zkušenost</w:t>
-      </w:r>
-      <w:bookmarkEnd w:id="33"/>
-    </w:p>
-    <w:p>
-      <w:r>
-        <w:t>Prvním z důvodu, proč toto IDE používám je velice prostý a to ten, že neumím</w:t>
-      </w:r>
-      <w:r>
-        <w:t xml:space="preserve"> používat</w:t>
-      </w:r>
-      <w:r>
-        <w:t xml:space="preserve"> žádné další. Vím moc dobře, že existuji další vývojová prostředí, ale v tomhle mám nejvíce zkušenosti hlavně díky </w:t>
-      </w:r>
-      <w:r>
-        <w:t>naší</w:t>
-      </w:r>
-      <w:r>
-        <w:t xml:space="preserve"> škole, kde pro programování se </w:t>
-      </w:r>
-      <w:r>
-        <w:t>většinu</w:t>
-      </w:r>
-      <w:r>
-        <w:t xml:space="preserve"> času využívá právě Visual Studio Code</w:t>
-      </w:r>
-      <w:r>
-        <w:t xml:space="preserve"> jako vývojové prostředí</w:t>
-      </w:r>
+        <w:t xml:space="preserve">Pro mě bylo Angular CLI důležité i kvůli času. Když člověk dělá ročníkovou práci, nechce ručně vytvářet strukturu pro každou </w:t>
+      </w:r>
+      <w:r>
+        <w:lastRenderedPageBreak/>
+        <w:t>komponentu. CLI mi to připravilo rychle a správně, takže jsem se mohl soustředit hlavně na vlastní funkčnost aplikace.</w:t>
+      </w:r>
+    </w:p>
+    <w:p>
+      <w:pPr>
+        <w:pStyle w:val="Nadpis2"/>
+      </w:pPr>
+      <w:r>
+        <w:t>Angular Material</w:t>
+      </w:r>
+    </w:p>
+    <w:p>
+      <w:r>
+        <w:t xml:space="preserve">Aby měla aplikace co nejhezčí a profesionální </w:t>
+      </w:r>
+      <w:proofErr w:type="gramStart"/>
+      <w:r>
+        <w:t>vzhled</w:t>
+      </w:r>
+      <w:proofErr w:type="gramEnd"/>
+      <w:r>
+        <w:t xml:space="preserve"> a hlavně byla příjemná pro uživatele, rozhodl jsem se použít Angular Material. Je to knihovna komponent, které jsou navržené podle principů Material Designu od Googlu. Díky tomu aplikace nepůsobí „nesourodě“ – komponenty mají podobný styl, chování i vizuální konzistenci.</w:t>
+      </w:r>
+      <w:r>
+        <w:t xml:space="preserve"> </w:t>
+      </w:r>
+      <w:r>
+        <w:t>Z hlediska ročníkové práce mi Angular Material také ušetřil spoustu času. Nemusel jsem navrhovat všechno od nuly (což by bylo zbytečně těžké a pomalé), ale mohl jsem se soustředit na samotnou logiku Habit-Trackeru. Vzhled se navíc dal postupně doladit pomocí SCSS tak, aby seděl do mé barevné schématu.</w:t>
+      </w:r>
+    </w:p>
+    <w:p>
+      <w:pPr>
+        <w:spacing w:after="160" w:line="278" w:lineRule="auto"/>
+        <w:rPr>
+          <w:b/>
+          <w:bCs/>
+        </w:rPr>
+      </w:pPr>
+      <w:r>
+        <w:rPr>
+          <w:b/>
+          <w:bCs/>
+        </w:rPr>
+        <w:t>Karty a panely</w:t>
+      </w:r>
+    </w:p>
+    <w:p>
+      <w:r>
+        <w:t xml:space="preserve">Pro hlavní stránku jsou klíčové komponenty </w:t>
+      </w:r>
+      <w:proofErr w:type="spellStart"/>
+      <w:r>
+        <w:t>MatCard</w:t>
+      </w:r>
+      <w:proofErr w:type="spellEnd"/>
+      <w:r>
+        <w:t xml:space="preserve"> a </w:t>
+      </w:r>
+      <w:proofErr w:type="spellStart"/>
+      <w:r>
+        <w:t>MatTabs</w:t>
+      </w:r>
+      <w:proofErr w:type="spellEnd"/>
       <w:r>
         <w:t xml:space="preserve">. </w:t>
       </w:r>
-    </w:p>
-    <w:p>
-      <w:pPr>
-        <w:pStyle w:val="Nadpis3"/>
-      </w:pPr>
-      <w:bookmarkStart w:id="34" w:name="_Toc226556225"/>
-      <w:r>
-        <w:t>Integrovaný terminál</w:t>
-      </w:r>
-      <w:bookmarkEnd w:id="34"/>
-    </w:p>
-    <w:p>
-      <w:r>
-        <w:t xml:space="preserve">Další, ale </w:t>
-      </w:r>
-      <w:r>
-        <w:t xml:space="preserve">stejně </w:t>
-      </w:r>
-      <w:r>
-        <w:t xml:space="preserve">podstatný důvod, proč jsem se rozhodl vybrat si toto IDE je jeho integrovaný terminál. Programovací framework </w:t>
-      </w:r>
-      <w:r>
-        <w:t>Angular</w:t>
-      </w:r>
-      <w:r>
-        <w:t xml:space="preserve">, který používám pro vývoj </w:t>
-      </w:r>
-      <w:r>
-        <w:t>Habit-Tracker</w:t>
-      </w:r>
-      <w:r>
-        <w:t>u</w:t>
-      </w:r>
-      <w:r>
-        <w:t>,</w:t>
-      </w:r>
-      <w:r>
-        <w:t xml:space="preserve"> využívá příkazovou řádku pro usnadnění několika běžných akcích při vývoji</w:t>
-      </w:r>
-      <w:r>
-        <w:t xml:space="preserve"> ale o tom více v sekci věnované Angularu samotnému</w:t>
-      </w:r>
-      <w:r>
-        <w:t>.</w:t>
-      </w:r>
-    </w:p>
-    <w:p>
-      <w:pPr>
-        <w:pStyle w:val="Nadpis3"/>
-      </w:pPr>
-      <w:bookmarkStart w:id="35" w:name="_Toc226556226"/>
-      <w:r>
-        <w:t>Rozšíření</w:t>
-      </w:r>
-      <w:r>
-        <w:t xml:space="preserve"> prostředí</w:t>
-      </w:r>
-      <w:bookmarkEnd w:id="35"/>
-    </w:p>
-    <w:p>
-      <w:r>
-        <w:t>Poslední z důvodů, proč používám Visual Studio Code jsou jeho možnost rozšíření (dále jako Extentions). Teoretický vzato by bylo možné vytvořit tuto aplikaci a jakoukoliv jinou webovou aplikaci i bez použití rozšíření, ale byl by to velice, velice bolestivý a zdlouhavý proces</w:t>
-      </w:r>
-      <w:r>
-        <w:t>. Extentions můž</w:t>
-      </w:r>
-      <w:r>
-        <w:t>ou</w:t>
-      </w:r>
-      <w:r>
-        <w:t xml:space="preserve"> pomáhat vývojáři</w:t>
-      </w:r>
-      <w:r>
-        <w:t xml:space="preserve"> být rychlejší ve psaní kódu díky nápovědám syntaxe jako je konktrétně pro tento projekt Angular Language Service. Mohou také ale pomoc urovnat již napsaný kód pomocí například Prettier</w:t>
-      </w:r>
-      <w:r>
-        <w:t xml:space="preserve"> a spoustu dalších rozšíření pro co nejpřívětivější zkušenost a vývoj aplikací a programů.</w:t>
-      </w:r>
-    </w:p>
-    <w:p>
-      <w:pPr>
-        <w:pStyle w:val="Nadpis3"/>
-      </w:pPr>
-      <w:bookmarkStart w:id="36" w:name="_Toc226556227"/>
-      <w:r>
-        <w:t>Git podpora</w:t>
-      </w:r>
-      <w:bookmarkEnd w:id="36"/>
-    </w:p>
-    <w:p>
-      <w:r>
-        <w:t xml:space="preserve">Přímo v prostředí Visual Studio Code existuje možnost pro uživatele spravovat veškeré věci týkající se verzování pomocí Git </w:t>
-      </w:r>
-      <w:r>
-        <w:t>v jednoduše pochopitelném uživatelském rozhraní</w:t>
-      </w:r>
-      <w:r>
-        <w:t>. Tuto možnost jsem využil pro postupné commitování změn tohoto projektu</w:t>
-      </w:r>
-      <w:r>
-        <w:t xml:space="preserve"> pro případ, že by se ve vývoji nové verze pokazila nad možnost opravy.</w:t>
+      <w:proofErr w:type="spellStart"/>
+      <w:r>
+        <w:t>MatCard</w:t>
+      </w:r>
+      <w:proofErr w:type="spellEnd"/>
+      <w:r>
+        <w:t xml:space="preserve"> používám tam, kde chci mít návyky zobrazené v ucelených „kartách“ – uživatel pak hned vidí strukturu a nemusí se v obsahu ztrácet. </w:t>
+      </w:r>
+      <w:proofErr w:type="spellStart"/>
+      <w:r>
+        <w:t>MatTabs</w:t>
+      </w:r>
+      <w:proofErr w:type="spellEnd"/>
+      <w:r>
+        <w:t xml:space="preserve"> zase řeší přepínání mezi dvěma kategoriemi návyků. V mém případě to jsou „dobré“ a „špatné“ návyky. Tento způsob přepínání je pro uživatele intuitivní, protože místo přesměrování nebo složitých filtrů jen přepne záložku a hned vidí relevantní obsah.</w:t>
+      </w:r>
+    </w:p>
+    <w:p>
+      <w:pPr>
+        <w:spacing w:after="160" w:line="278" w:lineRule="auto"/>
+        <w:rPr>
+          <w:b/>
+          <w:bCs/>
+        </w:rPr>
+      </w:pPr>
+      <w:r>
+        <w:rPr>
+          <w:b/>
+          <w:bCs/>
+        </w:rPr>
+        <w:t>Formulářové prvky a ikony</w:t>
+      </w:r>
+    </w:p>
+    <w:p>
+      <w:r>
+        <w:t xml:space="preserve">Pro zadávání názvu nového návyku a výběr barvy používám ovládací prvky </w:t>
+      </w:r>
+      <w:proofErr w:type="spellStart"/>
+      <w:r>
+        <w:t>MatFormField</w:t>
+      </w:r>
+      <w:proofErr w:type="spellEnd"/>
+      <w:r>
+        <w:t xml:space="preserve">. Tyhle prvky pomáhají držet formy přehledné a vizuálně jednotné. Dále jsem využil systém ikon přes komponentu </w:t>
+      </w:r>
+      <w:proofErr w:type="spellStart"/>
+      <w:r>
+        <w:t>MatIcon</w:t>
+      </w:r>
+      <w:proofErr w:type="spellEnd"/>
+      <w:r>
+        <w:t>. Ikony jsem použil jako vizuální doplněk k návykům, aby bylo možné návyky rychleji rozpoznat a aby vzhled aplikace nebyl jen „textový“, ale měl i jasné symboly. I když se to může zdát jako drobnost, v praxi to zvyšuje použitelnost a uživatelský komfort</w:t>
+      </w:r>
+    </w:p>
+    <w:p>
+      <w:pPr>
+        <w:spacing w:after="160" w:line="278" w:lineRule="auto"/>
+        <w:rPr>
+          <w:b/>
+          <w:bCs/>
+        </w:rPr>
+      </w:pPr>
+      <w:proofErr w:type="spellStart"/>
+      <w:r>
+        <w:rPr>
+          <w:b/>
+          <w:bCs/>
+        </w:rPr>
+        <w:t>Sass</w:t>
+      </w:r>
+      <w:proofErr w:type="spellEnd"/>
+      <w:r>
+        <w:rPr>
+          <w:b/>
+          <w:bCs/>
+        </w:rPr>
+        <w:t xml:space="preserve"> CSS (SCSS)</w:t>
+      </w:r>
+    </w:p>
+    <w:p>
+      <w:r>
+        <w:t xml:space="preserve">Původně jsem měl v plánu psát styly v LESS. V průběhu implementace Angular </w:t>
+      </w:r>
+      <w:proofErr w:type="spellStart"/>
+      <w:r>
+        <w:t>Materialu</w:t>
+      </w:r>
+      <w:proofErr w:type="spellEnd"/>
+      <w:r>
+        <w:t xml:space="preserve"> jsem ale přešel na SCSS. Rozhodnutí nebylo složité – Angular Material je postavený právě na </w:t>
+      </w:r>
+      <w:proofErr w:type="spellStart"/>
+      <w:r>
+        <w:t>Sass</w:t>
+      </w:r>
+      <w:proofErr w:type="spellEnd"/>
+      <w:r>
+        <w:t xml:space="preserve">, takže bylo logické držet se stejného </w:t>
+      </w:r>
+      <w:proofErr w:type="spellStart"/>
+      <w:r>
+        <w:t>stylovacího</w:t>
+      </w:r>
+      <w:proofErr w:type="spellEnd"/>
+      <w:r>
+        <w:t xml:space="preserve"> systému. Tím jsem chtěl dosáhnout plné </w:t>
+      </w:r>
+      <w:proofErr w:type="gramStart"/>
+      <w:r>
+        <w:t>kompatibility</w:t>
+      </w:r>
+      <w:proofErr w:type="gramEnd"/>
+      <w:r>
+        <w:t xml:space="preserve"> a hlavně konzistence stylů v celém projektu.</w:t>
+      </w:r>
+    </w:p>
+    <w:p>
+      <w:r>
+        <w:t xml:space="preserve">SCSS mi navíc umožňuje psát přehlednější CSS díky některým vlastnostem navíc oproti klasickému CSS. Například pracuji s proměnnými, umím vnořovat styly do logické struktury a používám </w:t>
+      </w:r>
+      <w:proofErr w:type="spellStart"/>
+      <w:r>
+        <w:t>mixiny</w:t>
+      </w:r>
+      <w:proofErr w:type="spellEnd"/>
+      <w:r>
+        <w:t xml:space="preserve">. Díky tomu se vyhnu zbytečnému opakování kódu a </w:t>
+      </w:r>
+      <w:proofErr w:type="spellStart"/>
+      <w:r>
+        <w:t>stylovací</w:t>
+      </w:r>
+      <w:proofErr w:type="spellEnd"/>
+      <w:r>
+        <w:t xml:space="preserve"> logika se dá lépe udržovat i do budoucna.</w:t>
+      </w:r>
+    </w:p>
+    <w:p>
+      <w:pPr>
+        <w:spacing w:after="160" w:line="278" w:lineRule="auto"/>
+        <w:rPr>
+          <w:b/>
+          <w:bCs/>
+        </w:rPr>
+      </w:pPr>
+      <w:proofErr w:type="spellStart"/>
+      <w:r>
+        <w:rPr>
+          <w:b/>
+          <w:bCs/>
+        </w:rPr>
+        <w:t>Variables</w:t>
+      </w:r>
+      <w:proofErr w:type="spellEnd"/>
+    </w:p>
+    <w:p>
+      <w:r>
+        <w:t xml:space="preserve">V SCSS používám </w:t>
+      </w:r>
+      <w:proofErr w:type="spellStart"/>
+      <w:r>
+        <w:t>variables</w:t>
+      </w:r>
+      <w:proofErr w:type="spellEnd"/>
+      <w:r>
+        <w:t xml:space="preserve"> pro centrální definici barev a typografie. V souboru se globálními styly mám nastavené barvy pro pozitivní a negativní návyky, ale také základní barvy, které se používají napříč aplikací. Výhoda je, že když bych chtěl změnit barevné schéma, nemusím procházet celý projekt a hledat všechny konkrétní barvy. Stačí upravit proměnné na jednom místě, a úprava se projeví všude.</w:t>
+      </w:r>
+    </w:p>
+    <w:p>
+      <w:pPr>
+        <w:spacing w:after="160" w:line="278" w:lineRule="auto"/>
+        <w:rPr>
+          <w:b/>
+          <w:bCs/>
+        </w:rPr>
+      </w:pPr>
+      <w:proofErr w:type="spellStart"/>
+      <w:r>
+        <w:rPr>
+          <w:b/>
+          <w:bCs/>
+        </w:rPr>
+        <w:t>Nesting</w:t>
+      </w:r>
+      <w:proofErr w:type="spellEnd"/>
+    </w:p>
+    <w:p>
+      <w:proofErr w:type="spellStart"/>
+      <w:r>
+        <w:lastRenderedPageBreak/>
+        <w:t>Nesting</w:t>
+      </w:r>
+      <w:proofErr w:type="spellEnd"/>
+      <w:r>
+        <w:t xml:space="preserve"> (vnořování) využívám hlavně pro čitelnost. Kód se pak podobá struktuře HTML. To mi pomáhá při ladění, protože vidím, že styl patří právě k danému prvku nebo komponentě. Například když </w:t>
+      </w:r>
+      <w:proofErr w:type="gramStart"/>
+      <w:r>
+        <w:t>upravuju</w:t>
+      </w:r>
+      <w:proofErr w:type="gramEnd"/>
+      <w:r>
+        <w:t xml:space="preserve"> vzhled tlačítka v kartách návyků, je jasné, kam daný blok stylu patří, a nemusím zbytečně hledat v dlouhém CSS souboru.</w:t>
+      </w:r>
+    </w:p>
+    <w:p>
+      <w:pPr>
+        <w:spacing w:after="160" w:line="278" w:lineRule="auto"/>
+        <w:rPr>
+          <w:b/>
+          <w:bCs/>
+        </w:rPr>
+      </w:pPr>
+      <w:proofErr w:type="spellStart"/>
+      <w:r>
+        <w:rPr>
+          <w:b/>
+          <w:bCs/>
+        </w:rPr>
+        <w:t>Mixins</w:t>
+      </w:r>
+      <w:proofErr w:type="spellEnd"/>
+    </w:p>
+    <w:p>
+      <w:proofErr w:type="spellStart"/>
+      <w:r>
+        <w:t>Mixins</w:t>
+      </w:r>
+      <w:proofErr w:type="spellEnd"/>
+      <w:r>
+        <w:t xml:space="preserve"> používám v momentě, kdy se v projektu objevují podobné opakující se vizuální efekty. V Habit-Trackeru se to projevilo třeba u stínů karet (box-shadow) nebo u responzivních bodů (media queries). </w:t>
+      </w:r>
+      <w:proofErr w:type="spellStart"/>
+      <w:r>
+        <w:t>Mixiny</w:t>
+      </w:r>
+      <w:proofErr w:type="spellEnd"/>
+      <w:r>
+        <w:t xml:space="preserve"> mi pomáhají zachovat vizuální konzistenci napříč aplikací a zároveň snižují množství opakovaného kódu. Když se pak něco rozhodnu změnit, upravím </w:t>
+      </w:r>
+      <w:proofErr w:type="spellStart"/>
+      <w:r>
+        <w:t>mixin</w:t>
+      </w:r>
+      <w:proofErr w:type="spellEnd"/>
+      <w:r>
+        <w:t xml:space="preserve"> a změna se projeví ve všech místech, kde se </w:t>
+      </w:r>
+      <w:proofErr w:type="spellStart"/>
+      <w:r>
+        <w:t>mixin</w:t>
+      </w:r>
+      <w:proofErr w:type="spellEnd"/>
+      <w:r>
+        <w:t xml:space="preserve"> používá.</w:t>
       </w:r>
     </w:p>
     <w:p>
       <w:pPr>
         <w:pStyle w:val="Nadpis2"/>
       </w:pPr>
-      <w:bookmarkStart w:id="37" w:name="_Angular"/>
-      <w:bookmarkStart w:id="38" w:name="_Toc226556228"/>
-      <w:bookmarkEnd w:id="37"/>
-      <w:r>
-        <w:t>Angula</w:t>
-      </w:r>
-      <w:r>
-        <w:t>r</w:t>
-      </w:r>
-      <w:bookmarkEnd w:id="38"/>
-    </w:p>
-    <w:p>
-      <w:r>
-        <w:t>Každá aplikace potřebuje své jádro, na kterém je postavena. Jelikož je tento projekt Single Page, nenapadlo mě žádný jiný framework, který by udělal tuhle práci lépe než Angular</w:t>
-      </w:r>
-      <w:r>
-        <w:t xml:space="preserve"> od společnosti Google, který je přímo dělaný na vývoj těchto jednostránkových aplikací</w:t>
-      </w:r>
-      <w:r>
-        <w:t xml:space="preserve">. </w:t>
-      </w:r>
-      <w:r>
-        <w:t xml:space="preserve">Před datumem 21. 2. 2026 byla v projektu využita verze 20, ale díky </w:t>
-      </w:r>
-      <w:r>
-        <w:t xml:space="preserve">aktualizaci se v tomto dokumentu budeme bavit o </w:t>
-      </w:r>
-      <w:r>
-        <w:t xml:space="preserve">novější verzi </w:t>
-      </w:r>
-      <w:r>
-        <w:t>Angularu 21.2.0.</w:t>
-      </w:r>
-      <w:r>
-        <w:t xml:space="preserve"> Tento Framework obsahuje několik aspektů, které jsou </w:t>
-      </w:r>
-      <w:r>
-        <w:t>velice užitečné pro tento projekt.</w:t>
-      </w:r>
-    </w:p>
-    <w:p>
-      <w:pPr>
-        <w:pStyle w:val="Nadpis3"/>
-      </w:pPr>
-      <w:bookmarkStart w:id="39" w:name="_Toc226556229"/>
-      <w:r>
-        <w:lastRenderedPageBreak/>
-        <w:t>TypeScript</w:t>
-      </w:r>
-      <w:bookmarkEnd w:id="39"/>
-    </w:p>
-    <w:p>
-      <w:r>
-        <w:t xml:space="preserve"> </w:t>
-      </w:r>
-      <w:r>
-        <w:t>Tento projekt je psaný v jazyce, který rozšiřuje Javascript o statické typování proměn a funkc</w:t>
-      </w:r>
-      <w:r>
-        <w:t>í. V rámci tohoto projektu jsou definovány rozhraní (Interfaces) pro objekty návyků pro zachycení případných chyb již během vývoje, zajišťuje konzistenci dat a výrazně zvyšuje čitelnost a udržitelnost projektového kódu.</w:t>
-      </w:r>
-    </w:p>
-    <w:p>
-      <w:pPr>
-        <w:pStyle w:val="Nadpis3"/>
-      </w:pPr>
-      <w:bookmarkStart w:id="40" w:name="_Toc226556230"/>
-      <w:r>
-        <w:t>Komponentová architektura</w:t>
-      </w:r>
-      <w:bookmarkEnd w:id="40"/>
-    </w:p>
-    <w:p>
-      <w:r>
-        <w:t xml:space="preserve">Celý </w:t>
-      </w:r>
-      <w:r>
-        <w:t>Habit-Tracker</w:t>
-      </w:r>
-      <w:r>
-        <w:t xml:space="preserve"> jsem rozdělil na nezávislé a znovupoužitelné komponenty. Takto jsem učinil například pro seznam návyků, detailní zobrazení jednotlivých návyků a přepínací karty mezi dobrými a špatnými návyky. Užití komponentů velmi usnadňuje jak údržbu aplikace, tak i její případnou rozšiřitelnost v budoucnu, protože se nebude muset upravovat celá </w:t>
-      </w:r>
-      <w:r>
-        <w:t>struktura aplikace, ale jen ovlivněné komponenty.</w:t>
-      </w:r>
-    </w:p>
-    <w:p>
-      <w:pPr>
-        <w:pStyle w:val="Nadpis3"/>
-      </w:pPr>
-      <w:bookmarkStart w:id="41" w:name="_Toc226556231"/>
-      <w:r>
-        <w:t>Services &amp; Dependency Injection</w:t>
-      </w:r>
-      <w:bookmarkEnd w:id="41"/>
-    </w:p>
-    <w:p>
-      <w:r>
-        <w:t xml:space="preserve">Pro správu logiky dat je v projektu využívána tzv. DataService. Tato služba frameworku </w:t>
-      </w:r>
-      <w:r>
-        <w:t xml:space="preserve">zajišťuje komunikaci s lokálním uložištěm vašeho prohlížeče a poskytuje data všem komponentám napříč aplikací, které daná data vyžadují. Díky systému vkládání závislostí (Dependency Injection) je dosaženo čistého a přehledného rozdělení uživatelského rozhraní od samotné logiky </w:t>
-      </w:r>
-      <w:r>
-        <w:t>Habit-Tracker</w:t>
-      </w:r>
-      <w:r>
-        <w:t>u.</w:t>
-      </w:r>
-    </w:p>
-    <w:p>
-      <w:pPr>
-        <w:pStyle w:val="Nadpis3"/>
-      </w:pPr>
-      <w:bookmarkStart w:id="42" w:name="_Toc226556232"/>
-      <w:r>
-        <w:t>Angular CLI</w:t>
-      </w:r>
-      <w:bookmarkEnd w:id="42"/>
-    </w:p>
-    <w:p>
-      <w:r>
-        <w:t>Při vývoji bylo hodně využíváno rozhraní příkazového řádku, které framework Angular přináší s sebou do projektu. Toto rozhraní je využíváno například pro generaci nových komponent</w:t>
-      </w:r>
-      <w:r>
-        <w:t>, služeb a</w:t>
-      </w:r>
-      <w:r>
-        <w:t xml:space="preserve"> spouštění vývojového serveru v localhost. Angular Cli mi velmi urychlilo celý proces vytváření aplikace.</w:t>
-      </w:r>
-    </w:p>
-    <w:p>
-      <w:pPr>
-        <w:pStyle w:val="Nadpis2"/>
-      </w:pPr>
-      <w:bookmarkStart w:id="43" w:name="_Toc226556233"/>
-      <w:r>
-        <w:t>Angular Material</w:t>
-      </w:r>
-      <w:bookmarkEnd w:id="43"/>
-    </w:p>
-    <w:p>
-      <w:r>
-        <w:t xml:space="preserve">Pro co nejlepší zajištění profesionálního vzhledu a velmi vysoké úrovně uživatelské přívětivosti, používám v projektu integrovanou knihovnu Angular Material. Angular Material je oficiální sada komponent, které byly navrhnuty podle principu Material Designu od společnosti Google. Tento systém zajistí konzistenci z vizuální stránky napříč celým </w:t>
-      </w:r>
-      <w:r>
-        <w:t>Habit-Tracker</w:t>
-      </w:r>
-      <w:r>
-        <w:t>em.</w:t>
-      </w:r>
-    </w:p>
-    <w:p>
-      <w:pPr>
-        <w:pStyle w:val="Nadpis3"/>
-      </w:pPr>
-      <w:bookmarkStart w:id="44" w:name="_Toc226556234"/>
-      <w:r>
-        <w:t>Karty a panely</w:t>
-      </w:r>
-      <w:bookmarkEnd w:id="44"/>
-    </w:p>
-    <w:p>
-      <w:r>
-        <w:t xml:space="preserve">Komponenty MatCard a MatTabs jsou klíčové pro hlavní stránku, protože zajistí pořádnou strukturu. Slouží hlavně k přehlednému zobrazení jednotlivých </w:t>
-      </w:r>
-      <w:r>
-        <w:t>návyků</w:t>
-      </w:r>
-      <w:r>
-        <w:t xml:space="preserve"> a umožní požadované přepínání mezi návyky „dobrými“ a „špatnými“ ve formě 2 oddělených záložek.</w:t>
-      </w:r>
-    </w:p>
-    <w:p>
-      <w:pPr>
-        <w:pStyle w:val="Nadpis3"/>
-      </w:pPr>
-      <w:bookmarkStart w:id="45" w:name="_Toc226556235"/>
-      <w:r>
-        <w:t>Formulářové prvky a ikony</w:t>
-      </w:r>
-      <w:bookmarkEnd w:id="45"/>
-    </w:p>
-    <w:p>
-      <w:r>
-        <w:t xml:space="preserve">Pro </w:t>
-      </w:r>
-      <w:r>
-        <w:t>zadání</w:t>
-      </w:r>
-      <w:r>
-        <w:t xml:space="preserve"> názvů </w:t>
-      </w:r>
-      <w:r>
-        <w:t>návyků</w:t>
-      </w:r>
-      <w:r>
-        <w:t xml:space="preserve"> a výběr barev byly využity optimalizované ovládací prvky MatFormField. Součástí Angular </w:t>
-      </w:r>
-      <w:r>
-        <w:t>Material</w:t>
-      </w:r>
-      <w:r>
-        <w:t xml:space="preserve"> je také systém ikon pomocí MatIcon komponenty, které jsem využil </w:t>
-      </w:r>
-      <w:r>
-        <w:t xml:space="preserve">pro vizuální odlišení jednotlivých návyků od sebe. Toto řešení pomáhá uživateli se lépe orientovat v uživatelském rozhraní </w:t>
-      </w:r>
-      <w:r>
-        <w:t>Habit-Tracker</w:t>
-      </w:r>
-      <w:r>
-        <w:t>u.</w:t>
-      </w:r>
-    </w:p>
-    <w:p>
-      <w:pPr>
-        <w:pStyle w:val="Nadpis2"/>
-      </w:pPr>
-      <w:bookmarkStart w:id="46" w:name="_Toc226556236"/>
-      <w:r>
-        <w:lastRenderedPageBreak/>
-        <w:t>Sass CSS</w:t>
-      </w:r>
-      <w:r>
-        <w:t xml:space="preserve"> (</w:t>
-      </w:r>
-      <w:r>
-        <w:t>SCSS</w:t>
-      </w:r>
-      <w:r>
-        <w:t>)</w:t>
-      </w:r>
-      <w:bookmarkEnd w:id="46"/>
-    </w:p>
-    <w:p>
-      <w:r>
-        <w:t xml:space="preserve">Původně byla tato podkapitola teoretické části zaměřena na technologii LESS (Leaner Style Sheets). V průběhu implementace knihovny Angular Material do projektu </w:t>
-      </w:r>
-      <w:r>
-        <w:t>Habit-Tracker</w:t>
-      </w:r>
-      <w:r>
-        <w:t xml:space="preserve"> </w:t>
-      </w:r>
-      <w:r>
-        <w:t>jsem se však rozhodl</w:t>
-      </w:r>
-      <w:r>
-        <w:t xml:space="preserve"> o přechodu na technologii SCSS. Vzhledem k tomu, že je Angular Material interně postaven právě na preprocesoru Sass, byla tato volba logickým krokem k zajištění plné technické kompatibility, maximální konzistence stylů a snazší přizpůsobitelnost grafických komponent napříč celým </w:t>
-      </w:r>
-      <w:r>
-        <w:t>Habit Trackem</w:t>
-      </w:r>
-      <w:r>
-        <w:t xml:space="preserve">. Bylo tak zajištěno, že v projektu je využíván pouze jeden jednotný stylovací systém. </w:t>
-      </w:r>
-      <w:r>
-        <w:t>Na rozdíl od standartního CSS nabízí SCSS pokročile programové funkce</w:t>
-      </w:r>
-      <w:r>
-        <w:t>, které</w:t>
-      </w:r>
-      <w:r>
-        <w:t xml:space="preserve"> zvyšují přehlednost</w:t>
-      </w:r>
-      <w:r>
-        <w:t xml:space="preserve"> grafického návrhu. Tento postup umožní efektivní předcházení redundanc</w:t>
-      </w:r>
-      <w:r>
-        <w:t xml:space="preserve">i (opakování) kódu, což je klíčové pro případné budoucí rozšiřitelnost </w:t>
-      </w:r>
-      <w:r>
-        <w:t>Habit-Tracker</w:t>
-      </w:r>
-      <w:r>
-        <w:t>u.</w:t>
-      </w:r>
-    </w:p>
-    <w:p>
-      <w:pPr>
-        <w:pStyle w:val="Nadpis3"/>
-      </w:pPr>
-      <w:bookmarkStart w:id="47" w:name="_Toc226556237"/>
-      <w:r>
-        <w:t>Variables</w:t>
-      </w:r>
-      <w:bookmarkEnd w:id="47"/>
-    </w:p>
-    <w:p>
-      <w:r>
-        <w:t>Tato funkce SCSS je využita pro definici centrální barevné palety a typografie uživatelského rozhraní. V souboru s globálními styly jsou definovány barvy pro pozitivní návyky (např.: zelená), negativní návyky (např.: červená) a hlavní barvy v celém uživatelském rozhraní. Díky této možnosti můžeme provést kompletní změnu barevného schématu pro celou aplikaci úpravou pouze jednoho jediného řádku v kódu.</w:t>
-      </w:r>
-    </w:p>
-    <w:p>
-      <w:pPr>
-        <w:pStyle w:val="Nadpis3"/>
-      </w:pPr>
-      <w:bookmarkStart w:id="48" w:name="_Toc226556238"/>
-      <w:r>
-        <w:t>Nesting</w:t>
-      </w:r>
-      <w:bookmarkEnd w:id="48"/>
-    </w:p>
-    <w:p>
-      <w:r>
-        <w:t>Vnořování neboli Nesting je technika využita pro zachování hierarchické struktury stylů, která velmi věrně může kopírovat HTML strukturu každé z komponent v uživatelském prostředí. Tato technika slouží hlavně pro mnohonásobně lepší čitelnost kódu a snazší orientaci při ladění vzhledu konkrétních prvků, jako na příklad tlačítka v kartách jednotlivých návyků.</w:t>
-      </w:r>
-    </w:p>
-    <w:p>
-      <w:pPr>
-        <w:pStyle w:val="Nadpis3"/>
-      </w:pPr>
-      <w:bookmarkStart w:id="49" w:name="_Toc226556239"/>
-      <w:r>
-        <w:t>Mixiny</w:t>
-      </w:r>
-      <w:bookmarkEnd w:id="49"/>
-    </w:p>
-    <w:p>
-      <w:r>
-        <w:t xml:space="preserve">Když se někde v kódu objevují opakování stejných vizuálních efektů a píšeme aplikaci s SCSS, pomohou v zabránění tohoto problému Mixiny. Šablony, které jsou implementované na místa, kde se tyto vizuální efekty </w:t>
-      </w:r>
-      <w:r>
-        <w:t>objevují V</w:t>
-      </w:r>
-      <w:r>
-        <w:t> </w:t>
-      </w:r>
-      <w:r>
-        <w:t>Habit-Tracker</w:t>
-      </w:r>
-      <w:r>
-        <w:t>u tyto šablony aplikujeme po příkladě pro definici stínů karet s návyky (box-shadow) nebo dále třeba pro nastavení responzivních bodů (media queries). Tento způsob nám zajistí naprostou vizuální konzistenci napříč celým Habit Trackem bez žádné nutnosti vícenásobného kopírování stejných bloků kódu.</w:t>
-      </w:r>
-    </w:p>
-    <w:p>
-      <w:pPr>
-        <w:pStyle w:val="Nadpis2"/>
-      </w:pPr>
-      <w:bookmarkStart w:id="50" w:name="_Toc226556240"/>
       <w:r>
         <w:t>Netlify</w:t>
       </w:r>
-      <w:bookmarkEnd w:id="50"/>
-    </w:p>
-    <w:p>
-      <w:r>
-        <w:t>V</w:t>
-      </w:r>
-      <w:r>
-        <w:t> </w:t>
-      </w:r>
-      <w:r>
-        <w:t>minulosti</w:t>
-      </w:r>
-      <w:r>
-        <w:t>, když jsme ve škole začínali s vývojem webových aplikacích přes JS</w:t>
-      </w:r>
-      <w:r>
-        <w:t xml:space="preserve"> mě vždycky zajímalo, jak bych mohl dostat své aplikace na web. Protože tohle není moje první single-page aplikace, kterou jsem </w:t>
-      </w:r>
-      <w:r>
-        <w:t>u</w:t>
-      </w:r>
-      <w:r>
-        <w:t xml:space="preserve">dělal, </w:t>
-      </w:r>
-      <w:r>
-        <w:t>zjistil jsem</w:t>
-      </w:r>
-      <w:r>
-        <w:t>, že webová s</w:t>
-      </w:r>
-      <w:r>
-        <w:t>tránka a zároveň služba</w:t>
-      </w:r>
-      <w:r>
-        <w:t xml:space="preserve"> Netlify mi</w:t>
-      </w:r>
-      <w:r>
-        <w:t xml:space="preserve"> s tímto problémem</w:t>
-      </w:r>
-      <w:r>
-        <w:t xml:space="preserve"> zadarmo a velice jednoduše pomůže</w:t>
-      </w:r>
-      <w:r>
-        <w:t xml:space="preserve">. Existuje možnost přidání databáze v Netlify, ale jelikož moje projekty jako třeba </w:t>
-      </w:r>
-      <w:r>
-        <w:t xml:space="preserve">tento </w:t>
-      </w:r>
-      <w:r>
-        <w:t>Habit-Tracker databázi nevyužívají, t</w:t>
-      </w:r>
-      <w:r>
-        <w:t>uto možnost jsem ještě zatím ani sám ne</w:t>
-      </w:r>
-      <w:r>
-        <w:t>řeši</w:t>
-      </w:r>
-      <w:r>
-        <w:t>l</w:t>
-      </w:r>
-      <w:r>
-        <w:t>.</w:t>
+    </w:p>
+    <w:p>
+      <w:r>
+        <w:t>V minulosti mě vždycky zajímalo, jak dostat vytvořenou aplikaci na web, aby ji šlo reálně sdílet. Netlify je v tomhle ohledu jednoduchá a docela „student-</w:t>
+      </w:r>
+      <w:proofErr w:type="spellStart"/>
+      <w:r>
+        <w:t>friendly</w:t>
+      </w:r>
+      <w:proofErr w:type="spellEnd"/>
+      <w:r>
+        <w:t xml:space="preserve">“ platforma. Nabízí rychlé publikování bez toho, aby člověk musel řešit složitý </w:t>
+      </w:r>
+      <w:proofErr w:type="spellStart"/>
+      <w:r>
+        <w:t>backend</w:t>
+      </w:r>
+      <w:proofErr w:type="spellEnd"/>
+      <w:r>
+        <w:t xml:space="preserve"> nebo vlastní konfiguraci serveru.</w:t>
+      </w:r>
+    </w:p>
+    <w:p>
+      <w:r>
+        <w:t>Protože je Habit-Tracker single-page aplikace bez potřeby databáze, Netlify mi dává smysl. Aplikaci lze nasadit tak, že se build verze projektu publikují do produkce. Netlify sice umožňuje i použití databáze, ale v mém případě jsem ji zatím nepotřeboval – data si totiž aplikace ukládá lokálně v prohlížeči. Díky tomu je nasazení jednodušší a celý projekt je soustředěný spíš na samotnou funkcionalitu UI.</w:t>
       </w:r>
     </w:p>
     <w:p>
@@ -5708,7 +6060,7 @@
       <w:pPr>
         <w:pStyle w:val="Nadpis1"/>
       </w:pPr>
-      <w:bookmarkStart w:id="51" w:name="_Toc226556241"/>
+      <w:bookmarkStart w:id="32" w:name="_Toc226556241"/>
       <w:r>
         <w:lastRenderedPageBreak/>
         <w:t>Praktická</w:t>
@@ -5716,7 +6068,7 @@
       <w:r>
         <w:t xml:space="preserve"> část</w:t>
       </w:r>
-      <w:bookmarkEnd w:id="51"/>
+      <w:bookmarkEnd w:id="32"/>
     </w:p>
     <w:p>
       <w:r>
@@ -5734,7 +6086,7 @@
       <w:r>
         <w:t xml:space="preserve"> Kapitoly této sekce budou věnovány jednotlivým částem vývoje</w:t>
       </w:r>
-      <w:bookmarkStart w:id="52" w:name="_Toc226556244"/>
+      <w:bookmarkStart w:id="33" w:name="_Toc226556244"/>
     </w:p>
     <w:p>
       <w:pPr>
@@ -5743,78 +6095,294 @@
       <w:r>
         <w:t>Modelovaní dat a služby</w:t>
       </w:r>
-      <w:bookmarkEnd w:id="52"/>
-    </w:p>
-    <w:p/>
+      <w:bookmarkEnd w:id="33"/>
+    </w:p>
+    <w:p>
+      <w:r>
+        <w:t>V aplikaci jsem vytvořil datový model pomocí typu/modelu Habit (anglicky řečeno návyk). Tento typ má v sobě následující vlastnosti potřebné pro co nejlepší zpracování návyku v aplikaci:</w:t>
+      </w:r>
+    </w:p>
+    <w:p>
+      <w:pPr>
+        <w:pStyle w:val="Odrkovseznam"/>
+        <w:rPr>
+          <w:i/>
+          <w:iCs/>
+        </w:rPr>
+      </w:pPr>
+      <w:r>
+        <w:rPr>
+          <w:i/>
+          <w:iCs/>
+          <w:u w:val="single"/>
+        </w:rPr>
+        <w:t>I</w:t>
+      </w:r>
+      <w:r>
+        <w:rPr>
+          <w:i/>
+          <w:iCs/>
+          <w:u w:val="single"/>
+        </w:rPr>
+        <w:t>d</w:t>
+      </w:r>
+      <w:r>
+        <w:t xml:space="preserve">. </w:t>
+      </w:r>
+      <w:r>
+        <w:t>Pro vytvoření unikátního identifikátoru každého z</w:t>
+      </w:r>
+      <w:r>
+        <w:t> </w:t>
+      </w:r>
+      <w:r>
+        <w:t>návyků</w:t>
+      </w:r>
+      <w:r>
+        <w:t>. Hlavně využito v logice aplikace pro manipulaci s daným návykem, protože by se teoreticky mohli vyskytnou 2 úplně stejné návyky v ohledu na vlastnosti a vznikl by konflikt, ale s Id se tato situace nemůže stát, protože každé Id je jedinečné v celé aplikaci</w:t>
+      </w:r>
+    </w:p>
+    <w:p>
+      <w:pPr>
+        <w:pStyle w:val="Odrkovseznam"/>
+        <w:rPr>
+          <w:i/>
+          <w:iCs/>
+        </w:rPr>
+      </w:pPr>
+      <w:r>
+        <w:rPr>
+          <w:i/>
+          <w:iCs/>
+          <w:u w:val="single"/>
+        </w:rPr>
+        <w:t>Name</w:t>
+      </w:r>
+      <w:r>
+        <w:t>.</w:t>
+      </w:r>
+      <w:r>
+        <w:t xml:space="preserve"> </w:t>
+      </w:r>
+      <w:r>
+        <w:t>Pro vlastní pojmenování návyku, protože každý uživatel myslí jinak, a ne každý by se mohl shodnout na stejném názvu. Každý uživatel může pojmenovat své návyky, jak se mu to hodí.</w:t>
+      </w:r>
+    </w:p>
+    <w:p>
+      <w:pPr>
+        <w:pStyle w:val="Odrkovseznam"/>
+        <w:rPr>
+          <w:i/>
+          <w:iCs/>
+        </w:rPr>
+      </w:pPr>
+      <w:r>
+        <w:rPr>
+          <w:i/>
+          <w:iCs/>
+          <w:u w:val="single"/>
+        </w:rPr>
+        <w:t>Description</w:t>
+      </w:r>
+      <w:r>
+        <w:t>. V</w:t>
+      </w:r>
+      <w:r>
+        <w:t>šechno potřebuje popisek, a proto jsem se rozhodl dát uživatelům možnost si pojmenované návyky i popsat. Tuto možnost více použijí spíše ti lidé, kteří vědí, že si například o týden později nebudou pamatovat, co přesně jaký návyk znamená.</w:t>
+      </w:r>
+    </w:p>
+    <w:p>
+      <w:pPr>
+        <w:pStyle w:val="Odrkovseznam"/>
+        <w:rPr>
+          <w:i/>
+          <w:iCs/>
+        </w:rPr>
+      </w:pPr>
+      <w:r>
+        <w:rPr>
+          <w:i/>
+          <w:iCs/>
+          <w:u w:val="single"/>
+        </w:rPr>
+        <w:t>T</w:t>
+      </w:r>
+      <w:r>
+        <w:rPr>
+          <w:i/>
+          <w:iCs/>
+          <w:u w:val="single"/>
+        </w:rPr>
+        <w:t>ype</w:t>
+      </w:r>
+      <w:r>
+        <w:t>. T</w:t>
+      </w:r>
+      <w:r>
+        <w:t>ato vlastnost má právě jen 2 možnosti, jakou hodnotu v sobě uchová. Tyto hodnoty jsou positive a negative. Slouží jen a pouze pro zařazení daného návyku mezi dobré návyky nebo zlozvyky.</w:t>
+      </w:r>
+    </w:p>
+    <w:p>
+      <w:pPr>
+        <w:pStyle w:val="Odrkovseznam"/>
+      </w:pPr>
+      <w:r>
+        <w:rPr>
+          <w:i/>
+          <w:iCs/>
+          <w:u w:val="single"/>
+        </w:rPr>
+        <w:t>H</w:t>
+      </w:r>
+      <w:r>
+        <w:rPr>
+          <w:i/>
+          <w:iCs/>
+          <w:u w:val="single"/>
+        </w:rPr>
+        <w:t>istory</w:t>
+      </w:r>
+      <w:r>
+        <w:t>. P</w:t>
+      </w:r>
+      <w:r>
+        <w:t>ole, které uchová každé datum</w:t>
+      </w:r>
+      <w:r>
+        <w:t>, kdy uživatel splnil daný návyk či nevykonal zlozvyk</w:t>
+      </w:r>
+      <w:r>
+        <w:t>y. Vytvořil jsem tuto vlastnost hlavně pro záznam plnění návyku a abych se přiznal, nebylo jednoduché to implementovat, ale o tom více až v podkapitole Vizualizace plnění návyků.</w:t>
+      </w:r>
+    </w:p>
+    <w:p>
+      <w:pPr>
+        <w:pStyle w:val="Odrkovseznam"/>
+      </w:pPr>
+      <w:r>
+        <w:rPr>
+          <w:i/>
+          <w:iCs/>
+          <w:u w:val="single"/>
+        </w:rPr>
+        <w:t>Streak</w:t>
+      </w:r>
+      <w:r>
+        <w:t xml:space="preserve">. </w:t>
+      </w:r>
+      <w:r>
+        <w:t>Toto číslo pro každý návyk ukazuje, kolik dní právě v řádě ten daný návyk vyplnil či vydržel nedělat zlozvyk. Přiznávám, že jsem mohl tuto vlastnost vynechat a jenom ukazovat vypočítanou hodnotu v UI, ale toto řešení je za mě optimálnější, protože se k této hodnotě lépe dostává v programu.</w:t>
+      </w:r>
+    </w:p>
+    <w:p>
+      <w:r>
+        <w:t xml:space="preserve">K práci a manipulaci s daty jsem použil servis </w:t>
+      </w:r>
+      <w:proofErr w:type="spellStart"/>
+      <w:r>
+        <w:t>DataService</w:t>
+      </w:r>
+      <w:proofErr w:type="spellEnd"/>
+      <w:r>
+        <w:t>, který obstarává:</w:t>
+      </w:r>
+    </w:p>
+    <w:p>
+      <w:pPr>
+        <w:pStyle w:val="Odrkovseznam"/>
+      </w:pPr>
+      <w:r>
+        <w:t>Načítání dat z lokálního uložiště (</w:t>
+      </w:r>
+      <w:proofErr w:type="spellStart"/>
+      <w:r>
+        <w:t>localStorage</w:t>
+      </w:r>
+      <w:proofErr w:type="spellEnd"/>
+      <w:r>
+        <w:t xml:space="preserve">). Když si člověk načte aplikaci na webu, </w:t>
+      </w:r>
+    </w:p>
     <w:p>
       <w:pPr>
         <w:pStyle w:val="Nadpis2"/>
       </w:pPr>
-      <w:bookmarkStart w:id="53" w:name="_Toc226556245"/>
+      <w:bookmarkStart w:id="34" w:name="_Toc226556245"/>
       <w:r>
         <w:t>Hlavní UI a navigace</w:t>
       </w:r>
-      <w:bookmarkEnd w:id="53"/>
+      <w:bookmarkEnd w:id="34"/>
+    </w:p>
+    <w:p>
+      <w:r>
+        <w:t xml:space="preserve">Jelikož je </w:t>
+      </w:r>
+      <w:proofErr w:type="spellStart"/>
+      <w:r>
+        <w:t>tot</w:t>
+      </w:r>
+      <w:proofErr w:type="spellEnd"/>
     </w:p>
     <w:p>
       <w:pPr>
         <w:pStyle w:val="Nadpis2"/>
       </w:pPr>
-      <w:bookmarkStart w:id="54" w:name="_Toc226556246"/>
-      <w:r>
+      <w:bookmarkStart w:id="35" w:name="_Toc226556246"/>
+      <w:r>
+        <w:lastRenderedPageBreak/>
         <w:t>Formulář pro vytváření nových návyků</w:t>
       </w:r>
-      <w:bookmarkEnd w:id="54"/>
+      <w:bookmarkEnd w:id="35"/>
     </w:p>
     <w:p>
       <w:pPr>
         <w:pStyle w:val="Nadpis2"/>
       </w:pPr>
-      <w:bookmarkStart w:id="55" w:name="_Toc226556247"/>
+      <w:bookmarkStart w:id="36" w:name="_Toc226556247"/>
       <w:r>
         <w:t>Seznamy návyků</w:t>
       </w:r>
-      <w:bookmarkEnd w:id="55"/>
+      <w:bookmarkEnd w:id="36"/>
     </w:p>
     <w:p>
       <w:pPr>
         <w:pStyle w:val="Nadpis2"/>
       </w:pPr>
-      <w:bookmarkStart w:id="56" w:name="_Toc226556248"/>
+      <w:bookmarkStart w:id="37" w:name="_Toc226556248"/>
       <w:r>
         <w:t>Vizualizace plnění návyku</w:t>
       </w:r>
-      <w:bookmarkEnd w:id="56"/>
+      <w:bookmarkEnd w:id="37"/>
     </w:p>
     <w:p>
       <w:pPr>
         <w:pStyle w:val="Nadpis2"/>
       </w:pPr>
-      <w:bookmarkStart w:id="57" w:name="_Toc226556249"/>
+      <w:bookmarkStart w:id="38" w:name="_Toc226556249"/>
       <w:r>
         <w:t>Styling a responzivita aplikace</w:t>
       </w:r>
-      <w:bookmarkEnd w:id="57"/>
+      <w:bookmarkEnd w:id="38"/>
     </w:p>
     <w:p>
       <w:pPr>
         <w:pStyle w:val="Nadpis2"/>
       </w:pPr>
-      <w:bookmarkStart w:id="58" w:name="_Toc226556250"/>
+      <w:bookmarkStart w:id="39" w:name="_Toc226556250"/>
       <w:r>
         <w:t>Optimalizace</w:t>
       </w:r>
-      <w:bookmarkEnd w:id="58"/>
+      <w:bookmarkEnd w:id="39"/>
     </w:p>
     <w:p>
       <w:pPr>
         <w:pStyle w:val="Nadpis2"/>
       </w:pPr>
-      <w:bookmarkStart w:id="59" w:name="_Toc226556251"/>
+      <w:bookmarkStart w:id="40" w:name="_Toc226556251"/>
       <w:r>
         <w:t>Zkušenosti nabrané z této práce</w:t>
       </w:r>
-      <w:bookmarkEnd w:id="59"/>
+      <w:bookmarkEnd w:id="40"/>
     </w:p>
     <w:p>
       <w:pPr>
@@ -5834,12 +6402,12 @@
         </w:numPr>
         <w:ind w:left="720"/>
       </w:pPr>
-      <w:bookmarkStart w:id="60" w:name="_Toc226556252"/>
+      <w:bookmarkStart w:id="41" w:name="_Toc226556252"/>
       <w:r>
         <w:lastRenderedPageBreak/>
         <w:t>Závěr</w:t>
       </w:r>
-      <w:bookmarkEnd w:id="60"/>
+      <w:bookmarkEnd w:id="41"/>
       <w:r>
         <w:br w:type="page"/>
       </w:r>
@@ -5853,16 +6421,16 @@
         </w:numPr>
         <w:ind w:left="720"/>
       </w:pPr>
-      <w:bookmarkStart w:id="61" w:name="_Toc222315302"/>
-      <w:bookmarkStart w:id="62" w:name="_Toc223513779"/>
-      <w:bookmarkStart w:id="63" w:name="_Toc226556253"/>
+      <w:bookmarkStart w:id="42" w:name="_Toc222315302"/>
+      <w:bookmarkStart w:id="43" w:name="_Toc223513779"/>
+      <w:bookmarkStart w:id="44" w:name="_Toc226556253"/>
       <w:r>
         <w:lastRenderedPageBreak/>
         <w:t>Použitá literatura</w:t>
       </w:r>
-      <w:bookmarkEnd w:id="61"/>
-      <w:bookmarkEnd w:id="62"/>
-      <w:bookmarkEnd w:id="63"/>
+      <w:bookmarkEnd w:id="42"/>
+      <w:bookmarkEnd w:id="43"/>
+      <w:bookmarkEnd w:id="44"/>
     </w:p>
     <w:p>
       <w:pPr>
@@ -5906,16 +6474,16 @@
         </w:numPr>
         <w:ind w:left="720"/>
       </w:pPr>
-      <w:bookmarkStart w:id="64" w:name="_Toc222315303"/>
-      <w:bookmarkStart w:id="65" w:name="_Toc223513780"/>
-      <w:bookmarkStart w:id="66" w:name="_Toc226556254"/>
+      <w:bookmarkStart w:id="45" w:name="_Toc222315303"/>
+      <w:bookmarkStart w:id="46" w:name="_Toc223513780"/>
+      <w:bookmarkStart w:id="47" w:name="_Toc226556254"/>
       <w:r>
         <w:lastRenderedPageBreak/>
         <w:t>Seznam obrázků</w:t>
       </w:r>
-      <w:bookmarkEnd w:id="64"/>
-      <w:bookmarkEnd w:id="65"/>
-      <w:bookmarkEnd w:id="66"/>
+      <w:bookmarkEnd w:id="45"/>
+      <w:bookmarkEnd w:id="46"/>
+      <w:bookmarkEnd w:id="47"/>
     </w:p>
     <w:p>
       <w:pPr>
@@ -5935,16 +6503,16 @@
         </w:numPr>
         <w:ind w:left="720"/>
       </w:pPr>
-      <w:bookmarkStart w:id="67" w:name="_Toc222315304"/>
-      <w:bookmarkStart w:id="68" w:name="_Toc223513781"/>
-      <w:bookmarkStart w:id="69" w:name="_Toc226556255"/>
+      <w:bookmarkStart w:id="48" w:name="_Toc222315304"/>
+      <w:bookmarkStart w:id="49" w:name="_Toc223513781"/>
+      <w:bookmarkStart w:id="50" w:name="_Toc226556255"/>
       <w:r>
         <w:lastRenderedPageBreak/>
         <w:t>Seznam tabulek</w:t>
       </w:r>
-      <w:bookmarkEnd w:id="67"/>
-      <w:bookmarkEnd w:id="68"/>
-      <w:bookmarkEnd w:id="69"/>
+      <w:bookmarkEnd w:id="48"/>
+      <w:bookmarkEnd w:id="49"/>
+      <w:bookmarkEnd w:id="50"/>
     </w:p>
     <w:p>
       <w:pPr>
@@ -5964,16 +6532,16 @@
         </w:numPr>
         <w:ind w:left="720"/>
       </w:pPr>
-      <w:bookmarkStart w:id="70" w:name="_Toc222315305"/>
-      <w:bookmarkStart w:id="71" w:name="_Toc223513782"/>
-      <w:bookmarkStart w:id="72" w:name="_Toc226556256"/>
+      <w:bookmarkStart w:id="51" w:name="_Toc222315305"/>
+      <w:bookmarkStart w:id="52" w:name="_Toc223513782"/>
+      <w:bookmarkStart w:id="53" w:name="_Toc226556256"/>
       <w:r>
         <w:lastRenderedPageBreak/>
         <w:t>Seznam příloh</w:t>
       </w:r>
-      <w:bookmarkEnd w:id="70"/>
-      <w:bookmarkEnd w:id="71"/>
-      <w:bookmarkEnd w:id="72"/>
+      <w:bookmarkEnd w:id="51"/>
+      <w:bookmarkEnd w:id="52"/>
+      <w:bookmarkEnd w:id="53"/>
     </w:p>
     <w:p>
       <w:r>
@@ -6025,16 +6593,16 @@
         </w:numPr>
         <w:ind w:left="720"/>
       </w:pPr>
-      <w:bookmarkStart w:id="73" w:name="_Toc222315306"/>
-      <w:bookmarkStart w:id="74" w:name="_Toc223513783"/>
-      <w:bookmarkStart w:id="75" w:name="_Toc226556257"/>
+      <w:bookmarkStart w:id="54" w:name="_Toc222315306"/>
+      <w:bookmarkStart w:id="55" w:name="_Toc223513783"/>
+      <w:bookmarkStart w:id="56" w:name="_Toc226556257"/>
       <w:r>
         <w:lastRenderedPageBreak/>
         <w:t>Přílohy</w:t>
       </w:r>
-      <w:bookmarkEnd w:id="73"/>
-      <w:bookmarkEnd w:id="74"/>
-      <w:bookmarkEnd w:id="75"/>
+      <w:bookmarkEnd w:id="54"/>
+      <w:bookmarkEnd w:id="55"/>
+      <w:bookmarkEnd w:id="56"/>
     </w:p>
     <w:p>
       <w:r>
@@ -8289,6 +8857,118 @@
     </w:lvl>
   </w:abstractNum>
   <w:abstractNum w:abstractNumId="17" w15:restartNumberingAfterBreak="0">
+    <w:nsid w:val="6E6453FE"/>
+    <w:multiLevelType w:val="hybridMultilevel"/>
+    <w:tmpl w:val="D69A65B6"/>
+    <w:lvl w:ilvl="0" w:tplc="ED2E811E">
+      <w:numFmt w:val="bullet"/>
+      <w:lvlText w:val="-"/>
+      <w:lvlJc w:val="left"/>
+      <w:pPr>
+        <w:ind w:left="720" w:hanging="360"/>
+      </w:pPr>
+      <w:rPr>
+        <w:rFonts w:ascii="Calibri" w:eastAsiaTheme="minorHAnsi" w:hAnsi="Calibri" w:cs="Calibri" w:hint="default"/>
+      </w:rPr>
+    </w:lvl>
+    <w:lvl w:ilvl="1" w:tplc="04050003" w:tentative="1">
+      <w:start w:val="1"/>
+      <w:numFmt w:val="bullet"/>
+      <w:lvlText w:val="o"/>
+      <w:lvlJc w:val="left"/>
+      <w:pPr>
+        <w:ind w:left="1440" w:hanging="360"/>
+      </w:pPr>
+      <w:rPr>
+        <w:rFonts w:ascii="Courier New" w:hAnsi="Courier New" w:cs="Courier New" w:hint="default"/>
+      </w:rPr>
+    </w:lvl>
+    <w:lvl w:ilvl="2" w:tplc="04050005" w:tentative="1">
+      <w:start w:val="1"/>
+      <w:numFmt w:val="bullet"/>
+      <w:lvlText w:val=""/>
+      <w:lvlJc w:val="left"/>
+      <w:pPr>
+        <w:ind w:left="2160" w:hanging="360"/>
+      </w:pPr>
+      <w:rPr>
+        <w:rFonts w:ascii="Wingdings" w:hAnsi="Wingdings" w:hint="default"/>
+      </w:rPr>
+    </w:lvl>
+    <w:lvl w:ilvl="3" w:tplc="04050001" w:tentative="1">
+      <w:start w:val="1"/>
+      <w:numFmt w:val="bullet"/>
+      <w:lvlText w:val=""/>
+      <w:lvlJc w:val="left"/>
+      <w:pPr>
+        <w:ind w:left="2880" w:hanging="360"/>
+      </w:pPr>
+      <w:rPr>
+        <w:rFonts w:ascii="Symbol" w:hAnsi="Symbol" w:hint="default"/>
+      </w:rPr>
+    </w:lvl>
+    <w:lvl w:ilvl="4" w:tplc="04050003" w:tentative="1">
+      <w:start w:val="1"/>
+      <w:numFmt w:val="bullet"/>
+      <w:lvlText w:val="o"/>
+      <w:lvlJc w:val="left"/>
+      <w:pPr>
+        <w:ind w:left="3600" w:hanging="360"/>
+      </w:pPr>
+      <w:rPr>
+        <w:rFonts w:ascii="Courier New" w:hAnsi="Courier New" w:cs="Courier New" w:hint="default"/>
+      </w:rPr>
+    </w:lvl>
+    <w:lvl w:ilvl="5" w:tplc="04050005" w:tentative="1">
+      <w:start w:val="1"/>
+      <w:numFmt w:val="bullet"/>
+      <w:lvlText w:val=""/>
+      <w:lvlJc w:val="left"/>
+      <w:pPr>
+        <w:ind w:left="4320" w:hanging="360"/>
+      </w:pPr>
+      <w:rPr>
+        <w:rFonts w:ascii="Wingdings" w:hAnsi="Wingdings" w:hint="default"/>
+      </w:rPr>
+    </w:lvl>
+    <w:lvl w:ilvl="6" w:tplc="04050001" w:tentative="1">
+      <w:start w:val="1"/>
+      <w:numFmt w:val="bullet"/>
+      <w:lvlText w:val=""/>
+      <w:lvlJc w:val="left"/>
+      <w:pPr>
+        <w:ind w:left="5040" w:hanging="360"/>
+      </w:pPr>
+      <w:rPr>
+        <w:rFonts w:ascii="Symbol" w:hAnsi="Symbol" w:hint="default"/>
+      </w:rPr>
+    </w:lvl>
+    <w:lvl w:ilvl="7" w:tplc="04050003" w:tentative="1">
+      <w:start w:val="1"/>
+      <w:numFmt w:val="bullet"/>
+      <w:lvlText w:val="o"/>
+      <w:lvlJc w:val="left"/>
+      <w:pPr>
+        <w:ind w:left="5760" w:hanging="360"/>
+      </w:pPr>
+      <w:rPr>
+        <w:rFonts w:ascii="Courier New" w:hAnsi="Courier New" w:cs="Courier New" w:hint="default"/>
+      </w:rPr>
+    </w:lvl>
+    <w:lvl w:ilvl="8" w:tplc="04050005" w:tentative="1">
+      <w:start w:val="1"/>
+      <w:numFmt w:val="bullet"/>
+      <w:lvlText w:val=""/>
+      <w:lvlJc w:val="left"/>
+      <w:pPr>
+        <w:ind w:left="6480" w:hanging="360"/>
+      </w:pPr>
+      <w:rPr>
+        <w:rFonts w:ascii="Wingdings" w:hAnsi="Wingdings" w:hint="default"/>
+      </w:rPr>
+    </w:lvl>
+  </w:abstractNum>
+  <w:abstractNum w:abstractNumId="18" w15:restartNumberingAfterBreak="0">
     <w:nsid w:val="74442F24"/>
     <w:multiLevelType w:val="hybridMultilevel"/>
     <w:tmpl w:val="F5568B8C"/>
@@ -8377,7 +9057,7 @@
       </w:pPr>
     </w:lvl>
   </w:abstractNum>
-  <w:abstractNum w:abstractNumId="18" w15:restartNumberingAfterBreak="0">
+  <w:abstractNum w:abstractNumId="19" w15:restartNumberingAfterBreak="0">
     <w:nsid w:val="77124172"/>
     <w:multiLevelType w:val="multilevel"/>
     <w:tmpl w:val="1C5092FA"/>
@@ -8463,7 +9143,7 @@
       </w:pPr>
     </w:lvl>
   </w:abstractNum>
-  <w:abstractNum w:abstractNumId="19" w15:restartNumberingAfterBreak="0">
+  <w:abstractNum w:abstractNumId="20" w15:restartNumberingAfterBreak="0">
     <w:nsid w:val="77345C61"/>
     <w:multiLevelType w:val="hybridMultilevel"/>
     <w:tmpl w:val="884C3460"/>
@@ -8549,7 +9229,7 @@
       </w:pPr>
     </w:lvl>
   </w:abstractNum>
-  <w:abstractNum w:abstractNumId="20" w15:restartNumberingAfterBreak="0">
+  <w:abstractNum w:abstractNumId="21" w15:restartNumberingAfterBreak="0">
     <w:nsid w:val="7B512498"/>
     <w:multiLevelType w:val="multilevel"/>
     <w:tmpl w:val="0405001F"/>
@@ -8636,7 +9316,7 @@
     </w:lvl>
   </w:abstractNum>
   <w:num w:numId="1" w16cid:durableId="1812019323">
-    <w:abstractNumId w:val="20"/>
+    <w:abstractNumId w:val="21"/>
   </w:num>
   <w:num w:numId="2" w16cid:durableId="1927224108">
     <w:abstractNumId w:val="8"/>
@@ -8645,7 +9325,7 @@
     <w:abstractNumId w:val="5"/>
   </w:num>
   <w:num w:numId="4" w16cid:durableId="2079278213">
-    <w:abstractNumId w:val="19"/>
+    <w:abstractNumId w:val="20"/>
   </w:num>
   <w:num w:numId="5" w16cid:durableId="1254975546">
     <w:abstractNumId w:val="10"/>
@@ -8681,10 +9361,10 @@
     <w:abstractNumId w:val="14"/>
   </w:num>
   <w:num w:numId="16" w16cid:durableId="1182432290">
-    <w:abstractNumId w:val="17"/>
+    <w:abstractNumId w:val="18"/>
   </w:num>
   <w:num w:numId="17" w16cid:durableId="1880698919">
-    <w:abstractNumId w:val="18"/>
+    <w:abstractNumId w:val="19"/>
   </w:num>
   <w:num w:numId="18" w16cid:durableId="470682566">
     <w:abstractNumId w:val="13"/>
@@ -8697,6 +9377,9 @@
   </w:num>
   <w:num w:numId="21" w16cid:durableId="999692615">
     <w:abstractNumId w:val="6"/>
+  </w:num>
+  <w:num w:numId="22" w16cid:durableId="1366448777">
+    <w:abstractNumId w:val="17"/>
   </w:num>
 </w:numbering>
 </file>
@@ -10222,26 +10905,10 @@
 </file>
 
 <file path=customXml/item1.xml><?xml version="1.0" encoding="utf-8"?>
-<?mso-contentType ?>
-<FormTemplates xmlns="http://schemas.microsoft.com/sharepoint/v3/contenttype/forms">
-  <Display>DocumentLibraryForm</Display>
-  <Edit>DocumentLibraryForm</Edit>
-  <New>DocumentLibraryForm</New>
-</FormTemplates>
+<b:Sources xmlns:b="http://schemas.openxmlformats.org/officeDocument/2006/bibliography" xmlns="http://schemas.openxmlformats.org/officeDocument/2006/bibliography" SelectedStyle="\APASixthEditionOfficeOnline.xsl" StyleName="APA" Version="6"/>
 </file>
 
 <file path=customXml/item2.xml><?xml version="1.0" encoding="utf-8"?>
-<p:properties xmlns:p="http://schemas.microsoft.com/office/2006/metadata/properties" xmlns:xsi="http://www.w3.org/2001/XMLSchema-instance" xmlns:pc="http://schemas.microsoft.com/office/infopath/2007/PartnerControls">
-  <documentManagement>
-    <TaxCatchAll xmlns="9069f8e3-06b5-4841-af59-bd496f6fbcdc" xsi:nil="true"/>
-    <lcf76f155ced4ddcb4097134ff3c332f xmlns="ac4d9f64-92e6-40df-bbe5-cbf691cfe8ae">
-      <Terms xmlns="http://schemas.microsoft.com/office/infopath/2007/PartnerControls"/>
-    </lcf76f155ced4ddcb4097134ff3c332f>
-  </documentManagement>
-</p:properties>
-</file>
-
-<file path=customXml/item3.xml><?xml version="1.0" encoding="utf-8"?>
 <ct:contentTypeSchema xmlns:ct="http://schemas.microsoft.com/office/2006/metadata/contentType" xmlns:ma="http://schemas.microsoft.com/office/2006/metadata/properties/metaAttributes" ct:_="" ma:_="" ma:contentTypeName="Dokument" ma:contentTypeID="0x0101007AC253A931DA3842A9467F19871E2C1B" ma:contentTypeVersion="10" ma:contentTypeDescription="Vytvoří nový dokument" ma:contentTypeScope="" ma:versionID="9dbcdc17d608927f05e31a50324249a7">
   <xsd:schema xmlns:xsd="http://www.w3.org/2001/XMLSchema" xmlns:xs="http://www.w3.org/2001/XMLSchema" xmlns:p="http://schemas.microsoft.com/office/2006/metadata/properties" xmlns:ns2="ac4d9f64-92e6-40df-bbe5-cbf691cfe8ae" xmlns:ns3="9069f8e3-06b5-4841-af59-bd496f6fbcdc" targetNamespace="http://schemas.microsoft.com/office/2006/metadata/properties" ma:root="true" ma:fieldsID="fb3d1d1e590abe5f5a4ef74e9b43408f" ns2:_="" ns3:_="">
     <xsd:import namespace="ac4d9f64-92e6-40df-bbe5-cbf691cfe8ae"/>
@@ -10430,30 +11097,35 @@
 </ct:contentTypeSchema>
 </file>
 
+<file path=customXml/item3.xml><?xml version="1.0" encoding="utf-8"?>
+<p:properties xmlns:p="http://schemas.microsoft.com/office/2006/metadata/properties" xmlns:xsi="http://www.w3.org/2001/XMLSchema-instance" xmlns:pc="http://schemas.microsoft.com/office/infopath/2007/PartnerControls">
+  <documentManagement>
+    <TaxCatchAll xmlns="9069f8e3-06b5-4841-af59-bd496f6fbcdc" xsi:nil="true"/>
+    <lcf76f155ced4ddcb4097134ff3c332f xmlns="ac4d9f64-92e6-40df-bbe5-cbf691cfe8ae">
+      <Terms xmlns="http://schemas.microsoft.com/office/infopath/2007/PartnerControls"/>
+    </lcf76f155ced4ddcb4097134ff3c332f>
+  </documentManagement>
+</p:properties>
+</file>
+
 <file path=customXml/item4.xml><?xml version="1.0" encoding="utf-8"?>
-<b:Sources xmlns:b="http://schemas.openxmlformats.org/officeDocument/2006/bibliography" xmlns="http://schemas.openxmlformats.org/officeDocument/2006/bibliography" SelectedStyle="\APASixthEditionOfficeOnline.xsl" StyleName="APA" Version="6"/>
+<?mso-contentType ?>
+<FormTemplates xmlns="http://schemas.microsoft.com/sharepoint/v3/contenttype/forms">
+  <Display>DocumentLibraryForm</Display>
+  <Edit>DocumentLibraryForm</Edit>
+  <New>DocumentLibraryForm</New>
+</FormTemplates>
 </file>
 
 <file path=customXml/itemProps1.xml><?xml version="1.0" encoding="utf-8"?>
-<ds:datastoreItem xmlns:ds="http://schemas.openxmlformats.org/officeDocument/2006/customXml" ds:itemID="{E8FDF9F9-0BC5-4BD9-96CC-E3BC62E19A62}">
+<ds:datastoreItem xmlns:ds="http://schemas.openxmlformats.org/officeDocument/2006/customXml" ds:itemID="{E0BB6427-4419-4C21-A0DF-4471F23995B6}">
   <ds:schemaRefs>
-    <ds:schemaRef ds:uri="http://schemas.microsoft.com/sharepoint/v3/contenttype/forms"/>
+    <ds:schemaRef ds:uri="http://schemas.openxmlformats.org/officeDocument/2006/bibliography"/>
   </ds:schemaRefs>
 </ds:datastoreItem>
 </file>
 
 <file path=customXml/itemProps2.xml><?xml version="1.0" encoding="utf-8"?>
-<ds:datastoreItem xmlns:ds="http://schemas.openxmlformats.org/officeDocument/2006/customXml" ds:itemID="{FB1D83C0-C8CC-4C35-B0E6-D4B15A08C6B5}">
-  <ds:schemaRefs>
-    <ds:schemaRef ds:uri="http://schemas.microsoft.com/office/2006/metadata/properties"/>
-    <ds:schemaRef ds:uri="http://schemas.microsoft.com/office/infopath/2007/PartnerControls"/>
-    <ds:schemaRef ds:uri="9069f8e3-06b5-4841-af59-bd496f6fbcdc"/>
-    <ds:schemaRef ds:uri="ac4d9f64-92e6-40df-bbe5-cbf691cfe8ae"/>
-  </ds:schemaRefs>
-</ds:datastoreItem>
-</file>
-
-<file path=customXml/itemProps3.xml><?xml version="1.0" encoding="utf-8"?>
 <ds:datastoreItem xmlns:ds="http://schemas.openxmlformats.org/officeDocument/2006/customXml" ds:itemID="{D5874249-D0BB-47A2-ADCE-DE87B2259BE8}">
   <ds:schemaRefs>
     <ds:schemaRef ds:uri="http://schemas.microsoft.com/office/2006/metadata/contentType"/>
@@ -10472,10 +11144,21 @@
 </ds:datastoreItem>
 </file>
 
+<file path=customXml/itemProps3.xml><?xml version="1.0" encoding="utf-8"?>
+<ds:datastoreItem xmlns:ds="http://schemas.openxmlformats.org/officeDocument/2006/customXml" ds:itemID="{FB1D83C0-C8CC-4C35-B0E6-D4B15A08C6B5}">
+  <ds:schemaRefs>
+    <ds:schemaRef ds:uri="http://schemas.microsoft.com/office/2006/metadata/properties"/>
+    <ds:schemaRef ds:uri="http://schemas.microsoft.com/office/infopath/2007/PartnerControls"/>
+    <ds:schemaRef ds:uri="9069f8e3-06b5-4841-af59-bd496f6fbcdc"/>
+    <ds:schemaRef ds:uri="ac4d9f64-92e6-40df-bbe5-cbf691cfe8ae"/>
+  </ds:schemaRefs>
+</ds:datastoreItem>
+</file>
+
 <file path=customXml/itemProps4.xml><?xml version="1.0" encoding="utf-8"?>
-<ds:datastoreItem xmlns:ds="http://schemas.openxmlformats.org/officeDocument/2006/customXml" ds:itemID="{E0BB6427-4419-4C21-A0DF-4471F23995B6}">
+<ds:datastoreItem xmlns:ds="http://schemas.openxmlformats.org/officeDocument/2006/customXml" ds:itemID="{E8FDF9F9-0BC5-4BD9-96CC-E3BC62E19A62}">
   <ds:schemaRefs>
-    <ds:schemaRef ds:uri="http://schemas.openxmlformats.org/officeDocument/2006/bibliography"/>
+    <ds:schemaRef ds:uri="http://schemas.microsoft.com/sharepoint/v3/contenttype/forms"/>
   </ds:schemaRefs>
 </ds:datastoreItem>
 </file>
</xml_diff>